<commit_message>
17.04.26 list changes: aqa подготовка (Python)
</commit_message>
<xml_diff>
--- a/AQA/Roadmap/aqa подготовка.docx
+++ b/AQA/Roadmap/aqa подготовка.docx
@@ -903,29 +903,7 @@
             <w:sz w:val="20"/>
             <w:szCs w:val="20"/>
           </w:rPr>
-          <w:t>Общие компонент</w:t>
-        </w:r>
-        <w:r>
-          <w:rPr>
-            <w:rStyle w:val="a3"/>
-            <w:rFonts w:ascii="Times New Roman" w:hAnsi="Times New Roman" w:cs="Times New Roman"/>
-            <w:color w:val="595959" w:themeColor="text1" w:themeTint="A6"/>
-            <w:spacing w:val="-1"/>
-            <w:sz w:val="20"/>
-            <w:szCs w:val="20"/>
-          </w:rPr>
-          <w:t>ы</w:t>
-        </w:r>
-        <w:r>
-          <w:rPr>
-            <w:rStyle w:val="a3"/>
-            <w:rFonts w:ascii="Times New Roman" w:hAnsi="Times New Roman" w:cs="Times New Roman"/>
-            <w:color w:val="595959" w:themeColor="text1" w:themeTint="A6"/>
-            <w:spacing w:val="-1"/>
-            <w:sz w:val="20"/>
-            <w:szCs w:val="20"/>
-          </w:rPr>
-          <w:t xml:space="preserve"> ПК и их взаимодействие</w:t>
+          <w:t>Общие компоненты ПК и их взаимодействие</w:t>
         </w:r>
       </w:hyperlink>
     </w:p>
@@ -989,40 +967,7 @@
             <w:sz w:val="20"/>
             <w:szCs w:val="20"/>
           </w:rPr>
-          <w:t>Работа про</w:t>
-        </w:r>
-        <w:r>
-          <w:rPr>
-            <w:rStyle w:val="a3"/>
-            <w:rFonts w:ascii="Times New Roman" w:hAnsi="Times New Roman" w:cs="Times New Roman"/>
-            <w:color w:val="595959" w:themeColor="text1" w:themeTint="A6"/>
-            <w:spacing w:val="-1"/>
-            <w:sz w:val="20"/>
-            <w:szCs w:val="20"/>
-          </w:rPr>
-          <w:t>ц</w:t>
-        </w:r>
-        <w:r>
-          <w:rPr>
-            <w:rStyle w:val="a3"/>
-            <w:rFonts w:ascii="Times New Roman" w:hAnsi="Times New Roman" w:cs="Times New Roman"/>
-            <w:color w:val="595959" w:themeColor="text1" w:themeTint="A6"/>
-            <w:spacing w:val="-1"/>
-            <w:sz w:val="20"/>
-            <w:szCs w:val="20"/>
-          </w:rPr>
-          <w:t>е</w:t>
-        </w:r>
-        <w:r>
-          <w:rPr>
-            <w:rStyle w:val="a3"/>
-            <w:rFonts w:ascii="Times New Roman" w:hAnsi="Times New Roman" w:cs="Times New Roman"/>
-            <w:color w:val="595959" w:themeColor="text1" w:themeTint="A6"/>
-            <w:spacing w:val="-1"/>
-            <w:sz w:val="20"/>
-            <w:szCs w:val="20"/>
-          </w:rPr>
-          <w:t>ссора</w:t>
+          <w:t>Работа процессора</w:t>
         </w:r>
       </w:hyperlink>
     </w:p>
@@ -1086,29 +1031,7 @@
             <w:sz w:val="20"/>
             <w:szCs w:val="20"/>
           </w:rPr>
-          <w:t>Па</w:t>
-        </w:r>
-        <w:r>
-          <w:rPr>
-            <w:rStyle w:val="a3"/>
-            <w:rFonts w:ascii="Times New Roman" w:hAnsi="Times New Roman" w:cs="Times New Roman"/>
-            <w:color w:val="595959" w:themeColor="text1" w:themeTint="A6"/>
-            <w:spacing w:val="-1"/>
-            <w:sz w:val="20"/>
-            <w:szCs w:val="20"/>
-          </w:rPr>
-          <w:t>м</w:t>
-        </w:r>
-        <w:r>
-          <w:rPr>
-            <w:rStyle w:val="a3"/>
-            <w:rFonts w:ascii="Times New Roman" w:hAnsi="Times New Roman" w:cs="Times New Roman"/>
-            <w:color w:val="595959" w:themeColor="text1" w:themeTint="A6"/>
-            <w:spacing w:val="-1"/>
-            <w:sz w:val="20"/>
-            <w:szCs w:val="20"/>
-          </w:rPr>
-          <w:t>ять</w:t>
+          <w:t>Память</w:t>
         </w:r>
       </w:hyperlink>
     </w:p>
@@ -1236,29 +1159,7 @@
             <w:sz w:val="20"/>
             <w:szCs w:val="20"/>
           </w:rPr>
-          <w:t>Типы верхнеуро</w:t>
-        </w:r>
-        <w:r>
-          <w:rPr>
-            <w:rStyle w:val="a3"/>
-            <w:rFonts w:ascii="Times New Roman" w:hAnsi="Times New Roman" w:cs="Times New Roman"/>
-            <w:color w:val="595959" w:themeColor="text1" w:themeTint="A6"/>
-            <w:spacing w:val="-1"/>
-            <w:sz w:val="20"/>
-            <w:szCs w:val="20"/>
-          </w:rPr>
-          <w:t>в</w:t>
-        </w:r>
-        <w:r>
-          <w:rPr>
-            <w:rStyle w:val="a3"/>
-            <w:rFonts w:ascii="Times New Roman" w:hAnsi="Times New Roman" w:cs="Times New Roman"/>
-            <w:color w:val="595959" w:themeColor="text1" w:themeTint="A6"/>
-            <w:spacing w:val="-1"/>
-            <w:sz w:val="20"/>
-            <w:szCs w:val="20"/>
-          </w:rPr>
-          <w:t>невых языков</w:t>
+          <w:t>Типы верхнеуровневых языков</w:t>
         </w:r>
       </w:hyperlink>
     </w:p>
@@ -1392,7 +1293,7 @@
             <w:sz w:val="20"/>
             <w:szCs w:val="20"/>
           </w:rPr>
-          <w:t>ы д</w:t>
+          <w:t>ы да</w:t>
         </w:r>
         <w:r>
           <w:rPr>
@@ -1402,7 +1303,7 @@
             <w:sz w:val="20"/>
             <w:szCs w:val="20"/>
           </w:rPr>
-          <w:t>а</w:t>
+          <w:t>н</w:t>
         </w:r>
         <w:r>
           <w:rPr>
@@ -1412,7 +1313,7 @@
             <w:sz w:val="20"/>
             <w:szCs w:val="20"/>
           </w:rPr>
-          <w:t>нных</w:t>
+          <w:t>ных</w:t>
         </w:r>
       </w:hyperlink>
     </w:p>
@@ -15319,7 +15220,55 @@
         <w:t xml:space="preserve"> Стек очищается сам, когда функция завершается. Куча требует ручного управления или помощи «уборщика».</w:t>
       </w:r>
     </w:p>
-    <w:p/>
+    <w:p>
+      <w:pPr>
+        <w:rPr>
+          <w:rFonts w:ascii="Times New Roman" w:hAnsi="Times New Roman" w:cs="Times New Roman"/>
+          <w:b/>
+          <w:bCs/>
+          <w:sz w:val="18"/>
+          <w:szCs w:val="18"/>
+          <w:lang w:val="en-US"/>
+        </w:rPr>
+      </w:pPr>
+    </w:p>
+    <w:p>
+      <w:pPr>
+        <w:rPr>
+          <w:rFonts w:ascii="Times New Roman" w:hAnsi="Times New Roman" w:cs="Times New Roman"/>
+          <w:sz w:val="18"/>
+          <w:szCs w:val="18"/>
+        </w:rPr>
+      </w:pPr>
+      <w:r>
+        <w:rPr>
+          <w:rFonts w:ascii="Times New Roman" w:hAnsi="Times New Roman" w:cs="Times New Roman"/>
+          <w:b/>
+          <w:bCs/>
+          <w:sz w:val="18"/>
+          <w:szCs w:val="18"/>
+        </w:rPr>
+        <w:t>Все целые числа (</w:t>
+      </w:r>
+      <w:r>
+        <w:rPr>
+          <w:rFonts w:ascii="Times New Roman" w:hAnsi="Times New Roman" w:cs="Times New Roman"/>
+          <w:sz w:val="18"/>
+          <w:szCs w:val="18"/>
+        </w:rPr>
+        <w:t>int</w:t>
+      </w:r>
+      <w:r>
+        <w:rPr>
+          <w:rFonts w:ascii="Times New Roman" w:hAnsi="Times New Roman" w:cs="Times New Roman"/>
+          <w:b/>
+          <w:bCs/>
+          <w:sz w:val="18"/>
+          <w:szCs w:val="18"/>
+        </w:rPr>
+        <w:t>) в Python хранятся в куче (heap)</w:t>
+      </w:r>
+    </w:p>
     <w:p>
       <w:pPr>
         <w:rPr>
@@ -16082,6 +16031,7 @@
           <w:sz w:val="18"/>
           <w:szCs w:val="18"/>
         </w:rPr>
+        <w:lastRenderedPageBreak/>
         <w:t xml:space="preserve">Пример: name = "John". В стеке лежит </w:t>
       </w:r>
       <w:r>
@@ -16140,7 +16090,6 @@
           <w:sz w:val="18"/>
           <w:szCs w:val="18"/>
         </w:rPr>
-        <w:lastRenderedPageBreak/>
         <w:t xml:space="preserve">Ты делаешь name = "Konstantinopol". В стеке переменная name </w:t>
       </w:r>
       <w:r>
@@ -17366,6 +17315,7 @@
           <w:sz w:val="18"/>
           <w:szCs w:val="18"/>
         </w:rPr>
+        <w:lastRenderedPageBreak/>
         <w:t>Жизнь:</w:t>
       </w:r>
       <w:r>
@@ -17390,7 +17340,6 @@
         <w:rPr>
           <w:noProof/>
         </w:rPr>
-        <w:lastRenderedPageBreak/>
         <w:drawing>
           <wp:inline distT="0" distB="0" distL="0" distR="0" wp14:anchorId="34636F5B" wp14:editId="4055B7E1">
             <wp:extent cx="3294309" cy="815566"/>
@@ -18726,6 +18675,7 @@
           <w:sz w:val="18"/>
           <w:szCs w:val="18"/>
         </w:rPr>
+        <w:lastRenderedPageBreak/>
         <w:t>Логика такая:</w:t>
       </w:r>
       <w:r>
@@ -18760,7 +18710,6 @@
           <w:sz w:val="18"/>
           <w:szCs w:val="18"/>
         </w:rPr>
-        <w:lastRenderedPageBreak/>
         <w:t>Поток №1 берет ключ. Теперь Поток №2 стоит и курит бамбук — он не может подойти к доске.</w:t>
       </w:r>
     </w:p>
@@ -20351,6 +20300,7 @@
           <w:sz w:val="18"/>
           <w:szCs w:val="18"/>
         </w:rPr>
+        <w:lastRenderedPageBreak/>
         <w:t>Как это работает:</w:t>
       </w:r>
       <w:r>
@@ -20410,7 +20360,6 @@
           <w:sz w:val="18"/>
           <w:szCs w:val="18"/>
         </w:rPr>
-        <w:lastRenderedPageBreak/>
         <w:t>Плюс:</w:t>
       </w:r>
       <w:r>
@@ -21046,7 +20995,6 @@
           <w:spacing w:val="-1"/>
           <w:sz w:val="18"/>
           <w:szCs w:val="18"/>
-          <w:lang w:val="en-US"/>
         </w:rPr>
       </w:pPr>
     </w:p>
@@ -21102,31 +21050,28 @@
           <w:sz w:val="18"/>
           <w:szCs w:val="18"/>
         </w:rPr>
-        <w:t>данных</w:t>
-      </w:r>
-      <w:r>
-        <w:rPr>
-          <w:rFonts w:ascii="Times New Roman" w:hAnsi="Times New Roman" w:cs="Times New Roman"/>
-          <w:b/>
-          <w:bCs/>
+        <w:t>данных. </w:t>
+      </w:r>
+      <w:r>
+        <w:rPr>
+          <w:rFonts w:ascii="Times New Roman" w:hAnsi="Times New Roman" w:cs="Times New Roman"/>
           <w:color w:val="000000" w:themeColor="text1"/>
           <w:spacing w:val="-1"/>
           <w:sz w:val="18"/>
           <w:szCs w:val="18"/>
         </w:rPr>
-        <w:t>.</w:t>
-      </w:r>
-      <w:r>
-        <w:rPr>
-          <w:rFonts w:ascii="Times New Roman" w:hAnsi="Times New Roman" w:cs="Times New Roman"/>
-          <w:b/>
-          <w:bCs/>
+        <w:t> Но на внутреннем уровне памяти компьютера (</w:t>
+      </w:r>
+      <w:r>
+        <w:rPr>
+          <w:rFonts w:ascii="Times New Roman" w:hAnsi="Times New Roman" w:cs="Times New Roman"/>
           <w:color w:val="000000" w:themeColor="text1"/>
           <w:spacing w:val="-1"/>
           <w:sz w:val="18"/>
           <w:szCs w:val="18"/>
-        </w:rPr>
-        <w:t> </w:t>
+          <w:lang w:val="en-US"/>
+        </w:rPr>
+        <w:t>RAM</w:t>
       </w:r>
       <w:r>
         <w:rPr>
@@ -21136,59 +21081,17 @@
           <w:sz w:val="18"/>
           <w:szCs w:val="18"/>
         </w:rPr>
-        <w:t xml:space="preserve"> Но на внутреннем уровне памяти компьютера </w:t>
-      </w:r>
-      <w:r>
+        <w:t>), они представляют собой не что иное, как последовательность битов. 100101101</w:t>
+      </w:r>
+    </w:p>
+    <w:p>
+      <w:pPr>
         <w:rPr>
           <w:rFonts w:ascii="Times New Roman" w:hAnsi="Times New Roman" w:cs="Times New Roman"/>
           <w:color w:val="000000" w:themeColor="text1"/>
           <w:spacing w:val="-1"/>
           <w:sz w:val="18"/>
           <w:szCs w:val="18"/>
-        </w:rPr>
-        <w:t>(</w:t>
-      </w:r>
-      <w:r>
-        <w:rPr>
-          <w:rFonts w:ascii="Times New Roman" w:hAnsi="Times New Roman" w:cs="Times New Roman"/>
-          <w:color w:val="000000" w:themeColor="text1"/>
-          <w:spacing w:val="-1"/>
-          <w:sz w:val="18"/>
-          <w:szCs w:val="18"/>
-          <w:lang w:val="en-US"/>
-        </w:rPr>
-        <w:t>RAM</w:t>
-      </w:r>
-      <w:r>
-        <w:rPr>
-          <w:rFonts w:ascii="Times New Roman" w:hAnsi="Times New Roman" w:cs="Times New Roman"/>
-          <w:color w:val="000000" w:themeColor="text1"/>
-          <w:spacing w:val="-1"/>
-          <w:sz w:val="18"/>
-          <w:szCs w:val="18"/>
-        </w:rPr>
-        <w:t>),</w:t>
-      </w:r>
-      <w:r>
-        <w:rPr>
-          <w:rFonts w:ascii="Times New Roman" w:hAnsi="Times New Roman" w:cs="Times New Roman"/>
-          <w:color w:val="000000" w:themeColor="text1"/>
-          <w:spacing w:val="-1"/>
-          <w:sz w:val="18"/>
-          <w:szCs w:val="18"/>
-        </w:rPr>
-        <w:t xml:space="preserve"> они представляют собой не что иное, как последовательность битов. 100101101</w:t>
-      </w:r>
-    </w:p>
-    <w:p>
-      <w:pPr>
-        <w:rPr>
-          <w:rFonts w:ascii="Times New Roman" w:hAnsi="Times New Roman" w:cs="Times New Roman"/>
-          <w:color w:val="000000" w:themeColor="text1"/>
-          <w:spacing w:val="-1"/>
-          <w:sz w:val="18"/>
-          <w:szCs w:val="18"/>
-          <w:lang w:val="en-US"/>
         </w:rPr>
       </w:pPr>
       <w:r>
@@ -21280,27 +21183,7 @@
           <w:sz w:val="18"/>
           <w:szCs w:val="18"/>
         </w:rPr>
-        <w:t>.</w:t>
-      </w:r>
-      <w:r>
-        <w:rPr>
-          <w:rFonts w:ascii="Times New Roman" w:hAnsi="Times New Roman" w:cs="Times New Roman"/>
-          <w:color w:val="000000" w:themeColor="text1"/>
-          <w:spacing w:val="-1"/>
-          <w:sz w:val="18"/>
-          <w:szCs w:val="18"/>
-        </w:rPr>
-        <w:t xml:space="preserve"> </w:t>
-      </w:r>
-      <w:r>
-        <w:rPr>
-          <w:rFonts w:ascii="Times New Roman" w:hAnsi="Times New Roman" w:cs="Times New Roman"/>
-          <w:color w:val="000000" w:themeColor="text1"/>
-          <w:spacing w:val="-1"/>
-          <w:sz w:val="18"/>
-          <w:szCs w:val="18"/>
-        </w:rPr>
-        <w:t>И каждый объект содержит, как минимум, следующие поля:</w:t>
+        <w:t>. И каждый объект содержит, как минимум, следующие поля:</w:t>
       </w:r>
     </w:p>
     <w:p>
@@ -21484,7 +21367,7 @@
           <w:sz w:val="18"/>
           <w:szCs w:val="18"/>
         </w:rPr>
-        <w:t> хранящихся в памяти</w:t>
+        <w:t> хранящихся в памяти.</w:t>
       </w:r>
       <w:r>
         <w:rPr>
@@ -21494,7 +21377,7 @@
           <w:sz w:val="18"/>
           <w:szCs w:val="18"/>
         </w:rPr>
-        <w:t>.</w:t>
+        <w:t xml:space="preserve"> К</w:t>
       </w:r>
       <w:r>
         <w:rPr>
@@ -21504,7 +21387,7 @@
           <w:sz w:val="18"/>
           <w:szCs w:val="18"/>
         </w:rPr>
-        <w:t xml:space="preserve"> К</w:t>
+        <w:t>огда мы присваиваем значение переменной, на самом деле имя переменной указывает </w:t>
       </w:r>
       <w:r>
         <w:rPr>
@@ -21514,29 +21397,39 @@
           <w:sz w:val="18"/>
           <w:szCs w:val="18"/>
         </w:rPr>
-        <w:t>огда мы присваиваем значение переменной, на самом деле имя переменной указывает </w:t>
-      </w:r>
-      <w:r>
-        <w:rPr>
-          <w:rFonts w:ascii="Times New Roman" w:hAnsi="Times New Roman" w:cs="Times New Roman"/>
-          <w:b/>
-          <w:bCs/>
+        <w:t>на</w:t>
+      </w:r>
+      <w:r>
+        <w:rPr>
+          <w:rFonts w:ascii="Times New Roman" w:hAnsi="Times New Roman" w:cs="Times New Roman"/>
           <w:color w:val="000000" w:themeColor="text1"/>
           <w:spacing w:val="-1"/>
           <w:sz w:val="18"/>
           <w:szCs w:val="18"/>
         </w:rPr>
-        <w:t>на</w:t>
-      </w:r>
-      <w:r>
-        <w:rPr>
-          <w:rFonts w:ascii="Times New Roman" w:hAnsi="Times New Roman" w:cs="Times New Roman"/>
+        <w:t> </w:t>
+      </w:r>
+      <w:r>
+        <w:rPr>
+          <w:rFonts w:ascii="Times New Roman" w:hAnsi="Times New Roman" w:cs="Times New Roman"/>
+          <w:b/>
+          <w:bCs/>
           <w:color w:val="000000" w:themeColor="text1"/>
           <w:spacing w:val="-1"/>
           <w:sz w:val="18"/>
           <w:szCs w:val="18"/>
         </w:rPr>
-        <w:t> ячейку памяти, где представлен объект (и его значение). </w:t>
+        <w:t>ячейку</w:t>
+      </w:r>
+      <w:r>
+        <w:rPr>
+          <w:rFonts w:ascii="Times New Roman" w:hAnsi="Times New Roman" w:cs="Times New Roman"/>
+          <w:color w:val="000000" w:themeColor="text1"/>
+          <w:spacing w:val="-1"/>
+          <w:sz w:val="18"/>
+          <w:szCs w:val="18"/>
+        </w:rPr>
+        <w:t xml:space="preserve"> памяти, где представлен объект (и его значение). </w:t>
       </w:r>
     </w:p>
     <w:p>
@@ -21618,7 +21511,6 @@
           <w:spacing w:val="-1"/>
           <w:sz w:val="18"/>
           <w:szCs w:val="18"/>
-          <w:lang w:val="en-US"/>
         </w:rPr>
       </w:pPr>
       <w:r>
@@ -21716,7 +21608,6 @@
           <w:spacing w:val="-1"/>
           <w:sz w:val="18"/>
           <w:szCs w:val="18"/>
-          <w:lang w:val="en-US"/>
         </w:rPr>
       </w:pPr>
       <w:r>
@@ -21743,7 +21634,6 @@
           <w:spacing w:val="-1"/>
           <w:sz w:val="18"/>
           <w:szCs w:val="18"/>
-          <w:lang w:val="en-US"/>
         </w:rPr>
       </w:pPr>
     </w:p>
@@ -21756,7 +21646,6 @@
           <w:spacing w:val="-1"/>
           <w:sz w:val="18"/>
           <w:szCs w:val="18"/>
-          <w:lang w:val="en-US"/>
         </w:rPr>
       </w:pPr>
       <w:r>
@@ -21789,17 +21678,19 @@
           <w:sz w:val="18"/>
           <w:szCs w:val="18"/>
         </w:rPr>
-        <w:t xml:space="preserve"> типах </w:t>
-      </w:r>
-      <w:r>
-        <w:rPr>
-          <w:rFonts w:ascii="Times New Roman" w:hAnsi="Times New Roman" w:cs="Times New Roman"/>
+        <w:t> типах данных. В противном случае мы говорим об </w:t>
+      </w:r>
+      <w:r>
+        <w:rPr>
+          <w:rFonts w:ascii="Times New Roman" w:hAnsi="Times New Roman" w:cs="Times New Roman"/>
+          <w:b/>
+          <w:bCs/>
           <w:color w:val="000000" w:themeColor="text1"/>
           <w:spacing w:val="-1"/>
           <w:sz w:val="18"/>
           <w:szCs w:val="18"/>
         </w:rPr>
-        <w:t>данных.</w:t>
+        <w:t>неизменяемых</w:t>
       </w:r>
       <w:r>
         <w:rPr>
@@ -21809,41 +21700,18 @@
           <w:sz w:val="18"/>
           <w:szCs w:val="18"/>
         </w:rPr>
-        <w:t xml:space="preserve"> В противном случае мы говорим об </w:t>
-      </w:r>
-      <w:r>
-        <w:rPr>
-          <w:rFonts w:ascii="Times New Roman" w:hAnsi="Times New Roman" w:cs="Times New Roman"/>
-          <w:b/>
-          <w:bCs/>
+        <w:t> типах данных.</w:t>
+      </w:r>
+    </w:p>
+    <w:p>
+      <w:pPr>
+        <w:spacing w:after="0"/>
+        <w:rPr>
+          <w:rFonts w:ascii="Times New Roman" w:hAnsi="Times New Roman" w:cs="Times New Roman"/>
           <w:color w:val="000000" w:themeColor="text1"/>
           <w:spacing w:val="-1"/>
           <w:sz w:val="18"/>
           <w:szCs w:val="18"/>
-        </w:rPr>
-        <w:t>неизменяемых</w:t>
-      </w:r>
-      <w:r>
-        <w:rPr>
-          <w:rFonts w:ascii="Times New Roman" w:hAnsi="Times New Roman" w:cs="Times New Roman"/>
-          <w:color w:val="000000" w:themeColor="text1"/>
-          <w:spacing w:val="-1"/>
-          <w:sz w:val="18"/>
-          <w:szCs w:val="18"/>
-        </w:rPr>
-        <w:t> типах данных.</w:t>
-      </w:r>
-    </w:p>
-    <w:p>
-      <w:pPr>
-        <w:spacing w:after="0"/>
-        <w:rPr>
-          <w:rFonts w:ascii="Times New Roman" w:hAnsi="Times New Roman" w:cs="Times New Roman"/>
-          <w:color w:val="000000" w:themeColor="text1"/>
-          <w:spacing w:val="-1"/>
-          <w:sz w:val="18"/>
-          <w:szCs w:val="18"/>
-          <w:lang w:val="en-US"/>
         </w:rPr>
       </w:pPr>
     </w:p>
@@ -21947,6 +21815,7 @@
                 <w:spacing w:val="-1"/>
                 <w:sz w:val="18"/>
                 <w:szCs w:val="18"/>
+                <w:lang w:val="en-US"/>
               </w:rPr>
             </w:pPr>
             <w:r>
@@ -21960,6 +21829,45 @@
                 <w:szCs w:val="18"/>
               </w:rPr>
               <w:t>Неизменяемый тип данных</w:t>
+            </w:r>
+            <w:r>
+              <w:rPr>
+                <w:rFonts w:ascii="Times New Roman" w:hAnsi="Times New Roman" w:cs="Times New Roman"/>
+                <w:b/>
+                <w:bCs/>
+                <w:color w:val="000000" w:themeColor="text1"/>
+                <w:spacing w:val="-1"/>
+                <w:sz w:val="18"/>
+                <w:szCs w:val="18"/>
+                <w:lang w:val="en-US"/>
+              </w:rPr>
+              <w:t xml:space="preserve"> (</w:t>
+            </w:r>
+            <w:r>
+              <w:rPr>
+                <w:rFonts w:ascii="Times New Roman" w:hAnsi="Times New Roman" w:cs="Times New Roman"/>
+                <w:b/>
+                <w:bCs/>
+                <w:color w:val="EE0000"/>
+                <w:spacing w:val="-1"/>
+                <w:sz w:val="18"/>
+                <w:szCs w:val="18"/>
+                <w:lang w:val="en-US"/>
+              </w:rPr>
+              <w:t>Immutable</w:t>
+            </w:r>
+            <w:r>
+              <w:rPr>
+                <w:rFonts w:ascii="Times New Roman" w:hAnsi="Times New Roman" w:cs="Times New Roman"/>
+                <w:b/>
+                <w:bCs/>
+                <w:color w:val="000000" w:themeColor="text1"/>
+                <w:spacing w:val="-1"/>
+                <w:sz w:val="18"/>
+                <w:szCs w:val="18"/>
+                <w:lang w:val="en-US"/>
+              </w:rPr>
+              <w:t>)</w:t>
             </w:r>
           </w:p>
         </w:tc>
@@ -21991,6 +21899,42 @@
                 <w:szCs w:val="18"/>
               </w:rPr>
               <w:t>Изменяемый тип данных</w:t>
+            </w:r>
+            <w:r>
+              <w:rPr>
+                <w:rFonts w:ascii="Times New Roman" w:hAnsi="Times New Roman" w:cs="Times New Roman"/>
+                <w:b/>
+                <w:bCs/>
+                <w:color w:val="000000" w:themeColor="text1"/>
+                <w:spacing w:val="-1"/>
+                <w:sz w:val="18"/>
+                <w:szCs w:val="18"/>
+              </w:rPr>
+              <w:t xml:space="preserve"> (</w:t>
+            </w:r>
+            <w:r>
+              <w:rPr>
+                <w:rFonts w:ascii="Times New Roman" w:hAnsi="Times New Roman" w:cs="Times New Roman"/>
+                <w:b/>
+                <w:bCs/>
+                <w:color w:val="00B050"/>
+                <w:spacing w:val="-1"/>
+                <w:sz w:val="18"/>
+                <w:szCs w:val="18"/>
+              </w:rPr>
+              <w:t>Mutable</w:t>
+            </w:r>
+            <w:r>
+              <w:rPr>
+                <w:rFonts w:ascii="Times New Roman" w:hAnsi="Times New Roman" w:cs="Times New Roman"/>
+                <w:b/>
+                <w:bCs/>
+                <w:color w:val="000000" w:themeColor="text1"/>
+                <w:spacing w:val="-1"/>
+                <w:sz w:val="18"/>
+                <w:szCs w:val="18"/>
+              </w:rPr>
+              <w:t>)</w:t>
             </w:r>
           </w:p>
         </w:tc>
@@ -22271,56 +22215,480 @@
       <w:r>
         <w:rPr>
           <w:rFonts w:ascii="Times New Roman" w:hAnsi="Times New Roman" w:cs="Times New Roman"/>
-          <w:b/>
-          <w:bCs/>
           <w:color w:val="000000" w:themeColor="text1"/>
           <w:spacing w:val="-1"/>
           <w:sz w:val="18"/>
           <w:szCs w:val="18"/>
         </w:rPr>
-        <w:t>Структуры данных</w:t>
-      </w:r>
-      <w:r>
-        <w:rPr>
-          <w:rFonts w:ascii="Times New Roman" w:hAnsi="Times New Roman" w:cs="Times New Roman"/>
+        <w:t xml:space="preserve">Управление потоком выполнения в программировании — это то, </w:t>
+      </w:r>
+      <w:r>
+        <w:rPr>
+          <w:rFonts w:ascii="Times New Roman" w:hAnsi="Times New Roman" w:cs="Times New Roman"/>
+          <w:b/>
+          <w:bCs/>
           <w:color w:val="000000" w:themeColor="text1"/>
           <w:spacing w:val="-1"/>
           <w:sz w:val="18"/>
           <w:szCs w:val="18"/>
         </w:rPr>
-        <w:t xml:space="preserve"> — это организованные способы хранения и управления наборами информации, позволяющие эффективно использовать их в программе. В Python существует несколько встроенных структур, таких как списки, кортежи, множества и словари, каждая из которых обладает специфическими характеристиками, делающими её более подходящей для определённых типов задач. </w:t>
-      </w:r>
-    </w:p>
-    <w:p>
-      <w:pPr>
-        <w:rPr>
-          <w:rFonts w:ascii="Times New Roman" w:hAnsi="Times New Roman" w:cs="Times New Roman"/>
-          <w:color w:val="595959" w:themeColor="text1" w:themeTint="A6"/>
+        <w:t>как</w:t>
+      </w:r>
+      <w:r>
+        <w:rPr>
+          <w:rFonts w:ascii="Times New Roman" w:hAnsi="Times New Roman" w:cs="Times New Roman"/>
+          <w:color w:val="000000" w:themeColor="text1"/>
           <w:spacing w:val="-1"/>
           <w:sz w:val="18"/>
           <w:szCs w:val="18"/>
         </w:rPr>
-      </w:pPr>
-    </w:p>
-    <w:p>
-      <w:pPr>
-        <w:rPr>
-          <w:rFonts w:ascii="Times New Roman" w:hAnsi="Times New Roman" w:cs="Times New Roman"/>
-          <w:color w:val="595959" w:themeColor="text1" w:themeTint="A6"/>
+        <w:t xml:space="preserve"> определяется порядок выполнения инструкций программы. Вместо следования линейной последовательности, программы могут принимать решения, повторять блоки кода или изменять порядок выполнения в зависимости от </w:t>
+      </w:r>
+      <w:r>
+        <w:rPr>
+          <w:rFonts w:ascii="Times New Roman" w:hAnsi="Times New Roman" w:cs="Times New Roman"/>
+          <w:b/>
+          <w:bCs/>
+          <w:color w:val="000000" w:themeColor="text1"/>
           <w:spacing w:val="-1"/>
           <w:sz w:val="18"/>
           <w:szCs w:val="18"/>
         </w:rPr>
-      </w:pPr>
-    </w:p>
-    <w:p>
-      <w:pPr>
-        <w:rPr>
-          <w:rFonts w:ascii="Times New Roman" w:hAnsi="Times New Roman" w:cs="Times New Roman"/>
-          <w:color w:val="595959" w:themeColor="text1" w:themeTint="A6"/>
+        <w:t>определенных условий</w:t>
+      </w:r>
+      <w:r>
+        <w:rPr>
+          <w:rFonts w:ascii="Times New Roman" w:hAnsi="Times New Roman" w:cs="Times New Roman"/>
+          <w:color w:val="000000" w:themeColor="text1"/>
           <w:spacing w:val="-1"/>
           <w:sz w:val="18"/>
           <w:szCs w:val="18"/>
+        </w:rPr>
+        <w:t>. Это достигается с помощью таких структур, как условные операторы (</w:t>
+      </w:r>
+      <w:r>
+        <w:rPr>
+          <w:rFonts w:ascii="Times New Roman" w:hAnsi="Times New Roman" w:cs="Times New Roman"/>
+          <w:b/>
+          <w:bCs/>
+          <w:color w:val="000000" w:themeColor="text1"/>
+          <w:spacing w:val="-1"/>
+          <w:sz w:val="18"/>
+          <w:szCs w:val="18"/>
+        </w:rPr>
+        <w:t>if, else</w:t>
+      </w:r>
+      <w:r>
+        <w:rPr>
+          <w:rFonts w:ascii="Times New Roman" w:hAnsi="Times New Roman" w:cs="Times New Roman"/>
+          <w:color w:val="000000" w:themeColor="text1"/>
+          <w:spacing w:val="-1"/>
+          <w:sz w:val="18"/>
+          <w:szCs w:val="18"/>
+        </w:rPr>
+        <w:t>), циклы (</w:t>
+      </w:r>
+      <w:r>
+        <w:rPr>
+          <w:rFonts w:ascii="Times New Roman" w:hAnsi="Times New Roman" w:cs="Times New Roman"/>
+          <w:b/>
+          <w:bCs/>
+          <w:color w:val="000000" w:themeColor="text1"/>
+          <w:spacing w:val="-1"/>
+          <w:sz w:val="18"/>
+          <w:szCs w:val="18"/>
+        </w:rPr>
+        <w:t>for, while</w:t>
+      </w:r>
+      <w:r>
+        <w:rPr>
+          <w:rFonts w:ascii="Times New Roman" w:hAnsi="Times New Roman" w:cs="Times New Roman"/>
+          <w:color w:val="000000" w:themeColor="text1"/>
+          <w:spacing w:val="-1"/>
+          <w:sz w:val="18"/>
+          <w:szCs w:val="18"/>
+        </w:rPr>
+        <w:t xml:space="preserve">) и управляющие операторы, такие как </w:t>
+      </w:r>
+      <w:r>
+        <w:rPr>
+          <w:rFonts w:ascii="Times New Roman" w:hAnsi="Times New Roman" w:cs="Times New Roman"/>
+          <w:b/>
+          <w:bCs/>
+          <w:color w:val="000000" w:themeColor="text1"/>
+          <w:spacing w:val="-1"/>
+          <w:sz w:val="18"/>
+          <w:szCs w:val="18"/>
+        </w:rPr>
+        <w:t>break</w:t>
+      </w:r>
+      <w:r>
+        <w:rPr>
+          <w:rFonts w:ascii="Times New Roman" w:hAnsi="Times New Roman" w:cs="Times New Roman"/>
+          <w:color w:val="000000" w:themeColor="text1"/>
+          <w:spacing w:val="-1"/>
+          <w:sz w:val="18"/>
+          <w:szCs w:val="18"/>
+        </w:rPr>
+        <w:t xml:space="preserve"> или </w:t>
+      </w:r>
+      <w:r>
+        <w:rPr>
+          <w:rFonts w:ascii="Times New Roman" w:hAnsi="Times New Roman" w:cs="Times New Roman"/>
+          <w:b/>
+          <w:bCs/>
+          <w:color w:val="000000" w:themeColor="text1"/>
+          <w:spacing w:val="-1"/>
+          <w:sz w:val="18"/>
+          <w:szCs w:val="18"/>
+        </w:rPr>
+        <w:t>continue</w:t>
+      </w:r>
+      <w:r>
+        <w:rPr>
+          <w:rFonts w:ascii="Times New Roman" w:hAnsi="Times New Roman" w:cs="Times New Roman"/>
+          <w:color w:val="000000" w:themeColor="text1"/>
+          <w:spacing w:val="-1"/>
+          <w:sz w:val="18"/>
+          <w:szCs w:val="18"/>
+        </w:rPr>
+        <w:t>.</w:t>
+      </w:r>
+    </w:p>
+    <w:p>
+      <w:pPr>
+        <w:rPr>
+          <w:rFonts w:ascii="Times New Roman" w:hAnsi="Times New Roman" w:cs="Times New Roman"/>
+          <w:color w:val="000000" w:themeColor="text1"/>
+          <w:spacing w:val="-1"/>
+          <w:sz w:val="18"/>
+          <w:szCs w:val="18"/>
+          <w:lang w:val="en-US"/>
+        </w:rPr>
+      </w:pPr>
+      <w:r>
+        <w:rPr>
+          <w:rFonts w:ascii="Times New Roman" w:hAnsi="Times New Roman" w:cs="Times New Roman"/>
+          <w:color w:val="000000" w:themeColor="text1"/>
+          <w:spacing w:val="-1"/>
+          <w:sz w:val="18"/>
+          <w:szCs w:val="18"/>
+        </w:rPr>
+        <w:t>Условный оператор в Python (как и во многих других языках программирования) называется if. При его написании необходимо добавить в конце строки выражение сравнения, заканчивающееся </w:t>
+      </w:r>
+      <w:r>
+        <w:rPr>
+          <w:rFonts w:ascii="Times New Roman" w:hAnsi="Times New Roman" w:cs="Times New Roman"/>
+          <w:color w:val="000000" w:themeColor="text1"/>
+          <w:spacing w:val="-1"/>
+          <w:sz w:val="18"/>
+          <w:szCs w:val="18"/>
+        </w:rPr>
+        <w:t>двоеточием.</w:t>
+      </w:r>
+    </w:p>
+    <w:p>
+      <w:pPr>
+        <w:rPr>
+          <w:rFonts w:ascii="Times New Roman" w:hAnsi="Times New Roman" w:cs="Times New Roman"/>
+          <w:b/>
+          <w:bCs/>
+          <w:color w:val="000000" w:themeColor="text1"/>
+          <w:spacing w:val="-1"/>
+          <w:sz w:val="18"/>
+          <w:szCs w:val="18"/>
+          <w:lang w:val="en-US"/>
+        </w:rPr>
+      </w:pPr>
+      <w:r>
+        <w:rPr>
+          <w:noProof/>
+        </w:rPr>
+        <w:drawing>
+          <wp:inline distT="0" distB="0" distL="0" distR="0" wp14:anchorId="30256EE7" wp14:editId="74D73992">
+            <wp:extent cx="2704762" cy="1123810"/>
+            <wp:effectExtent l="0" t="0" r="635" b="635"/>
+            <wp:docPr id="2086317725" name="Рисунок 1"/>
+            <wp:cNvGraphicFramePr>
+              <a:graphicFrameLocks xmlns:a="http://schemas.openxmlformats.org/drawingml/2006/main" noChangeAspect="1"/>
+            </wp:cNvGraphicFramePr>
+            <a:graphic xmlns:a="http://schemas.openxmlformats.org/drawingml/2006/main">
+              <a:graphicData uri="http://schemas.openxmlformats.org/drawingml/2006/picture">
+                <pic:pic xmlns:pic="http://schemas.openxmlformats.org/drawingml/2006/picture">
+                  <pic:nvPicPr>
+                    <pic:cNvPr id="2086317725" name=""/>
+                    <pic:cNvPicPr/>
+                  </pic:nvPicPr>
+                  <pic:blipFill>
+                    <a:blip r:embed="rId39"/>
+                    <a:stretch>
+                      <a:fillRect/>
+                    </a:stretch>
+                  </pic:blipFill>
+                  <pic:spPr>
+                    <a:xfrm>
+                      <a:off x="0" y="0"/>
+                      <a:ext cx="2704762" cy="1123810"/>
+                    </a:xfrm>
+                    <a:prstGeom prst="rect">
+                      <a:avLst/>
+                    </a:prstGeom>
+                  </pic:spPr>
+                </pic:pic>
+              </a:graphicData>
+            </a:graphic>
+          </wp:inline>
+        </w:drawing>
+      </w:r>
+    </w:p>
+    <w:p>
+      <w:pPr>
+        <w:rPr>
+          <w:rFonts w:ascii="Times New Roman" w:hAnsi="Times New Roman" w:cs="Times New Roman"/>
+          <w:color w:val="000000" w:themeColor="text1"/>
+          <w:spacing w:val="-1"/>
+          <w:sz w:val="18"/>
+          <w:szCs w:val="18"/>
+          <w:lang w:val="en-US"/>
+        </w:rPr>
+      </w:pPr>
+      <w:r>
+        <w:rPr>
+          <w:rFonts w:ascii="Times New Roman" w:hAnsi="Times New Roman" w:cs="Times New Roman"/>
+          <w:color w:val="000000" w:themeColor="text1"/>
+          <w:spacing w:val="-1"/>
+          <w:sz w:val="18"/>
+          <w:szCs w:val="18"/>
+        </w:rPr>
+        <w:t>В предыдущем примере очевидно, что условие выполнено, и, следовательно, инструкция внутри тела условия выполняется. Однако это может быть не так. Для обработки такого сценария существует оператор else.</w:t>
+      </w:r>
+    </w:p>
+    <w:p>
+      <w:pPr>
+        <w:rPr>
+          <w:rFonts w:ascii="Times New Roman" w:hAnsi="Times New Roman" w:cs="Times New Roman"/>
+          <w:color w:val="000000" w:themeColor="text1"/>
+          <w:spacing w:val="-1"/>
+          <w:sz w:val="18"/>
+          <w:szCs w:val="18"/>
+          <w:lang w:val="en-US"/>
+        </w:rPr>
+      </w:pPr>
+      <w:r>
+        <w:rPr>
+          <w:noProof/>
+        </w:rPr>
+        <w:drawing>
+          <wp:inline distT="0" distB="0" distL="0" distR="0" wp14:anchorId="23C96783" wp14:editId="0094C311">
+            <wp:extent cx="2590476" cy="1447619"/>
+            <wp:effectExtent l="0" t="0" r="635" b="635"/>
+            <wp:docPr id="1681842616" name="Рисунок 1"/>
+            <wp:cNvGraphicFramePr>
+              <a:graphicFrameLocks xmlns:a="http://schemas.openxmlformats.org/drawingml/2006/main" noChangeAspect="1"/>
+            </wp:cNvGraphicFramePr>
+            <a:graphic xmlns:a="http://schemas.openxmlformats.org/drawingml/2006/main">
+              <a:graphicData uri="http://schemas.openxmlformats.org/drawingml/2006/picture">
+                <pic:pic xmlns:pic="http://schemas.openxmlformats.org/drawingml/2006/picture">
+                  <pic:nvPicPr>
+                    <pic:cNvPr id="1681842616" name=""/>
+                    <pic:cNvPicPr/>
+                  </pic:nvPicPr>
+                  <pic:blipFill>
+                    <a:blip r:embed="rId40"/>
+                    <a:stretch>
+                      <a:fillRect/>
+                    </a:stretch>
+                  </pic:blipFill>
+                  <pic:spPr>
+                    <a:xfrm>
+                      <a:off x="0" y="0"/>
+                      <a:ext cx="2590476" cy="1447619"/>
+                    </a:xfrm>
+                    <a:prstGeom prst="rect">
+                      <a:avLst/>
+                    </a:prstGeom>
+                  </pic:spPr>
+                </pic:pic>
+              </a:graphicData>
+            </a:graphic>
+          </wp:inline>
+        </w:drawing>
+      </w:r>
+    </w:p>
+    <w:p>
+      <w:pPr>
+        <w:rPr>
+          <w:rFonts w:ascii="Times New Roman" w:hAnsi="Times New Roman" w:cs="Times New Roman"/>
+          <w:b/>
+          <w:bCs/>
+          <w:color w:val="000000" w:themeColor="text1"/>
+          <w:spacing w:val="-1"/>
+          <w:sz w:val="18"/>
+          <w:szCs w:val="18"/>
+          <w:lang w:val="en-US"/>
+        </w:rPr>
+      </w:pPr>
+      <w:r>
+        <w:rPr>
+          <w:rFonts w:ascii="Times New Roman" w:hAnsi="Times New Roman" w:cs="Times New Roman"/>
+          <w:color w:val="000000" w:themeColor="text1"/>
+          <w:spacing w:val="-1"/>
+          <w:sz w:val="18"/>
+          <w:szCs w:val="18"/>
+        </w:rPr>
+        <w:t> </w:t>
+      </w:r>
+      <w:r>
+        <w:rPr>
+          <w:rFonts w:ascii="Times New Roman" w:hAnsi="Times New Roman" w:cs="Times New Roman"/>
+          <w:color w:val="000000" w:themeColor="text1"/>
+          <w:spacing w:val="-1"/>
+          <w:sz w:val="18"/>
+          <w:szCs w:val="18"/>
+        </w:rPr>
+        <w:t>Мы м</w:t>
+      </w:r>
+      <w:r>
+        <w:rPr>
+          <w:rFonts w:ascii="Times New Roman" w:hAnsi="Times New Roman" w:cs="Times New Roman"/>
+          <w:color w:val="000000" w:themeColor="text1"/>
+          <w:spacing w:val="-1"/>
+          <w:sz w:val="18"/>
+          <w:szCs w:val="18"/>
+        </w:rPr>
+        <w:t>ожем даже иметь условия внутри условий, что технически называется </w:t>
+      </w:r>
+      <w:r>
+        <w:rPr>
+          <w:rFonts w:ascii="Times New Roman" w:hAnsi="Times New Roman" w:cs="Times New Roman"/>
+          <w:b/>
+          <w:bCs/>
+          <w:color w:val="000000" w:themeColor="text1"/>
+          <w:spacing w:val="-1"/>
+          <w:sz w:val="18"/>
+          <w:szCs w:val="18"/>
+        </w:rPr>
+        <w:t>вложенными условиями</w:t>
+      </w:r>
+    </w:p>
+    <w:p>
+      <w:pPr>
+        <w:rPr>
+          <w:rFonts w:ascii="Times New Roman" w:hAnsi="Times New Roman" w:cs="Times New Roman"/>
+          <w:color w:val="000000" w:themeColor="text1"/>
+          <w:spacing w:val="-1"/>
+          <w:sz w:val="18"/>
+          <w:szCs w:val="18"/>
+          <w:lang w:val="en-US"/>
+        </w:rPr>
+      </w:pPr>
+      <w:r>
+        <w:rPr>
+          <w:noProof/>
+        </w:rPr>
+        <w:drawing>
+          <wp:inline distT="0" distB="0" distL="0" distR="0" wp14:anchorId="1A58FB8F" wp14:editId="62B768ED">
+            <wp:extent cx="3723809" cy="2809524"/>
+            <wp:effectExtent l="0" t="0" r="0" b="0"/>
+            <wp:docPr id="456988237" name="Рисунок 1"/>
+            <wp:cNvGraphicFramePr>
+              <a:graphicFrameLocks xmlns:a="http://schemas.openxmlformats.org/drawingml/2006/main" noChangeAspect="1"/>
+            </wp:cNvGraphicFramePr>
+            <a:graphic xmlns:a="http://schemas.openxmlformats.org/drawingml/2006/main">
+              <a:graphicData uri="http://schemas.openxmlformats.org/drawingml/2006/picture">
+                <pic:pic xmlns:pic="http://schemas.openxmlformats.org/drawingml/2006/picture">
+                  <pic:nvPicPr>
+                    <pic:cNvPr id="456988237" name=""/>
+                    <pic:cNvPicPr/>
+                  </pic:nvPicPr>
+                  <pic:blipFill>
+                    <a:blip r:embed="rId41"/>
+                    <a:stretch>
+                      <a:fillRect/>
+                    </a:stretch>
+                  </pic:blipFill>
+                  <pic:spPr>
+                    <a:xfrm>
+                      <a:off x="0" y="0"/>
+                      <a:ext cx="3723809" cy="2809524"/>
+                    </a:xfrm>
+                    <a:prstGeom prst="rect">
+                      <a:avLst/>
+                    </a:prstGeom>
+                  </pic:spPr>
+                </pic:pic>
+              </a:graphicData>
+            </a:graphic>
+          </wp:inline>
+        </w:drawing>
+      </w:r>
+    </w:p>
+    <w:p>
+      <w:pPr>
+        <w:rPr>
+          <w:rFonts w:ascii="Times New Roman" w:hAnsi="Times New Roman" w:cs="Times New Roman"/>
+          <w:color w:val="000000" w:themeColor="text1"/>
+          <w:spacing w:val="-1"/>
+          <w:sz w:val="18"/>
+          <w:szCs w:val="18"/>
+          <w:lang w:val="en-US"/>
+        </w:rPr>
+      </w:pPr>
+      <w:r>
+        <w:rPr>
+          <w:rFonts w:ascii="Times New Roman" w:hAnsi="Times New Roman" w:cs="Times New Roman"/>
+          <w:b/>
+          <w:bCs/>
+          <w:color w:val="000000" w:themeColor="text1"/>
+          <w:spacing w:val="-1"/>
+          <w:sz w:val="18"/>
+          <w:szCs w:val="18"/>
+        </w:rPr>
+        <w:t>Структуры данных</w:t>
+      </w:r>
+      <w:r>
+        <w:rPr>
+          <w:rFonts w:ascii="Times New Roman" w:hAnsi="Times New Roman" w:cs="Times New Roman"/>
+          <w:color w:val="000000" w:themeColor="text1"/>
+          <w:spacing w:val="-1"/>
+          <w:sz w:val="18"/>
+          <w:szCs w:val="18"/>
+        </w:rPr>
+        <w:t xml:space="preserve"> — это организованные способы хранения и управления наборами информации, позволяющие эффективно использовать их в программе. В Python существует несколько встроенных структур, таких как списки, кортежи, </w:t>
+      </w:r>
+      <w:r>
+        <w:rPr>
+          <w:rFonts w:ascii="Times New Roman" w:hAnsi="Times New Roman" w:cs="Times New Roman"/>
+          <w:color w:val="000000" w:themeColor="text1"/>
+          <w:spacing w:val="-1"/>
+          <w:sz w:val="18"/>
+          <w:szCs w:val="18"/>
+        </w:rPr>
+        <w:lastRenderedPageBreak/>
+        <w:t>множества и словари, каждая из которых обладает специфическими характеристиками, делающими её более подходящей для определённых типов задач. </w:t>
+      </w:r>
+    </w:p>
+    <w:p>
+      <w:pPr>
+        <w:rPr>
+          <w:rFonts w:ascii="Times New Roman" w:hAnsi="Times New Roman" w:cs="Times New Roman"/>
+          <w:color w:val="595959" w:themeColor="text1" w:themeTint="A6"/>
+          <w:spacing w:val="-1"/>
+          <w:sz w:val="18"/>
+          <w:szCs w:val="18"/>
+          <w:lang w:val="en-US"/>
+        </w:rPr>
+      </w:pPr>
+    </w:p>
+    <w:p>
+      <w:pPr>
+        <w:rPr>
+          <w:rFonts w:ascii="Times New Roman" w:hAnsi="Times New Roman" w:cs="Times New Roman"/>
+          <w:color w:val="595959" w:themeColor="text1" w:themeTint="A6"/>
+          <w:spacing w:val="-1"/>
+          <w:sz w:val="18"/>
+          <w:szCs w:val="18"/>
+          <w:lang w:val="en-US"/>
         </w:rPr>
       </w:pPr>
     </w:p>
@@ -22337,9 +22705,2022 @@
           <w:szCs w:val="18"/>
         </w:rPr>
       </w:pPr>
-    </w:p>
-    <w:p/>
-    <w:p/>
+      <w:r>
+        <w:rPr>
+          <w:rFonts w:ascii="Times New Roman" w:hAnsi="Times New Roman" w:cs="Times New Roman"/>
+          <w:b/>
+          <w:bCs/>
+          <w:color w:val="595959" w:themeColor="text1" w:themeTint="A6"/>
+          <w:sz w:val="18"/>
+          <w:szCs w:val="18"/>
+        </w:rPr>
+        <w:t>Таблица истинности для логических операторов в Python</w:t>
+      </w:r>
+    </w:p>
+    <w:p>
+      <w:pPr>
+        <w:ind w:left="360"/>
+        <w:rPr>
+          <w:rFonts w:ascii="Times New Roman" w:hAnsi="Times New Roman" w:cs="Times New Roman"/>
+          <w:b/>
+          <w:bCs/>
+          <w:color w:val="595959" w:themeColor="text1" w:themeTint="A6"/>
+          <w:sz w:val="18"/>
+          <w:szCs w:val="18"/>
+        </w:rPr>
+      </w:pPr>
+      <w:r>
+        <w:rPr>
+          <w:rFonts w:ascii="Times New Roman" w:hAnsi="Times New Roman" w:cs="Times New Roman"/>
+          <w:b/>
+          <w:bCs/>
+          <w:color w:val="595959" w:themeColor="text1" w:themeTint="A6"/>
+          <w:sz w:val="18"/>
+          <w:szCs w:val="18"/>
+        </w:rPr>
+        <w:t>1. and (И, конъюнкция)</w:t>
+      </w:r>
+    </w:p>
+    <w:p>
+      <w:pPr>
+        <w:ind w:left="360"/>
+        <w:jc w:val="center"/>
+        <w:rPr>
+          <w:rFonts w:ascii="Times New Roman" w:hAnsi="Times New Roman" w:cs="Times New Roman"/>
+          <w:b/>
+          <w:bCs/>
+          <w:color w:val="595959" w:themeColor="text1" w:themeTint="A6"/>
+          <w:sz w:val="18"/>
+          <w:szCs w:val="18"/>
+        </w:rPr>
+      </w:pPr>
+    </w:p>
+    <w:tbl>
+      <w:tblPr>
+        <w:tblW w:w="12000" w:type="dxa"/>
+        <w:tblBorders>
+          <w:top w:val="single" w:sz="2" w:space="0" w:color="E5E7EB"/>
+          <w:left w:val="single" w:sz="2" w:space="0" w:color="E5E7EB"/>
+          <w:bottom w:val="single" w:sz="2" w:space="0" w:color="E5E7EB"/>
+          <w:right w:val="single" w:sz="2" w:space="0" w:color="E5E7EB"/>
+          <w:insideH w:val="single" w:sz="4" w:space="0" w:color="auto"/>
+          <w:insideV w:val="single" w:sz="4" w:space="0" w:color="auto"/>
+        </w:tblBorders>
+        <w:tblCellMar>
+          <w:top w:w="15" w:type="dxa"/>
+          <w:left w:w="15" w:type="dxa"/>
+          <w:bottom w:w="15" w:type="dxa"/>
+          <w:right w:w="15" w:type="dxa"/>
+        </w:tblCellMar>
+        <w:tblLook w:val="04A0" w:firstRow="1" w:lastRow="0" w:firstColumn="1" w:lastColumn="0" w:noHBand="0" w:noVBand="1"/>
+      </w:tblPr>
+      <w:tblGrid>
+        <w:gridCol w:w="3322"/>
+        <w:gridCol w:w="3322"/>
+        <w:gridCol w:w="5356"/>
+      </w:tblGrid>
+      <w:tr>
+        <w:trPr>
+          <w:tblHeader/>
+        </w:trPr>
+        <w:tc>
+          <w:tcPr>
+            <w:tcW w:w="0" w:type="auto"/>
+            <w:noWrap/>
+            <w:vAlign w:val="bottom"/>
+            <w:hideMark/>
+          </w:tcPr>
+          <w:p>
+            <w:pPr>
+              <w:rPr>
+                <w:rFonts w:ascii="Times New Roman" w:hAnsi="Times New Roman" w:cs="Times New Roman"/>
+                <w:b/>
+                <w:bCs/>
+                <w:sz w:val="18"/>
+                <w:szCs w:val="18"/>
+              </w:rPr>
+            </w:pPr>
+            <w:r>
+              <w:rPr>
+                <w:rFonts w:ascii="Times New Roman" w:hAnsi="Times New Roman" w:cs="Times New Roman"/>
+                <w:b/>
+                <w:bCs/>
+                <w:sz w:val="18"/>
+                <w:szCs w:val="18"/>
+              </w:rPr>
+              <w:t>A</w:t>
+            </w:r>
+          </w:p>
+        </w:tc>
+        <w:tc>
+          <w:tcPr>
+            <w:tcW w:w="0" w:type="auto"/>
+            <w:noWrap/>
+            <w:vAlign w:val="bottom"/>
+            <w:hideMark/>
+          </w:tcPr>
+          <w:p>
+            <w:pPr>
+              <w:rPr>
+                <w:rFonts w:ascii="Times New Roman" w:hAnsi="Times New Roman" w:cs="Times New Roman"/>
+                <w:b/>
+                <w:bCs/>
+                <w:sz w:val="18"/>
+                <w:szCs w:val="18"/>
+              </w:rPr>
+            </w:pPr>
+            <w:r>
+              <w:rPr>
+                <w:rFonts w:ascii="Times New Roman" w:hAnsi="Times New Roman" w:cs="Times New Roman"/>
+                <w:b/>
+                <w:bCs/>
+                <w:sz w:val="18"/>
+                <w:szCs w:val="18"/>
+              </w:rPr>
+              <w:t>B</w:t>
+            </w:r>
+          </w:p>
+        </w:tc>
+        <w:tc>
+          <w:tcPr>
+            <w:tcW w:w="0" w:type="auto"/>
+            <w:noWrap/>
+            <w:vAlign w:val="bottom"/>
+            <w:hideMark/>
+          </w:tcPr>
+          <w:p>
+            <w:pPr>
+              <w:rPr>
+                <w:rFonts w:ascii="Times New Roman" w:hAnsi="Times New Roman" w:cs="Times New Roman"/>
+                <w:b/>
+                <w:bCs/>
+                <w:sz w:val="18"/>
+                <w:szCs w:val="18"/>
+              </w:rPr>
+            </w:pPr>
+            <w:r>
+              <w:rPr>
+                <w:rFonts w:ascii="Times New Roman" w:hAnsi="Times New Roman" w:cs="Times New Roman"/>
+                <w:b/>
+                <w:bCs/>
+                <w:sz w:val="18"/>
+                <w:szCs w:val="18"/>
+              </w:rPr>
+              <w:t>A and B</w:t>
+            </w:r>
+          </w:p>
+        </w:tc>
+      </w:tr>
+      <w:tr>
+        <w:tc>
+          <w:tcPr>
+            <w:tcW w:w="0" w:type="auto"/>
+            <w:vAlign w:val="bottom"/>
+            <w:hideMark/>
+          </w:tcPr>
+          <w:p>
+            <w:pPr>
+              <w:rPr>
+                <w:rFonts w:ascii="Times New Roman" w:hAnsi="Times New Roman" w:cs="Times New Roman"/>
+                <w:sz w:val="18"/>
+                <w:szCs w:val="18"/>
+              </w:rPr>
+            </w:pPr>
+            <w:r>
+              <w:rPr>
+                <w:rFonts w:ascii="Times New Roman" w:hAnsi="Times New Roman" w:cs="Times New Roman"/>
+                <w:sz w:val="18"/>
+                <w:szCs w:val="18"/>
+              </w:rPr>
+              <w:t>True</w:t>
+            </w:r>
+          </w:p>
+        </w:tc>
+        <w:tc>
+          <w:tcPr>
+            <w:tcW w:w="0" w:type="auto"/>
+            <w:vAlign w:val="bottom"/>
+            <w:hideMark/>
+          </w:tcPr>
+          <w:p>
+            <w:pPr>
+              <w:rPr>
+                <w:rFonts w:ascii="Times New Roman" w:hAnsi="Times New Roman" w:cs="Times New Roman"/>
+                <w:sz w:val="18"/>
+                <w:szCs w:val="18"/>
+              </w:rPr>
+            </w:pPr>
+            <w:r>
+              <w:rPr>
+                <w:rFonts w:ascii="Times New Roman" w:hAnsi="Times New Roman" w:cs="Times New Roman"/>
+                <w:sz w:val="18"/>
+                <w:szCs w:val="18"/>
+              </w:rPr>
+              <w:t>True</w:t>
+            </w:r>
+          </w:p>
+        </w:tc>
+        <w:tc>
+          <w:tcPr>
+            <w:tcW w:w="0" w:type="auto"/>
+            <w:vAlign w:val="bottom"/>
+            <w:hideMark/>
+          </w:tcPr>
+          <w:p>
+            <w:pPr>
+              <w:rPr>
+                <w:rFonts w:ascii="Times New Roman" w:hAnsi="Times New Roman" w:cs="Times New Roman"/>
+                <w:sz w:val="18"/>
+                <w:szCs w:val="18"/>
+              </w:rPr>
+            </w:pPr>
+            <w:r>
+              <w:rPr>
+                <w:rFonts w:ascii="Times New Roman" w:hAnsi="Times New Roman" w:cs="Times New Roman"/>
+                <w:b/>
+                <w:bCs/>
+                <w:sz w:val="18"/>
+                <w:szCs w:val="18"/>
+              </w:rPr>
+              <w:t>True</w:t>
+            </w:r>
+          </w:p>
+        </w:tc>
+      </w:tr>
+      <w:tr>
+        <w:tc>
+          <w:tcPr>
+            <w:tcW w:w="0" w:type="auto"/>
+            <w:vAlign w:val="bottom"/>
+            <w:hideMark/>
+          </w:tcPr>
+          <w:p>
+            <w:pPr>
+              <w:rPr>
+                <w:rFonts w:ascii="Times New Roman" w:hAnsi="Times New Roman" w:cs="Times New Roman"/>
+                <w:sz w:val="18"/>
+                <w:szCs w:val="18"/>
+              </w:rPr>
+            </w:pPr>
+            <w:r>
+              <w:rPr>
+                <w:rFonts w:ascii="Times New Roman" w:hAnsi="Times New Roman" w:cs="Times New Roman"/>
+                <w:sz w:val="18"/>
+                <w:szCs w:val="18"/>
+              </w:rPr>
+              <w:t>True</w:t>
+            </w:r>
+          </w:p>
+        </w:tc>
+        <w:tc>
+          <w:tcPr>
+            <w:tcW w:w="0" w:type="auto"/>
+            <w:vAlign w:val="bottom"/>
+            <w:hideMark/>
+          </w:tcPr>
+          <w:p>
+            <w:pPr>
+              <w:rPr>
+                <w:rFonts w:ascii="Times New Roman" w:hAnsi="Times New Roman" w:cs="Times New Roman"/>
+                <w:sz w:val="18"/>
+                <w:szCs w:val="18"/>
+              </w:rPr>
+            </w:pPr>
+            <w:r>
+              <w:rPr>
+                <w:rFonts w:ascii="Times New Roman" w:hAnsi="Times New Roman" w:cs="Times New Roman"/>
+                <w:sz w:val="18"/>
+                <w:szCs w:val="18"/>
+              </w:rPr>
+              <w:t>False</w:t>
+            </w:r>
+          </w:p>
+        </w:tc>
+        <w:tc>
+          <w:tcPr>
+            <w:tcW w:w="0" w:type="auto"/>
+            <w:vAlign w:val="bottom"/>
+            <w:hideMark/>
+          </w:tcPr>
+          <w:p>
+            <w:pPr>
+              <w:rPr>
+                <w:rFonts w:ascii="Times New Roman" w:hAnsi="Times New Roman" w:cs="Times New Roman"/>
+                <w:sz w:val="18"/>
+                <w:szCs w:val="18"/>
+              </w:rPr>
+            </w:pPr>
+            <w:r>
+              <w:rPr>
+                <w:rFonts w:ascii="Times New Roman" w:hAnsi="Times New Roman" w:cs="Times New Roman"/>
+                <w:sz w:val="18"/>
+                <w:szCs w:val="18"/>
+              </w:rPr>
+              <w:t>False</w:t>
+            </w:r>
+          </w:p>
+        </w:tc>
+      </w:tr>
+      <w:tr>
+        <w:tc>
+          <w:tcPr>
+            <w:tcW w:w="0" w:type="auto"/>
+            <w:vAlign w:val="bottom"/>
+            <w:hideMark/>
+          </w:tcPr>
+          <w:p>
+            <w:pPr>
+              <w:rPr>
+                <w:rFonts w:ascii="Times New Roman" w:hAnsi="Times New Roman" w:cs="Times New Roman"/>
+                <w:sz w:val="18"/>
+                <w:szCs w:val="18"/>
+              </w:rPr>
+            </w:pPr>
+            <w:r>
+              <w:rPr>
+                <w:rFonts w:ascii="Times New Roman" w:hAnsi="Times New Roman" w:cs="Times New Roman"/>
+                <w:sz w:val="18"/>
+                <w:szCs w:val="18"/>
+              </w:rPr>
+              <w:t>False</w:t>
+            </w:r>
+          </w:p>
+        </w:tc>
+        <w:tc>
+          <w:tcPr>
+            <w:tcW w:w="0" w:type="auto"/>
+            <w:vAlign w:val="bottom"/>
+            <w:hideMark/>
+          </w:tcPr>
+          <w:p>
+            <w:pPr>
+              <w:rPr>
+                <w:rFonts w:ascii="Times New Roman" w:hAnsi="Times New Roman" w:cs="Times New Roman"/>
+                <w:sz w:val="18"/>
+                <w:szCs w:val="18"/>
+              </w:rPr>
+            </w:pPr>
+            <w:r>
+              <w:rPr>
+                <w:rFonts w:ascii="Times New Roman" w:hAnsi="Times New Roman" w:cs="Times New Roman"/>
+                <w:sz w:val="18"/>
+                <w:szCs w:val="18"/>
+              </w:rPr>
+              <w:t>True</w:t>
+            </w:r>
+          </w:p>
+        </w:tc>
+        <w:tc>
+          <w:tcPr>
+            <w:tcW w:w="0" w:type="auto"/>
+            <w:vAlign w:val="bottom"/>
+            <w:hideMark/>
+          </w:tcPr>
+          <w:p>
+            <w:pPr>
+              <w:rPr>
+                <w:rFonts w:ascii="Times New Roman" w:hAnsi="Times New Roman" w:cs="Times New Roman"/>
+                <w:sz w:val="18"/>
+                <w:szCs w:val="18"/>
+              </w:rPr>
+            </w:pPr>
+            <w:r>
+              <w:rPr>
+                <w:rFonts w:ascii="Times New Roman" w:hAnsi="Times New Roman" w:cs="Times New Roman"/>
+                <w:sz w:val="18"/>
+                <w:szCs w:val="18"/>
+              </w:rPr>
+              <w:t>False</w:t>
+            </w:r>
+          </w:p>
+        </w:tc>
+      </w:tr>
+      <w:tr>
+        <w:tc>
+          <w:tcPr>
+            <w:tcW w:w="0" w:type="auto"/>
+            <w:vAlign w:val="bottom"/>
+            <w:hideMark/>
+          </w:tcPr>
+          <w:p>
+            <w:pPr>
+              <w:rPr>
+                <w:rFonts w:ascii="Times New Roman" w:hAnsi="Times New Roman" w:cs="Times New Roman"/>
+                <w:sz w:val="18"/>
+                <w:szCs w:val="18"/>
+              </w:rPr>
+            </w:pPr>
+            <w:r>
+              <w:rPr>
+                <w:rFonts w:ascii="Times New Roman" w:hAnsi="Times New Roman" w:cs="Times New Roman"/>
+                <w:sz w:val="18"/>
+                <w:szCs w:val="18"/>
+              </w:rPr>
+              <w:t>False</w:t>
+            </w:r>
+          </w:p>
+        </w:tc>
+        <w:tc>
+          <w:tcPr>
+            <w:tcW w:w="0" w:type="auto"/>
+            <w:vAlign w:val="bottom"/>
+            <w:hideMark/>
+          </w:tcPr>
+          <w:p>
+            <w:pPr>
+              <w:rPr>
+                <w:rFonts w:ascii="Times New Roman" w:hAnsi="Times New Roman" w:cs="Times New Roman"/>
+                <w:sz w:val="18"/>
+                <w:szCs w:val="18"/>
+              </w:rPr>
+            </w:pPr>
+            <w:r>
+              <w:rPr>
+                <w:rFonts w:ascii="Times New Roman" w:hAnsi="Times New Roman" w:cs="Times New Roman"/>
+                <w:sz w:val="18"/>
+                <w:szCs w:val="18"/>
+              </w:rPr>
+              <w:t>False</w:t>
+            </w:r>
+          </w:p>
+        </w:tc>
+        <w:tc>
+          <w:tcPr>
+            <w:tcW w:w="0" w:type="auto"/>
+            <w:vAlign w:val="bottom"/>
+            <w:hideMark/>
+          </w:tcPr>
+          <w:p>
+            <w:pPr>
+              <w:rPr>
+                <w:rFonts w:ascii="Times New Roman" w:hAnsi="Times New Roman" w:cs="Times New Roman"/>
+                <w:sz w:val="18"/>
+                <w:szCs w:val="18"/>
+              </w:rPr>
+            </w:pPr>
+            <w:r>
+              <w:rPr>
+                <w:rFonts w:ascii="Times New Roman" w:hAnsi="Times New Roman" w:cs="Times New Roman"/>
+                <w:sz w:val="18"/>
+                <w:szCs w:val="18"/>
+              </w:rPr>
+              <w:t>False</w:t>
+            </w:r>
+          </w:p>
+        </w:tc>
+      </w:tr>
+    </w:tbl>
+    <w:p>
+      <w:pPr>
+        <w:rPr>
+          <w:rFonts w:ascii="Times New Roman" w:hAnsi="Times New Roman" w:cs="Times New Roman"/>
+          <w:sz w:val="18"/>
+          <w:szCs w:val="18"/>
+        </w:rPr>
+      </w:pPr>
+      <w:r>
+        <w:rPr>
+          <w:rFonts w:ascii="Times New Roman" w:hAnsi="Times New Roman" w:cs="Times New Roman"/>
+          <w:b/>
+          <w:bCs/>
+          <w:sz w:val="18"/>
+          <w:szCs w:val="18"/>
+        </w:rPr>
+        <w:t>Правило:</w:t>
+      </w:r>
+      <w:r>
+        <w:rPr>
+          <w:rFonts w:ascii="Times New Roman" w:hAnsi="Times New Roman" w:cs="Times New Roman"/>
+          <w:sz w:val="18"/>
+          <w:szCs w:val="18"/>
+        </w:rPr>
+        <w:t> and возвращает True </w:t>
+      </w:r>
+      <w:r>
+        <w:rPr>
+          <w:rFonts w:ascii="Times New Roman" w:hAnsi="Times New Roman" w:cs="Times New Roman"/>
+          <w:b/>
+          <w:bCs/>
+          <w:sz w:val="18"/>
+          <w:szCs w:val="18"/>
+        </w:rPr>
+        <w:t>только</w:t>
+      </w:r>
+      <w:r>
+        <w:rPr>
+          <w:rFonts w:ascii="Times New Roman" w:hAnsi="Times New Roman" w:cs="Times New Roman"/>
+          <w:sz w:val="18"/>
+          <w:szCs w:val="18"/>
+        </w:rPr>
+        <w:t> если оба значения True.</w:t>
+      </w:r>
+    </w:p>
+    <w:p>
+      <w:pPr>
+        <w:rPr>
+          <w:rFonts w:ascii="Times New Roman" w:hAnsi="Times New Roman" w:cs="Times New Roman"/>
+          <w:sz w:val="18"/>
+          <w:szCs w:val="18"/>
+        </w:rPr>
+      </w:pPr>
+    </w:p>
+    <w:p>
+      <w:pPr>
+        <w:rPr>
+          <w:rFonts w:ascii="Times New Roman" w:hAnsi="Times New Roman" w:cs="Times New Roman"/>
+          <w:b/>
+          <w:bCs/>
+          <w:color w:val="595959" w:themeColor="text1" w:themeTint="A6"/>
+          <w:sz w:val="18"/>
+          <w:szCs w:val="18"/>
+        </w:rPr>
+      </w:pPr>
+      <w:r>
+        <w:rPr>
+          <w:rFonts w:ascii="Times New Roman" w:hAnsi="Times New Roman" w:cs="Times New Roman"/>
+          <w:b/>
+          <w:bCs/>
+          <w:color w:val="595959" w:themeColor="text1" w:themeTint="A6"/>
+          <w:sz w:val="18"/>
+          <w:szCs w:val="18"/>
+        </w:rPr>
+        <w:t>2. </w:t>
+      </w:r>
+      <w:r>
+        <w:rPr>
+          <w:rFonts w:ascii="Times New Roman" w:hAnsi="Times New Roman" w:cs="Times New Roman"/>
+          <w:color w:val="595959" w:themeColor="text1" w:themeTint="A6"/>
+          <w:sz w:val="18"/>
+          <w:szCs w:val="18"/>
+        </w:rPr>
+        <w:t>or</w:t>
+      </w:r>
+      <w:r>
+        <w:rPr>
+          <w:rFonts w:ascii="Times New Roman" w:hAnsi="Times New Roman" w:cs="Times New Roman"/>
+          <w:b/>
+          <w:bCs/>
+          <w:color w:val="595959" w:themeColor="text1" w:themeTint="A6"/>
+          <w:sz w:val="18"/>
+          <w:szCs w:val="18"/>
+        </w:rPr>
+        <w:t> (ИЛИ, дизъюнкция)</w:t>
+      </w:r>
+    </w:p>
+    <w:tbl>
+      <w:tblPr>
+        <w:tblW w:w="12000" w:type="dxa"/>
+        <w:tblBorders>
+          <w:top w:val="single" w:sz="2" w:space="0" w:color="E5E7EB"/>
+          <w:left w:val="single" w:sz="2" w:space="0" w:color="E5E7EB"/>
+          <w:bottom w:val="single" w:sz="2" w:space="0" w:color="E5E7EB"/>
+          <w:right w:val="single" w:sz="2" w:space="0" w:color="E5E7EB"/>
+          <w:insideH w:val="single" w:sz="4" w:space="0" w:color="auto"/>
+          <w:insideV w:val="single" w:sz="4" w:space="0" w:color="auto"/>
+        </w:tblBorders>
+        <w:tblCellMar>
+          <w:top w:w="15" w:type="dxa"/>
+          <w:left w:w="15" w:type="dxa"/>
+          <w:bottom w:w="15" w:type="dxa"/>
+          <w:right w:w="15" w:type="dxa"/>
+        </w:tblCellMar>
+        <w:tblLook w:val="04A0" w:firstRow="1" w:lastRow="0" w:firstColumn="1" w:lastColumn="0" w:noHBand="0" w:noVBand="1"/>
+      </w:tblPr>
+      <w:tblGrid>
+        <w:gridCol w:w="3617"/>
+        <w:gridCol w:w="3618"/>
+        <w:gridCol w:w="4765"/>
+      </w:tblGrid>
+      <w:tr>
+        <w:trPr>
+          <w:tblHeader/>
+        </w:trPr>
+        <w:tc>
+          <w:tcPr>
+            <w:tcW w:w="0" w:type="auto"/>
+            <w:noWrap/>
+            <w:vAlign w:val="bottom"/>
+            <w:hideMark/>
+          </w:tcPr>
+          <w:p>
+            <w:pPr>
+              <w:rPr>
+                <w:rFonts w:ascii="Times New Roman" w:hAnsi="Times New Roman" w:cs="Times New Roman"/>
+                <w:b/>
+                <w:bCs/>
+                <w:sz w:val="18"/>
+                <w:szCs w:val="18"/>
+              </w:rPr>
+            </w:pPr>
+            <w:r>
+              <w:rPr>
+                <w:rFonts w:ascii="Times New Roman" w:hAnsi="Times New Roman" w:cs="Times New Roman"/>
+                <w:b/>
+                <w:bCs/>
+                <w:sz w:val="18"/>
+                <w:szCs w:val="18"/>
+              </w:rPr>
+              <w:t>A</w:t>
+            </w:r>
+          </w:p>
+        </w:tc>
+        <w:tc>
+          <w:tcPr>
+            <w:tcW w:w="0" w:type="auto"/>
+            <w:noWrap/>
+            <w:vAlign w:val="bottom"/>
+            <w:hideMark/>
+          </w:tcPr>
+          <w:p>
+            <w:pPr>
+              <w:rPr>
+                <w:rFonts w:ascii="Times New Roman" w:hAnsi="Times New Roman" w:cs="Times New Roman"/>
+                <w:b/>
+                <w:bCs/>
+                <w:sz w:val="18"/>
+                <w:szCs w:val="18"/>
+              </w:rPr>
+            </w:pPr>
+            <w:r>
+              <w:rPr>
+                <w:rFonts w:ascii="Times New Roman" w:hAnsi="Times New Roman" w:cs="Times New Roman"/>
+                <w:b/>
+                <w:bCs/>
+                <w:sz w:val="18"/>
+                <w:szCs w:val="18"/>
+              </w:rPr>
+              <w:t>B</w:t>
+            </w:r>
+          </w:p>
+        </w:tc>
+        <w:tc>
+          <w:tcPr>
+            <w:tcW w:w="0" w:type="auto"/>
+            <w:noWrap/>
+            <w:vAlign w:val="bottom"/>
+            <w:hideMark/>
+          </w:tcPr>
+          <w:p>
+            <w:pPr>
+              <w:rPr>
+                <w:rFonts w:ascii="Times New Roman" w:hAnsi="Times New Roman" w:cs="Times New Roman"/>
+                <w:b/>
+                <w:bCs/>
+                <w:sz w:val="18"/>
+                <w:szCs w:val="18"/>
+              </w:rPr>
+            </w:pPr>
+            <w:r>
+              <w:rPr>
+                <w:rFonts w:ascii="Times New Roman" w:hAnsi="Times New Roman" w:cs="Times New Roman"/>
+                <w:b/>
+                <w:bCs/>
+                <w:sz w:val="18"/>
+                <w:szCs w:val="18"/>
+              </w:rPr>
+              <w:t>A or B</w:t>
+            </w:r>
+          </w:p>
+        </w:tc>
+      </w:tr>
+      <w:tr>
+        <w:tc>
+          <w:tcPr>
+            <w:tcW w:w="0" w:type="auto"/>
+            <w:vAlign w:val="bottom"/>
+            <w:hideMark/>
+          </w:tcPr>
+          <w:p>
+            <w:pPr>
+              <w:rPr>
+                <w:rFonts w:ascii="Times New Roman" w:hAnsi="Times New Roman" w:cs="Times New Roman"/>
+                <w:sz w:val="18"/>
+                <w:szCs w:val="18"/>
+              </w:rPr>
+            </w:pPr>
+            <w:r>
+              <w:rPr>
+                <w:rFonts w:ascii="Times New Roman" w:hAnsi="Times New Roman" w:cs="Times New Roman"/>
+                <w:sz w:val="18"/>
+                <w:szCs w:val="18"/>
+              </w:rPr>
+              <w:t>True</w:t>
+            </w:r>
+          </w:p>
+        </w:tc>
+        <w:tc>
+          <w:tcPr>
+            <w:tcW w:w="0" w:type="auto"/>
+            <w:vAlign w:val="bottom"/>
+            <w:hideMark/>
+          </w:tcPr>
+          <w:p>
+            <w:pPr>
+              <w:rPr>
+                <w:rFonts w:ascii="Times New Roman" w:hAnsi="Times New Roman" w:cs="Times New Roman"/>
+                <w:sz w:val="18"/>
+                <w:szCs w:val="18"/>
+              </w:rPr>
+            </w:pPr>
+            <w:r>
+              <w:rPr>
+                <w:rFonts w:ascii="Times New Roman" w:hAnsi="Times New Roman" w:cs="Times New Roman"/>
+                <w:sz w:val="18"/>
+                <w:szCs w:val="18"/>
+              </w:rPr>
+              <w:t>True</w:t>
+            </w:r>
+          </w:p>
+        </w:tc>
+        <w:tc>
+          <w:tcPr>
+            <w:tcW w:w="0" w:type="auto"/>
+            <w:vAlign w:val="bottom"/>
+            <w:hideMark/>
+          </w:tcPr>
+          <w:p>
+            <w:pPr>
+              <w:rPr>
+                <w:rFonts w:ascii="Times New Roman" w:hAnsi="Times New Roman" w:cs="Times New Roman"/>
+                <w:sz w:val="18"/>
+                <w:szCs w:val="18"/>
+              </w:rPr>
+            </w:pPr>
+            <w:r>
+              <w:rPr>
+                <w:rFonts w:ascii="Times New Roman" w:hAnsi="Times New Roman" w:cs="Times New Roman"/>
+                <w:b/>
+                <w:bCs/>
+                <w:sz w:val="18"/>
+                <w:szCs w:val="18"/>
+              </w:rPr>
+              <w:t>True</w:t>
+            </w:r>
+          </w:p>
+        </w:tc>
+      </w:tr>
+      <w:tr>
+        <w:tc>
+          <w:tcPr>
+            <w:tcW w:w="0" w:type="auto"/>
+            <w:vAlign w:val="bottom"/>
+            <w:hideMark/>
+          </w:tcPr>
+          <w:p>
+            <w:pPr>
+              <w:rPr>
+                <w:rFonts w:ascii="Times New Roman" w:hAnsi="Times New Roman" w:cs="Times New Roman"/>
+                <w:sz w:val="18"/>
+                <w:szCs w:val="18"/>
+              </w:rPr>
+            </w:pPr>
+            <w:r>
+              <w:rPr>
+                <w:rFonts w:ascii="Times New Roman" w:hAnsi="Times New Roman" w:cs="Times New Roman"/>
+                <w:sz w:val="18"/>
+                <w:szCs w:val="18"/>
+              </w:rPr>
+              <w:t>True</w:t>
+            </w:r>
+          </w:p>
+        </w:tc>
+        <w:tc>
+          <w:tcPr>
+            <w:tcW w:w="0" w:type="auto"/>
+            <w:vAlign w:val="bottom"/>
+            <w:hideMark/>
+          </w:tcPr>
+          <w:p>
+            <w:pPr>
+              <w:rPr>
+                <w:rFonts w:ascii="Times New Roman" w:hAnsi="Times New Roman" w:cs="Times New Roman"/>
+                <w:sz w:val="18"/>
+                <w:szCs w:val="18"/>
+              </w:rPr>
+            </w:pPr>
+            <w:r>
+              <w:rPr>
+                <w:rFonts w:ascii="Times New Roman" w:hAnsi="Times New Roman" w:cs="Times New Roman"/>
+                <w:sz w:val="18"/>
+                <w:szCs w:val="18"/>
+              </w:rPr>
+              <w:t>False</w:t>
+            </w:r>
+          </w:p>
+        </w:tc>
+        <w:tc>
+          <w:tcPr>
+            <w:tcW w:w="0" w:type="auto"/>
+            <w:vAlign w:val="bottom"/>
+            <w:hideMark/>
+          </w:tcPr>
+          <w:p>
+            <w:pPr>
+              <w:rPr>
+                <w:rFonts w:ascii="Times New Roman" w:hAnsi="Times New Roman" w:cs="Times New Roman"/>
+                <w:sz w:val="18"/>
+                <w:szCs w:val="18"/>
+              </w:rPr>
+            </w:pPr>
+            <w:r>
+              <w:rPr>
+                <w:rFonts w:ascii="Times New Roman" w:hAnsi="Times New Roman" w:cs="Times New Roman"/>
+                <w:b/>
+                <w:bCs/>
+                <w:sz w:val="18"/>
+                <w:szCs w:val="18"/>
+              </w:rPr>
+              <w:t>True</w:t>
+            </w:r>
+          </w:p>
+        </w:tc>
+      </w:tr>
+      <w:tr>
+        <w:tc>
+          <w:tcPr>
+            <w:tcW w:w="0" w:type="auto"/>
+            <w:vAlign w:val="bottom"/>
+            <w:hideMark/>
+          </w:tcPr>
+          <w:p>
+            <w:pPr>
+              <w:rPr>
+                <w:rFonts w:ascii="Times New Roman" w:hAnsi="Times New Roman" w:cs="Times New Roman"/>
+                <w:sz w:val="18"/>
+                <w:szCs w:val="18"/>
+              </w:rPr>
+            </w:pPr>
+            <w:r>
+              <w:rPr>
+                <w:rFonts w:ascii="Times New Roman" w:hAnsi="Times New Roman" w:cs="Times New Roman"/>
+                <w:sz w:val="18"/>
+                <w:szCs w:val="18"/>
+              </w:rPr>
+              <w:t>False</w:t>
+            </w:r>
+          </w:p>
+        </w:tc>
+        <w:tc>
+          <w:tcPr>
+            <w:tcW w:w="0" w:type="auto"/>
+            <w:vAlign w:val="bottom"/>
+            <w:hideMark/>
+          </w:tcPr>
+          <w:p>
+            <w:pPr>
+              <w:rPr>
+                <w:rFonts w:ascii="Times New Roman" w:hAnsi="Times New Roman" w:cs="Times New Roman"/>
+                <w:sz w:val="18"/>
+                <w:szCs w:val="18"/>
+              </w:rPr>
+            </w:pPr>
+            <w:r>
+              <w:rPr>
+                <w:rFonts w:ascii="Times New Roman" w:hAnsi="Times New Roman" w:cs="Times New Roman"/>
+                <w:sz w:val="18"/>
+                <w:szCs w:val="18"/>
+              </w:rPr>
+              <w:t>True</w:t>
+            </w:r>
+          </w:p>
+        </w:tc>
+        <w:tc>
+          <w:tcPr>
+            <w:tcW w:w="0" w:type="auto"/>
+            <w:vAlign w:val="bottom"/>
+            <w:hideMark/>
+          </w:tcPr>
+          <w:p>
+            <w:pPr>
+              <w:rPr>
+                <w:rFonts w:ascii="Times New Roman" w:hAnsi="Times New Roman" w:cs="Times New Roman"/>
+                <w:sz w:val="18"/>
+                <w:szCs w:val="18"/>
+              </w:rPr>
+            </w:pPr>
+            <w:r>
+              <w:rPr>
+                <w:rFonts w:ascii="Times New Roman" w:hAnsi="Times New Roman" w:cs="Times New Roman"/>
+                <w:b/>
+                <w:bCs/>
+                <w:sz w:val="18"/>
+                <w:szCs w:val="18"/>
+              </w:rPr>
+              <w:t>True</w:t>
+            </w:r>
+          </w:p>
+        </w:tc>
+      </w:tr>
+      <w:tr>
+        <w:tc>
+          <w:tcPr>
+            <w:tcW w:w="0" w:type="auto"/>
+            <w:vAlign w:val="bottom"/>
+            <w:hideMark/>
+          </w:tcPr>
+          <w:p>
+            <w:pPr>
+              <w:rPr>
+                <w:rFonts w:ascii="Times New Roman" w:hAnsi="Times New Roman" w:cs="Times New Roman"/>
+                <w:sz w:val="18"/>
+                <w:szCs w:val="18"/>
+              </w:rPr>
+            </w:pPr>
+            <w:r>
+              <w:rPr>
+                <w:rFonts w:ascii="Times New Roman" w:hAnsi="Times New Roman" w:cs="Times New Roman"/>
+                <w:sz w:val="18"/>
+                <w:szCs w:val="18"/>
+              </w:rPr>
+              <w:t>False</w:t>
+            </w:r>
+          </w:p>
+        </w:tc>
+        <w:tc>
+          <w:tcPr>
+            <w:tcW w:w="0" w:type="auto"/>
+            <w:vAlign w:val="bottom"/>
+            <w:hideMark/>
+          </w:tcPr>
+          <w:p>
+            <w:pPr>
+              <w:rPr>
+                <w:rFonts w:ascii="Times New Roman" w:hAnsi="Times New Roman" w:cs="Times New Roman"/>
+                <w:sz w:val="18"/>
+                <w:szCs w:val="18"/>
+              </w:rPr>
+            </w:pPr>
+            <w:r>
+              <w:rPr>
+                <w:rFonts w:ascii="Times New Roman" w:hAnsi="Times New Roman" w:cs="Times New Roman"/>
+                <w:sz w:val="18"/>
+                <w:szCs w:val="18"/>
+              </w:rPr>
+              <w:t>False</w:t>
+            </w:r>
+          </w:p>
+        </w:tc>
+        <w:tc>
+          <w:tcPr>
+            <w:tcW w:w="0" w:type="auto"/>
+            <w:vAlign w:val="bottom"/>
+            <w:hideMark/>
+          </w:tcPr>
+          <w:p>
+            <w:pPr>
+              <w:rPr>
+                <w:rFonts w:ascii="Times New Roman" w:hAnsi="Times New Roman" w:cs="Times New Roman"/>
+                <w:sz w:val="18"/>
+                <w:szCs w:val="18"/>
+              </w:rPr>
+            </w:pPr>
+            <w:r>
+              <w:rPr>
+                <w:rFonts w:ascii="Times New Roman" w:hAnsi="Times New Roman" w:cs="Times New Roman"/>
+                <w:sz w:val="18"/>
+                <w:szCs w:val="18"/>
+              </w:rPr>
+              <w:t>False</w:t>
+            </w:r>
+          </w:p>
+        </w:tc>
+      </w:tr>
+    </w:tbl>
+    <w:p>
+      <w:pPr>
+        <w:rPr>
+          <w:rFonts w:ascii="Times New Roman" w:hAnsi="Times New Roman" w:cs="Times New Roman"/>
+          <w:sz w:val="18"/>
+          <w:szCs w:val="18"/>
+        </w:rPr>
+      </w:pPr>
+      <w:r>
+        <w:rPr>
+          <w:rFonts w:ascii="Times New Roman" w:hAnsi="Times New Roman" w:cs="Times New Roman"/>
+          <w:b/>
+          <w:bCs/>
+          <w:sz w:val="18"/>
+          <w:szCs w:val="18"/>
+        </w:rPr>
+        <w:t>Правило:</w:t>
+      </w:r>
+      <w:r>
+        <w:rPr>
+          <w:rFonts w:ascii="Times New Roman" w:hAnsi="Times New Roman" w:cs="Times New Roman"/>
+          <w:sz w:val="18"/>
+          <w:szCs w:val="18"/>
+        </w:rPr>
+        <w:t> or возвращает True, если </w:t>
+      </w:r>
+      <w:r>
+        <w:rPr>
+          <w:rFonts w:ascii="Times New Roman" w:hAnsi="Times New Roman" w:cs="Times New Roman"/>
+          <w:b/>
+          <w:bCs/>
+          <w:sz w:val="18"/>
+          <w:szCs w:val="18"/>
+        </w:rPr>
+        <w:t>хотя бы одно</w:t>
+      </w:r>
+      <w:r>
+        <w:rPr>
+          <w:rFonts w:ascii="Times New Roman" w:hAnsi="Times New Roman" w:cs="Times New Roman"/>
+          <w:sz w:val="18"/>
+          <w:szCs w:val="18"/>
+        </w:rPr>
+        <w:t> значение True</w:t>
+      </w:r>
+    </w:p>
+    <w:p>
+      <w:pPr>
+        <w:rPr>
+          <w:rFonts w:ascii="Times New Roman" w:hAnsi="Times New Roman" w:cs="Times New Roman"/>
+          <w:sz w:val="18"/>
+          <w:szCs w:val="18"/>
+        </w:rPr>
+      </w:pPr>
+    </w:p>
+    <w:p>
+      <w:pPr>
+        <w:rPr>
+          <w:rFonts w:ascii="Times New Roman" w:hAnsi="Times New Roman" w:cs="Times New Roman"/>
+          <w:b/>
+          <w:bCs/>
+          <w:sz w:val="18"/>
+          <w:szCs w:val="18"/>
+        </w:rPr>
+      </w:pPr>
+      <w:r>
+        <w:rPr>
+          <w:rFonts w:ascii="Times New Roman" w:hAnsi="Times New Roman" w:cs="Times New Roman"/>
+          <w:b/>
+          <w:bCs/>
+          <w:sz w:val="18"/>
+          <w:szCs w:val="18"/>
+        </w:rPr>
+        <w:t>3. </w:t>
+      </w:r>
+      <w:r>
+        <w:rPr>
+          <w:rFonts w:ascii="Times New Roman" w:hAnsi="Times New Roman" w:cs="Times New Roman"/>
+          <w:sz w:val="18"/>
+          <w:szCs w:val="18"/>
+        </w:rPr>
+        <w:t>not</w:t>
+      </w:r>
+      <w:r>
+        <w:rPr>
+          <w:rFonts w:ascii="Times New Roman" w:hAnsi="Times New Roman" w:cs="Times New Roman"/>
+          <w:b/>
+          <w:bCs/>
+          <w:sz w:val="18"/>
+          <w:szCs w:val="18"/>
+        </w:rPr>
+        <w:t> (НЕ, отрицание)</w:t>
+      </w:r>
+    </w:p>
+    <w:tbl>
+      <w:tblPr>
+        <w:tblW w:w="12000" w:type="dxa"/>
+        <w:tblBorders>
+          <w:top w:val="single" w:sz="2" w:space="0" w:color="E5E7EB"/>
+          <w:left w:val="single" w:sz="2" w:space="0" w:color="E5E7EB"/>
+          <w:bottom w:val="single" w:sz="2" w:space="0" w:color="E5E7EB"/>
+          <w:right w:val="single" w:sz="2" w:space="0" w:color="E5E7EB"/>
+          <w:insideH w:val="single" w:sz="4" w:space="0" w:color="auto"/>
+          <w:insideV w:val="single" w:sz="4" w:space="0" w:color="auto"/>
+        </w:tblBorders>
+        <w:tblCellMar>
+          <w:top w:w="15" w:type="dxa"/>
+          <w:left w:w="15" w:type="dxa"/>
+          <w:bottom w:w="15" w:type="dxa"/>
+          <w:right w:w="15" w:type="dxa"/>
+        </w:tblCellMar>
+        <w:tblLook w:val="04A0" w:firstRow="1" w:lastRow="0" w:firstColumn="1" w:lastColumn="0" w:noHBand="0" w:noVBand="1"/>
+      </w:tblPr>
+      <w:tblGrid>
+        <w:gridCol w:w="5681"/>
+        <w:gridCol w:w="6319"/>
+      </w:tblGrid>
+      <w:tr>
+        <w:trPr>
+          <w:tblHeader/>
+        </w:trPr>
+        <w:tc>
+          <w:tcPr>
+            <w:tcW w:w="0" w:type="auto"/>
+            <w:noWrap/>
+            <w:vAlign w:val="bottom"/>
+            <w:hideMark/>
+          </w:tcPr>
+          <w:p>
+            <w:pPr>
+              <w:rPr>
+                <w:rFonts w:ascii="Times New Roman" w:hAnsi="Times New Roman" w:cs="Times New Roman"/>
+                <w:b/>
+                <w:bCs/>
+                <w:sz w:val="18"/>
+                <w:szCs w:val="18"/>
+              </w:rPr>
+            </w:pPr>
+            <w:r>
+              <w:rPr>
+                <w:rFonts w:ascii="Times New Roman" w:hAnsi="Times New Roman" w:cs="Times New Roman"/>
+                <w:b/>
+                <w:bCs/>
+                <w:sz w:val="18"/>
+                <w:szCs w:val="18"/>
+              </w:rPr>
+              <w:t>A</w:t>
+            </w:r>
+          </w:p>
+        </w:tc>
+        <w:tc>
+          <w:tcPr>
+            <w:tcW w:w="0" w:type="auto"/>
+            <w:noWrap/>
+            <w:vAlign w:val="bottom"/>
+            <w:hideMark/>
+          </w:tcPr>
+          <w:p>
+            <w:pPr>
+              <w:rPr>
+                <w:rFonts w:ascii="Times New Roman" w:hAnsi="Times New Roman" w:cs="Times New Roman"/>
+                <w:b/>
+                <w:bCs/>
+                <w:sz w:val="18"/>
+                <w:szCs w:val="18"/>
+              </w:rPr>
+            </w:pPr>
+            <w:r>
+              <w:rPr>
+                <w:rFonts w:ascii="Times New Roman" w:hAnsi="Times New Roman" w:cs="Times New Roman"/>
+                <w:b/>
+                <w:bCs/>
+                <w:sz w:val="18"/>
+                <w:szCs w:val="18"/>
+              </w:rPr>
+              <w:t>not A</w:t>
+            </w:r>
+          </w:p>
+        </w:tc>
+      </w:tr>
+      <w:tr>
+        <w:tc>
+          <w:tcPr>
+            <w:tcW w:w="0" w:type="auto"/>
+            <w:vAlign w:val="bottom"/>
+            <w:hideMark/>
+          </w:tcPr>
+          <w:p>
+            <w:pPr>
+              <w:rPr>
+                <w:rFonts w:ascii="Times New Roman" w:hAnsi="Times New Roman" w:cs="Times New Roman"/>
+                <w:sz w:val="18"/>
+                <w:szCs w:val="18"/>
+              </w:rPr>
+            </w:pPr>
+            <w:r>
+              <w:rPr>
+                <w:rFonts w:ascii="Times New Roman" w:hAnsi="Times New Roman" w:cs="Times New Roman"/>
+                <w:sz w:val="18"/>
+                <w:szCs w:val="18"/>
+              </w:rPr>
+              <w:t>True</w:t>
+            </w:r>
+          </w:p>
+        </w:tc>
+        <w:tc>
+          <w:tcPr>
+            <w:tcW w:w="0" w:type="auto"/>
+            <w:vAlign w:val="bottom"/>
+            <w:hideMark/>
+          </w:tcPr>
+          <w:p>
+            <w:pPr>
+              <w:rPr>
+                <w:rFonts w:ascii="Times New Roman" w:hAnsi="Times New Roman" w:cs="Times New Roman"/>
+                <w:sz w:val="18"/>
+                <w:szCs w:val="18"/>
+              </w:rPr>
+            </w:pPr>
+            <w:r>
+              <w:rPr>
+                <w:rFonts w:ascii="Times New Roman" w:hAnsi="Times New Roman" w:cs="Times New Roman"/>
+                <w:b/>
+                <w:bCs/>
+                <w:sz w:val="18"/>
+                <w:szCs w:val="18"/>
+              </w:rPr>
+              <w:t>False</w:t>
+            </w:r>
+          </w:p>
+        </w:tc>
+      </w:tr>
+      <w:tr>
+        <w:tc>
+          <w:tcPr>
+            <w:tcW w:w="0" w:type="auto"/>
+            <w:vAlign w:val="bottom"/>
+            <w:hideMark/>
+          </w:tcPr>
+          <w:p>
+            <w:pPr>
+              <w:rPr>
+                <w:rFonts w:ascii="Times New Roman" w:hAnsi="Times New Roman" w:cs="Times New Roman"/>
+                <w:sz w:val="18"/>
+                <w:szCs w:val="18"/>
+              </w:rPr>
+            </w:pPr>
+            <w:r>
+              <w:rPr>
+                <w:rFonts w:ascii="Times New Roman" w:hAnsi="Times New Roman" w:cs="Times New Roman"/>
+                <w:sz w:val="18"/>
+                <w:szCs w:val="18"/>
+              </w:rPr>
+              <w:t>False</w:t>
+            </w:r>
+          </w:p>
+        </w:tc>
+        <w:tc>
+          <w:tcPr>
+            <w:tcW w:w="0" w:type="auto"/>
+            <w:vAlign w:val="bottom"/>
+            <w:hideMark/>
+          </w:tcPr>
+          <w:p>
+            <w:pPr>
+              <w:rPr>
+                <w:rFonts w:ascii="Times New Roman" w:hAnsi="Times New Roman" w:cs="Times New Roman"/>
+                <w:sz w:val="18"/>
+                <w:szCs w:val="18"/>
+              </w:rPr>
+            </w:pPr>
+            <w:r>
+              <w:rPr>
+                <w:rFonts w:ascii="Times New Roman" w:hAnsi="Times New Roman" w:cs="Times New Roman"/>
+                <w:b/>
+                <w:bCs/>
+                <w:sz w:val="18"/>
+                <w:szCs w:val="18"/>
+              </w:rPr>
+              <w:t>True</w:t>
+            </w:r>
+          </w:p>
+        </w:tc>
+      </w:tr>
+    </w:tbl>
+    <w:p>
+      <w:pPr>
+        <w:rPr>
+          <w:rFonts w:ascii="Times New Roman" w:hAnsi="Times New Roman" w:cs="Times New Roman"/>
+          <w:sz w:val="18"/>
+          <w:szCs w:val="18"/>
+          <w:lang w:val="en-US"/>
+        </w:rPr>
+      </w:pPr>
+      <w:r>
+        <w:rPr>
+          <w:rFonts w:ascii="Times New Roman" w:hAnsi="Times New Roman" w:cs="Times New Roman"/>
+          <w:b/>
+          <w:bCs/>
+          <w:sz w:val="18"/>
+          <w:szCs w:val="18"/>
+        </w:rPr>
+        <w:t>Правило:</w:t>
+      </w:r>
+      <w:r>
+        <w:rPr>
+          <w:rFonts w:ascii="Times New Roman" w:hAnsi="Times New Roman" w:cs="Times New Roman"/>
+          <w:sz w:val="18"/>
+          <w:szCs w:val="18"/>
+        </w:rPr>
+        <w:t> not просто инвертирует значение (True → False, False → True).</w:t>
+      </w:r>
+    </w:p>
+    <w:p>
+      <w:pPr>
+        <w:rPr>
+          <w:rFonts w:ascii="Times New Roman" w:hAnsi="Times New Roman" w:cs="Times New Roman"/>
+          <w:sz w:val="18"/>
+          <w:szCs w:val="18"/>
+          <w:lang w:val="en-US"/>
+        </w:rPr>
+      </w:pPr>
+      <w:r>
+        <w:rPr>
+          <w:noProof/>
+        </w:rPr>
+        <w:drawing>
+          <wp:inline distT="0" distB="0" distL="0" distR="0" wp14:anchorId="3F7DFB8F" wp14:editId="5F286B79">
+            <wp:extent cx="3409524" cy="1571429"/>
+            <wp:effectExtent l="0" t="0" r="635" b="0"/>
+            <wp:docPr id="1724582113" name="Рисунок 1"/>
+            <wp:cNvGraphicFramePr>
+              <a:graphicFrameLocks xmlns:a="http://schemas.openxmlformats.org/drawingml/2006/main" noChangeAspect="1"/>
+            </wp:cNvGraphicFramePr>
+            <a:graphic xmlns:a="http://schemas.openxmlformats.org/drawingml/2006/main">
+              <a:graphicData uri="http://schemas.openxmlformats.org/drawingml/2006/picture">
+                <pic:pic xmlns:pic="http://schemas.openxmlformats.org/drawingml/2006/picture">
+                  <pic:nvPicPr>
+                    <pic:cNvPr id="1724582113" name=""/>
+                    <pic:cNvPicPr/>
+                  </pic:nvPicPr>
+                  <pic:blipFill>
+                    <a:blip r:embed="rId42"/>
+                    <a:stretch>
+                      <a:fillRect/>
+                    </a:stretch>
+                  </pic:blipFill>
+                  <pic:spPr>
+                    <a:xfrm>
+                      <a:off x="0" y="0"/>
+                      <a:ext cx="3409524" cy="1571429"/>
+                    </a:xfrm>
+                    <a:prstGeom prst="rect">
+                      <a:avLst/>
+                    </a:prstGeom>
+                  </pic:spPr>
+                </pic:pic>
+              </a:graphicData>
+            </a:graphic>
+          </wp:inline>
+        </w:drawing>
+      </w:r>
+    </w:p>
+    <w:p>
+      <w:pPr>
+        <w:rPr>
+          <w:rFonts w:ascii="Times New Roman" w:hAnsi="Times New Roman" w:cs="Times New Roman"/>
+          <w:sz w:val="18"/>
+          <w:szCs w:val="18"/>
+        </w:rPr>
+      </w:pPr>
+    </w:p>
+    <w:p>
+      <w:pPr>
+        <w:rPr>
+          <w:rFonts w:ascii="Times New Roman" w:hAnsi="Times New Roman" w:cs="Times New Roman"/>
+          <w:b/>
+          <w:bCs/>
+          <w:sz w:val="18"/>
+          <w:szCs w:val="18"/>
+        </w:rPr>
+      </w:pPr>
+      <w:r>
+        <w:rPr>
+          <w:rFonts w:ascii="Times New Roman" w:hAnsi="Times New Roman" w:cs="Times New Roman"/>
+          <w:b/>
+          <w:bCs/>
+          <w:sz w:val="18"/>
+          <w:szCs w:val="18"/>
+        </w:rPr>
+        <w:t>Дополнительно: XOR (исключающее ИЛИ)</w:t>
+      </w:r>
+    </w:p>
+    <w:p>
+      <w:pPr>
+        <w:rPr>
+          <w:rFonts w:ascii="Times New Roman" w:hAnsi="Times New Roman" w:cs="Times New Roman"/>
+          <w:sz w:val="18"/>
+          <w:szCs w:val="18"/>
+        </w:rPr>
+      </w:pPr>
+      <w:r>
+        <w:rPr>
+          <w:rFonts w:ascii="Times New Roman" w:hAnsi="Times New Roman" w:cs="Times New Roman"/>
+          <w:sz w:val="18"/>
+          <w:szCs w:val="18"/>
+        </w:rPr>
+        <w:t xml:space="preserve">В Python можно </w:t>
+      </w:r>
+      <w:r>
+        <w:rPr>
+          <w:rFonts w:ascii="Times New Roman" w:hAnsi="Times New Roman" w:cs="Times New Roman"/>
+          <w:sz w:val="18"/>
+          <w:szCs w:val="18"/>
+        </w:rPr>
+        <w:t>использовать! =</w:t>
+      </w:r>
+      <w:r>
+        <w:rPr>
+          <w:rFonts w:ascii="Times New Roman" w:hAnsi="Times New Roman" w:cs="Times New Roman"/>
+          <w:sz w:val="18"/>
+          <w:szCs w:val="18"/>
+        </w:rPr>
+        <w:t> или оператор ^ для булевых значений.</w:t>
+      </w:r>
+    </w:p>
+    <w:tbl>
+      <w:tblPr>
+        <w:tblW w:w="12000" w:type="dxa"/>
+        <w:tblBorders>
+          <w:top w:val="single" w:sz="2" w:space="0" w:color="E5E7EB"/>
+          <w:left w:val="single" w:sz="2" w:space="0" w:color="E5E7EB"/>
+          <w:bottom w:val="single" w:sz="2" w:space="0" w:color="E5E7EB"/>
+          <w:right w:val="single" w:sz="2" w:space="0" w:color="E5E7EB"/>
+          <w:insideH w:val="single" w:sz="4" w:space="0" w:color="auto"/>
+          <w:insideV w:val="single" w:sz="4" w:space="0" w:color="auto"/>
+        </w:tblBorders>
+        <w:tblCellMar>
+          <w:top w:w="15" w:type="dxa"/>
+          <w:left w:w="15" w:type="dxa"/>
+          <w:bottom w:w="15" w:type="dxa"/>
+          <w:right w:w="15" w:type="dxa"/>
+        </w:tblCellMar>
+        <w:tblLook w:val="04A0" w:firstRow="1" w:lastRow="0" w:firstColumn="1" w:lastColumn="0" w:noHBand="0" w:noVBand="1"/>
+      </w:tblPr>
+      <w:tblGrid>
+        <w:gridCol w:w="2317"/>
+        <w:gridCol w:w="2316"/>
+        <w:gridCol w:w="4356"/>
+        <w:gridCol w:w="3011"/>
+      </w:tblGrid>
+      <w:tr>
+        <w:trPr>
+          <w:tblHeader/>
+        </w:trPr>
+        <w:tc>
+          <w:tcPr>
+            <w:tcW w:w="0" w:type="auto"/>
+            <w:noWrap/>
+            <w:vAlign w:val="bottom"/>
+            <w:hideMark/>
+          </w:tcPr>
+          <w:p>
+            <w:pPr>
+              <w:rPr>
+                <w:rFonts w:ascii="Times New Roman" w:hAnsi="Times New Roman" w:cs="Times New Roman"/>
+                <w:b/>
+                <w:bCs/>
+                <w:sz w:val="18"/>
+                <w:szCs w:val="18"/>
+              </w:rPr>
+            </w:pPr>
+            <w:r>
+              <w:rPr>
+                <w:rFonts w:ascii="Times New Roman" w:hAnsi="Times New Roman" w:cs="Times New Roman"/>
+                <w:b/>
+                <w:bCs/>
+                <w:sz w:val="18"/>
+                <w:szCs w:val="18"/>
+              </w:rPr>
+              <w:t>A</w:t>
+            </w:r>
+          </w:p>
+        </w:tc>
+        <w:tc>
+          <w:tcPr>
+            <w:tcW w:w="0" w:type="auto"/>
+            <w:noWrap/>
+            <w:vAlign w:val="bottom"/>
+            <w:hideMark/>
+          </w:tcPr>
+          <w:p>
+            <w:pPr>
+              <w:rPr>
+                <w:rFonts w:ascii="Times New Roman" w:hAnsi="Times New Roman" w:cs="Times New Roman"/>
+                <w:b/>
+                <w:bCs/>
+                <w:sz w:val="18"/>
+                <w:szCs w:val="18"/>
+              </w:rPr>
+            </w:pPr>
+            <w:r>
+              <w:rPr>
+                <w:rFonts w:ascii="Times New Roman" w:hAnsi="Times New Roman" w:cs="Times New Roman"/>
+                <w:b/>
+                <w:bCs/>
+                <w:sz w:val="18"/>
+                <w:szCs w:val="18"/>
+              </w:rPr>
+              <w:t>B</w:t>
+            </w:r>
+          </w:p>
+        </w:tc>
+        <w:tc>
+          <w:tcPr>
+            <w:tcW w:w="0" w:type="auto"/>
+            <w:noWrap/>
+            <w:vAlign w:val="bottom"/>
+            <w:hideMark/>
+          </w:tcPr>
+          <w:p>
+            <w:pPr>
+              <w:rPr>
+                <w:rFonts w:ascii="Times New Roman" w:hAnsi="Times New Roman" w:cs="Times New Roman"/>
+                <w:b/>
+                <w:bCs/>
+                <w:sz w:val="18"/>
+                <w:szCs w:val="18"/>
+              </w:rPr>
+            </w:pPr>
+            <w:r>
+              <w:rPr>
+                <w:rFonts w:ascii="Times New Roman" w:hAnsi="Times New Roman" w:cs="Times New Roman"/>
+                <w:b/>
+                <w:bCs/>
+                <w:sz w:val="18"/>
+                <w:szCs w:val="18"/>
+              </w:rPr>
+              <w:t>A XOR B</w:t>
+            </w:r>
+          </w:p>
+        </w:tc>
+        <w:tc>
+          <w:tcPr>
+            <w:tcW w:w="0" w:type="auto"/>
+            <w:noWrap/>
+            <w:vAlign w:val="bottom"/>
+            <w:hideMark/>
+          </w:tcPr>
+          <w:p>
+            <w:pPr>
+              <w:rPr>
+                <w:rFonts w:ascii="Times New Roman" w:hAnsi="Times New Roman" w:cs="Times New Roman"/>
+                <w:b/>
+                <w:bCs/>
+                <w:sz w:val="18"/>
+                <w:szCs w:val="18"/>
+              </w:rPr>
+            </w:pPr>
+            <w:r>
+              <w:rPr>
+                <w:rFonts w:ascii="Times New Roman" w:hAnsi="Times New Roman" w:cs="Times New Roman"/>
+                <w:b/>
+                <w:bCs/>
+                <w:sz w:val="18"/>
+                <w:szCs w:val="18"/>
+              </w:rPr>
+              <w:t>A! =</w:t>
+            </w:r>
+            <w:r>
+              <w:rPr>
+                <w:rFonts w:ascii="Times New Roman" w:hAnsi="Times New Roman" w:cs="Times New Roman"/>
+                <w:b/>
+                <w:bCs/>
+                <w:sz w:val="18"/>
+                <w:szCs w:val="18"/>
+              </w:rPr>
+              <w:t xml:space="preserve"> B</w:t>
+            </w:r>
+          </w:p>
+        </w:tc>
+      </w:tr>
+      <w:tr>
+        <w:tc>
+          <w:tcPr>
+            <w:tcW w:w="0" w:type="auto"/>
+            <w:vAlign w:val="bottom"/>
+            <w:hideMark/>
+          </w:tcPr>
+          <w:p>
+            <w:pPr>
+              <w:rPr>
+                <w:rFonts w:ascii="Times New Roman" w:hAnsi="Times New Roman" w:cs="Times New Roman"/>
+                <w:sz w:val="18"/>
+                <w:szCs w:val="18"/>
+              </w:rPr>
+            </w:pPr>
+            <w:r>
+              <w:rPr>
+                <w:rFonts w:ascii="Times New Roman" w:hAnsi="Times New Roman" w:cs="Times New Roman"/>
+                <w:sz w:val="18"/>
+                <w:szCs w:val="18"/>
+              </w:rPr>
+              <w:t>True</w:t>
+            </w:r>
+          </w:p>
+        </w:tc>
+        <w:tc>
+          <w:tcPr>
+            <w:tcW w:w="0" w:type="auto"/>
+            <w:vAlign w:val="bottom"/>
+            <w:hideMark/>
+          </w:tcPr>
+          <w:p>
+            <w:pPr>
+              <w:rPr>
+                <w:rFonts w:ascii="Times New Roman" w:hAnsi="Times New Roman" w:cs="Times New Roman"/>
+                <w:sz w:val="18"/>
+                <w:szCs w:val="18"/>
+              </w:rPr>
+            </w:pPr>
+            <w:r>
+              <w:rPr>
+                <w:rFonts w:ascii="Times New Roman" w:hAnsi="Times New Roman" w:cs="Times New Roman"/>
+                <w:sz w:val="18"/>
+                <w:szCs w:val="18"/>
+              </w:rPr>
+              <w:t>True</w:t>
+            </w:r>
+          </w:p>
+        </w:tc>
+        <w:tc>
+          <w:tcPr>
+            <w:tcW w:w="0" w:type="auto"/>
+            <w:vAlign w:val="bottom"/>
+            <w:hideMark/>
+          </w:tcPr>
+          <w:p>
+            <w:pPr>
+              <w:rPr>
+                <w:rFonts w:ascii="Times New Roman" w:hAnsi="Times New Roman" w:cs="Times New Roman"/>
+                <w:sz w:val="18"/>
+                <w:szCs w:val="18"/>
+              </w:rPr>
+            </w:pPr>
+            <w:r>
+              <w:rPr>
+                <w:rFonts w:ascii="Times New Roman" w:hAnsi="Times New Roman" w:cs="Times New Roman"/>
+                <w:sz w:val="18"/>
+                <w:szCs w:val="18"/>
+              </w:rPr>
+              <w:t>False</w:t>
+            </w:r>
+          </w:p>
+        </w:tc>
+        <w:tc>
+          <w:tcPr>
+            <w:tcW w:w="0" w:type="auto"/>
+            <w:vAlign w:val="bottom"/>
+            <w:hideMark/>
+          </w:tcPr>
+          <w:p>
+            <w:pPr>
+              <w:rPr>
+                <w:rFonts w:ascii="Times New Roman" w:hAnsi="Times New Roman" w:cs="Times New Roman"/>
+                <w:sz w:val="18"/>
+                <w:szCs w:val="18"/>
+              </w:rPr>
+            </w:pPr>
+            <w:r>
+              <w:rPr>
+                <w:rFonts w:ascii="Times New Roman" w:hAnsi="Times New Roman" w:cs="Times New Roman"/>
+                <w:sz w:val="18"/>
+                <w:szCs w:val="18"/>
+              </w:rPr>
+              <w:t>False</w:t>
+            </w:r>
+          </w:p>
+        </w:tc>
+      </w:tr>
+      <w:tr>
+        <w:tc>
+          <w:tcPr>
+            <w:tcW w:w="0" w:type="auto"/>
+            <w:vAlign w:val="bottom"/>
+            <w:hideMark/>
+          </w:tcPr>
+          <w:p>
+            <w:pPr>
+              <w:rPr>
+                <w:rFonts w:ascii="Times New Roman" w:hAnsi="Times New Roman" w:cs="Times New Roman"/>
+                <w:sz w:val="18"/>
+                <w:szCs w:val="18"/>
+              </w:rPr>
+            </w:pPr>
+            <w:r>
+              <w:rPr>
+                <w:rFonts w:ascii="Times New Roman" w:hAnsi="Times New Roman" w:cs="Times New Roman"/>
+                <w:sz w:val="18"/>
+                <w:szCs w:val="18"/>
+              </w:rPr>
+              <w:t>True</w:t>
+            </w:r>
+          </w:p>
+        </w:tc>
+        <w:tc>
+          <w:tcPr>
+            <w:tcW w:w="0" w:type="auto"/>
+            <w:vAlign w:val="bottom"/>
+            <w:hideMark/>
+          </w:tcPr>
+          <w:p>
+            <w:pPr>
+              <w:rPr>
+                <w:rFonts w:ascii="Times New Roman" w:hAnsi="Times New Roman" w:cs="Times New Roman"/>
+                <w:sz w:val="18"/>
+                <w:szCs w:val="18"/>
+              </w:rPr>
+            </w:pPr>
+            <w:r>
+              <w:rPr>
+                <w:rFonts w:ascii="Times New Roman" w:hAnsi="Times New Roman" w:cs="Times New Roman"/>
+                <w:sz w:val="18"/>
+                <w:szCs w:val="18"/>
+              </w:rPr>
+              <w:t>False</w:t>
+            </w:r>
+          </w:p>
+        </w:tc>
+        <w:tc>
+          <w:tcPr>
+            <w:tcW w:w="0" w:type="auto"/>
+            <w:vAlign w:val="bottom"/>
+            <w:hideMark/>
+          </w:tcPr>
+          <w:p>
+            <w:pPr>
+              <w:rPr>
+                <w:rFonts w:ascii="Times New Roman" w:hAnsi="Times New Roman" w:cs="Times New Roman"/>
+                <w:sz w:val="18"/>
+                <w:szCs w:val="18"/>
+                <w:lang w:val="en-US"/>
+              </w:rPr>
+            </w:pPr>
+            <w:r>
+              <w:rPr>
+                <w:rFonts w:ascii="Times New Roman" w:hAnsi="Times New Roman" w:cs="Times New Roman"/>
+                <w:b/>
+                <w:bCs/>
+                <w:sz w:val="18"/>
+                <w:szCs w:val="18"/>
+              </w:rPr>
+              <w:t>True</w:t>
+            </w:r>
+          </w:p>
+        </w:tc>
+        <w:tc>
+          <w:tcPr>
+            <w:tcW w:w="0" w:type="auto"/>
+            <w:vAlign w:val="bottom"/>
+            <w:hideMark/>
+          </w:tcPr>
+          <w:p>
+            <w:pPr>
+              <w:rPr>
+                <w:rFonts w:ascii="Times New Roman" w:hAnsi="Times New Roman" w:cs="Times New Roman"/>
+                <w:sz w:val="18"/>
+                <w:szCs w:val="18"/>
+              </w:rPr>
+            </w:pPr>
+            <w:r>
+              <w:rPr>
+                <w:rFonts w:ascii="Times New Roman" w:hAnsi="Times New Roman" w:cs="Times New Roman"/>
+                <w:b/>
+                <w:bCs/>
+                <w:sz w:val="18"/>
+                <w:szCs w:val="18"/>
+              </w:rPr>
+              <w:t>True</w:t>
+            </w:r>
+          </w:p>
+        </w:tc>
+      </w:tr>
+      <w:tr>
+        <w:tc>
+          <w:tcPr>
+            <w:tcW w:w="0" w:type="auto"/>
+            <w:vAlign w:val="bottom"/>
+            <w:hideMark/>
+          </w:tcPr>
+          <w:p>
+            <w:pPr>
+              <w:rPr>
+                <w:rFonts w:ascii="Times New Roman" w:hAnsi="Times New Roman" w:cs="Times New Roman"/>
+                <w:sz w:val="18"/>
+                <w:szCs w:val="18"/>
+              </w:rPr>
+            </w:pPr>
+            <w:r>
+              <w:rPr>
+                <w:rFonts w:ascii="Times New Roman" w:hAnsi="Times New Roman" w:cs="Times New Roman"/>
+                <w:sz w:val="18"/>
+                <w:szCs w:val="18"/>
+              </w:rPr>
+              <w:t>False</w:t>
+            </w:r>
+          </w:p>
+        </w:tc>
+        <w:tc>
+          <w:tcPr>
+            <w:tcW w:w="0" w:type="auto"/>
+            <w:vAlign w:val="bottom"/>
+            <w:hideMark/>
+          </w:tcPr>
+          <w:p>
+            <w:pPr>
+              <w:rPr>
+                <w:rFonts w:ascii="Times New Roman" w:hAnsi="Times New Roman" w:cs="Times New Roman"/>
+                <w:sz w:val="18"/>
+                <w:szCs w:val="18"/>
+              </w:rPr>
+            </w:pPr>
+            <w:r>
+              <w:rPr>
+                <w:rFonts w:ascii="Times New Roman" w:hAnsi="Times New Roman" w:cs="Times New Roman"/>
+                <w:sz w:val="18"/>
+                <w:szCs w:val="18"/>
+              </w:rPr>
+              <w:t>True</w:t>
+            </w:r>
+          </w:p>
+        </w:tc>
+        <w:tc>
+          <w:tcPr>
+            <w:tcW w:w="0" w:type="auto"/>
+            <w:vAlign w:val="bottom"/>
+            <w:hideMark/>
+          </w:tcPr>
+          <w:p>
+            <w:pPr>
+              <w:rPr>
+                <w:rFonts w:ascii="Times New Roman" w:hAnsi="Times New Roman" w:cs="Times New Roman"/>
+                <w:sz w:val="18"/>
+                <w:szCs w:val="18"/>
+              </w:rPr>
+            </w:pPr>
+            <w:r>
+              <w:rPr>
+                <w:rFonts w:ascii="Times New Roman" w:hAnsi="Times New Roman" w:cs="Times New Roman"/>
+                <w:b/>
+                <w:bCs/>
+                <w:sz w:val="18"/>
+                <w:szCs w:val="18"/>
+              </w:rPr>
+              <w:t>True</w:t>
+            </w:r>
+          </w:p>
+        </w:tc>
+        <w:tc>
+          <w:tcPr>
+            <w:tcW w:w="0" w:type="auto"/>
+            <w:vAlign w:val="bottom"/>
+            <w:hideMark/>
+          </w:tcPr>
+          <w:p>
+            <w:pPr>
+              <w:rPr>
+                <w:rFonts w:ascii="Times New Roman" w:hAnsi="Times New Roman" w:cs="Times New Roman"/>
+                <w:sz w:val="18"/>
+                <w:szCs w:val="18"/>
+              </w:rPr>
+            </w:pPr>
+            <w:r>
+              <w:rPr>
+                <w:rFonts w:ascii="Times New Roman" w:hAnsi="Times New Roman" w:cs="Times New Roman"/>
+                <w:b/>
+                <w:bCs/>
+                <w:sz w:val="18"/>
+                <w:szCs w:val="18"/>
+              </w:rPr>
+              <w:t>True</w:t>
+            </w:r>
+          </w:p>
+        </w:tc>
+      </w:tr>
+      <w:tr>
+        <w:tc>
+          <w:tcPr>
+            <w:tcW w:w="0" w:type="auto"/>
+            <w:vAlign w:val="bottom"/>
+            <w:hideMark/>
+          </w:tcPr>
+          <w:p>
+            <w:pPr>
+              <w:rPr>
+                <w:rFonts w:ascii="Times New Roman" w:hAnsi="Times New Roman" w:cs="Times New Roman"/>
+                <w:sz w:val="18"/>
+                <w:szCs w:val="18"/>
+              </w:rPr>
+            </w:pPr>
+            <w:r>
+              <w:rPr>
+                <w:rFonts w:ascii="Times New Roman" w:hAnsi="Times New Roman" w:cs="Times New Roman"/>
+                <w:sz w:val="18"/>
+                <w:szCs w:val="18"/>
+              </w:rPr>
+              <w:t>False</w:t>
+            </w:r>
+          </w:p>
+        </w:tc>
+        <w:tc>
+          <w:tcPr>
+            <w:tcW w:w="0" w:type="auto"/>
+            <w:vAlign w:val="bottom"/>
+            <w:hideMark/>
+          </w:tcPr>
+          <w:p>
+            <w:pPr>
+              <w:rPr>
+                <w:rFonts w:ascii="Times New Roman" w:hAnsi="Times New Roman" w:cs="Times New Roman"/>
+                <w:sz w:val="18"/>
+                <w:szCs w:val="18"/>
+              </w:rPr>
+            </w:pPr>
+            <w:r>
+              <w:rPr>
+                <w:rFonts w:ascii="Times New Roman" w:hAnsi="Times New Roman" w:cs="Times New Roman"/>
+                <w:sz w:val="18"/>
+                <w:szCs w:val="18"/>
+              </w:rPr>
+              <w:t>False</w:t>
+            </w:r>
+          </w:p>
+        </w:tc>
+        <w:tc>
+          <w:tcPr>
+            <w:tcW w:w="0" w:type="auto"/>
+            <w:vAlign w:val="bottom"/>
+            <w:hideMark/>
+          </w:tcPr>
+          <w:p>
+            <w:pPr>
+              <w:rPr>
+                <w:rFonts w:ascii="Times New Roman" w:hAnsi="Times New Roman" w:cs="Times New Roman"/>
+                <w:sz w:val="18"/>
+                <w:szCs w:val="18"/>
+              </w:rPr>
+            </w:pPr>
+            <w:r>
+              <w:rPr>
+                <w:rFonts w:ascii="Times New Roman" w:hAnsi="Times New Roman" w:cs="Times New Roman"/>
+                <w:sz w:val="18"/>
+                <w:szCs w:val="18"/>
+              </w:rPr>
+              <w:t>False</w:t>
+            </w:r>
+          </w:p>
+        </w:tc>
+        <w:tc>
+          <w:tcPr>
+            <w:tcW w:w="0" w:type="auto"/>
+            <w:vAlign w:val="bottom"/>
+            <w:hideMark/>
+          </w:tcPr>
+          <w:p>
+            <w:pPr>
+              <w:rPr>
+                <w:rFonts w:ascii="Times New Roman" w:hAnsi="Times New Roman" w:cs="Times New Roman"/>
+                <w:sz w:val="18"/>
+                <w:szCs w:val="18"/>
+              </w:rPr>
+            </w:pPr>
+            <w:r>
+              <w:rPr>
+                <w:rFonts w:ascii="Times New Roman" w:hAnsi="Times New Roman" w:cs="Times New Roman"/>
+                <w:sz w:val="18"/>
+                <w:szCs w:val="18"/>
+              </w:rPr>
+              <w:t>False</w:t>
+            </w:r>
+          </w:p>
+        </w:tc>
+      </w:tr>
+    </w:tbl>
+    <w:p>
+      <w:pPr>
+        <w:rPr>
+          <w:rFonts w:ascii="Times New Roman" w:hAnsi="Times New Roman" w:cs="Times New Roman"/>
+          <w:sz w:val="18"/>
+          <w:szCs w:val="18"/>
+        </w:rPr>
+      </w:pPr>
+      <w:r>
+        <w:rPr>
+          <w:rFonts w:ascii="Times New Roman" w:hAnsi="Times New Roman" w:cs="Times New Roman"/>
+          <w:b/>
+          <w:bCs/>
+          <w:sz w:val="18"/>
+          <w:szCs w:val="18"/>
+        </w:rPr>
+        <w:t>Правило XOR:</w:t>
+      </w:r>
+      <w:r>
+        <w:rPr>
+          <w:rFonts w:ascii="Times New Roman" w:hAnsi="Times New Roman" w:cs="Times New Roman"/>
+          <w:sz w:val="18"/>
+          <w:szCs w:val="18"/>
+        </w:rPr>
+        <w:t> True только если операнды </w:t>
+      </w:r>
+      <w:r>
+        <w:rPr>
+          <w:rFonts w:ascii="Times New Roman" w:hAnsi="Times New Roman" w:cs="Times New Roman"/>
+          <w:b/>
+          <w:bCs/>
+          <w:sz w:val="18"/>
+          <w:szCs w:val="18"/>
+        </w:rPr>
+        <w:t>разные</w:t>
+      </w:r>
+      <w:r>
+        <w:rPr>
+          <w:rFonts w:ascii="Times New Roman" w:hAnsi="Times New Roman" w:cs="Times New Roman"/>
+          <w:sz w:val="18"/>
+          <w:szCs w:val="18"/>
+        </w:rPr>
+        <w:t>.</w:t>
+      </w:r>
+    </w:p>
+    <w:p>
+      <w:pPr>
+        <w:rPr>
+          <w:lang w:val="en-US"/>
+        </w:rPr>
+      </w:pPr>
+    </w:p>
     <w:p>
       <w:pPr>
         <w:spacing w:after="0"/>
@@ -22352,8 +24733,8 @@
       </w:pPr>
     </w:p>
     <w:sectPr>
-      <w:headerReference w:type="default" r:id="rId39"/>
-      <w:footerReference w:type="default" r:id="rId40"/>
+      <w:headerReference w:type="default" r:id="rId43"/>
+      <w:footerReference w:type="default" r:id="rId44"/>
       <w:pgSz w:w="12240" w:h="20160" w:code="5"/>
       <w:pgMar w:top="1134" w:right="850" w:bottom="1134" w:left="1701" w:header="283" w:footer="397" w:gutter="0"/>
       <w:pgNumType w:start="1"/>

</xml_diff>

<commit_message>
20.04.26 list changes: aqa
</commit_message>
<xml_diff>
--- a/AQA/Roadmap/aqa подготовка.docx
+++ b/AQA/Roadmap/aqa подготовка.docx
@@ -1273,47 +1273,7 @@
             <w:sz w:val="20"/>
             <w:szCs w:val="20"/>
           </w:rPr>
-          <w:t>Структу</w:t>
-        </w:r>
-        <w:r>
-          <w:rPr>
-            <w:rStyle w:val="a3"/>
-            <w:rFonts w:ascii="Times New Roman" w:hAnsi="Times New Roman" w:cs="Times New Roman"/>
-            <w:color w:val="595959" w:themeColor="text1" w:themeTint="A6"/>
-            <w:sz w:val="20"/>
-            <w:szCs w:val="20"/>
-          </w:rPr>
-          <w:t>р</w:t>
-        </w:r>
-        <w:r>
-          <w:rPr>
-            <w:rStyle w:val="a3"/>
-            <w:rFonts w:ascii="Times New Roman" w:hAnsi="Times New Roman" w:cs="Times New Roman"/>
-            <w:color w:val="595959" w:themeColor="text1" w:themeTint="A6"/>
-            <w:sz w:val="20"/>
-            <w:szCs w:val="20"/>
-          </w:rPr>
-          <w:t>ы да</w:t>
-        </w:r>
-        <w:r>
-          <w:rPr>
-            <w:rStyle w:val="a3"/>
-            <w:rFonts w:ascii="Times New Roman" w:hAnsi="Times New Roman" w:cs="Times New Roman"/>
-            <w:color w:val="595959" w:themeColor="text1" w:themeTint="A6"/>
-            <w:sz w:val="20"/>
-            <w:szCs w:val="20"/>
-          </w:rPr>
-          <w:t>н</w:t>
-        </w:r>
-        <w:r>
-          <w:rPr>
-            <w:rStyle w:val="a3"/>
-            <w:rFonts w:ascii="Times New Roman" w:hAnsi="Times New Roman" w:cs="Times New Roman"/>
-            <w:color w:val="595959" w:themeColor="text1" w:themeTint="A6"/>
-            <w:sz w:val="20"/>
-            <w:szCs w:val="20"/>
-          </w:rPr>
-          <w:t>ных</w:t>
+          <w:t>Структуры данных</w:t>
         </w:r>
       </w:hyperlink>
     </w:p>
@@ -15228,7 +15188,6 @@
           <w:bCs/>
           <w:sz w:val="18"/>
           <w:szCs w:val="18"/>
-          <w:lang w:val="en-US"/>
         </w:rPr>
       </w:pPr>
     </w:p>
@@ -15413,16 +15372,14 @@
         </w:rPr>
         <w:t>: когда вызывается create_</w:t>
       </w:r>
-      <w:proofErr w:type="gramStart"/>
-      <w:r>
-        <w:rPr>
-          <w:rFonts w:ascii="Times New Roman" w:hAnsi="Times New Roman" w:cs="Times New Roman"/>
-          <w:sz w:val="18"/>
-          <w:szCs w:val="18"/>
-        </w:rPr>
-        <w:t>user(</w:t>
-      </w:r>
-      <w:proofErr w:type="gramEnd"/>
+      <w:r>
+        <w:rPr>
+          <w:rFonts w:ascii="Times New Roman" w:hAnsi="Times New Roman" w:cs="Times New Roman"/>
+          <w:sz w:val="18"/>
+          <w:szCs w:val="18"/>
+        </w:rPr>
+        <w:t>user (</w:t>
+      </w:r>
       <w:r>
         <w:rPr>
           <w:rFonts w:ascii="Times New Roman" w:hAnsi="Times New Roman" w:cs="Times New Roman"/>
@@ -15466,16 +15423,14 @@
         </w:rPr>
         <w:t xml:space="preserve">: Сами данные («Alex», 25, список </w:t>
       </w:r>
-      <w:proofErr w:type="gramStart"/>
-      <w:r>
-        <w:rPr>
-          <w:rFonts w:ascii="Times New Roman" w:hAnsi="Times New Roman" w:cs="Times New Roman"/>
-          <w:sz w:val="18"/>
-          <w:szCs w:val="18"/>
-        </w:rPr>
-        <w:t>[ ]</w:t>
-      </w:r>
-      <w:proofErr w:type="gramEnd"/>
+      <w:r>
+        <w:rPr>
+          <w:rFonts w:ascii="Times New Roman" w:hAnsi="Times New Roman" w:cs="Times New Roman"/>
+          <w:sz w:val="18"/>
+          <w:szCs w:val="18"/>
+        </w:rPr>
+        <w:t>[]</w:t>
+      </w:r>
       <w:r>
         <w:rPr>
           <w:rFonts w:ascii="Times New Roman" w:hAnsi="Times New Roman" w:cs="Times New Roman"/>
@@ -15925,7 +15880,7 @@
           <w:sz w:val="18"/>
           <w:szCs w:val="18"/>
         </w:rPr>
-        <w:t xml:space="preserve"> Процессор — парень умный. Он понимает: «Если я пришел по этому адресу, то, скорее всего, мне понадобятся и соседние данные». Поэтому он берет не одну цифру, а целый «блок» данных (как если бы он зашел в подъезд и сразу запомнил, кто живет на всем этаже).</w:t>
+        <w:t xml:space="preserve"> Процессор понимает: «Если я пришел по этому адресу, то, скорее всего, мне понадобятся и соседние данные». Поэтому он берет не одну цифру, а целый «блок» данных (как если бы он зашел в подъезд и сразу запомнил, кто живет на всем этаже).</w:t>
       </w:r>
     </w:p>
     <w:p>
@@ -21785,19 +21740,11 @@
       <w:tblPr>
         <w:tblStyle w:val="ab"/>
         <w:tblW w:w="0" w:type="auto"/>
-        <w:tblBorders>
-          <w:top w:val="none" w:sz="0" w:space="0" w:color="auto"/>
-          <w:left w:val="none" w:sz="0" w:space="0" w:color="auto"/>
-          <w:bottom w:val="none" w:sz="0" w:space="0" w:color="auto"/>
-          <w:right w:val="none" w:sz="0" w:space="0" w:color="auto"/>
-          <w:insideH w:val="none" w:sz="0" w:space="0" w:color="auto"/>
-          <w:insideV w:val="none" w:sz="0" w:space="0" w:color="auto"/>
-        </w:tblBorders>
         <w:tblLook w:val="04A0" w:firstRow="1" w:lastRow="0" w:firstColumn="1" w:lastColumn="0" w:noHBand="0" w:noVBand="1"/>
       </w:tblPr>
       <w:tblGrid>
-        <w:gridCol w:w="4839"/>
-        <w:gridCol w:w="4840"/>
+        <w:gridCol w:w="4933"/>
+        <w:gridCol w:w="4746"/>
       </w:tblGrid>
       <w:tr>
         <w:tc>
@@ -22084,6 +22031,158 @@
               <w:t>tuple</w:t>
             </w:r>
           </w:p>
+          <w:p>
+            <w:pPr>
+              <w:spacing w:after="160" w:line="259" w:lineRule="auto"/>
+              <w:rPr>
+                <w:rFonts w:ascii="Times New Roman" w:hAnsi="Times New Roman" w:cs="Times New Roman"/>
+                <w:color w:val="000000" w:themeColor="text1"/>
+                <w:spacing w:val="-1"/>
+                <w:sz w:val="18"/>
+                <w:szCs w:val="18"/>
+              </w:rPr>
+            </w:pPr>
+            <w:r>
+              <w:rPr>
+                <w:rFonts w:ascii="Times New Roman" w:hAnsi="Times New Roman" w:cs="Times New Roman"/>
+                <w:color w:val="000000" w:themeColor="text1"/>
+                <w:spacing w:val="-1"/>
+                <w:sz w:val="18"/>
+                <w:szCs w:val="18"/>
+              </w:rPr>
+              <w:t>_____________________________________________________</w:t>
+            </w:r>
+          </w:p>
+          <w:p>
+            <w:pPr>
+              <w:spacing w:after="160" w:line="259" w:lineRule="auto"/>
+              <w:rPr>
+                <w:rFonts w:ascii="Times New Roman" w:hAnsi="Times New Roman" w:cs="Times New Roman"/>
+                <w:color w:val="000000" w:themeColor="text1"/>
+                <w:spacing w:val="-1"/>
+                <w:sz w:val="18"/>
+                <w:szCs w:val="18"/>
+              </w:rPr>
+            </w:pPr>
+            <w:r>
+              <w:rPr>
+                <w:rFonts w:ascii="Times New Roman" w:hAnsi="Times New Roman" w:cs="Times New Roman"/>
+                <w:color w:val="000000" w:themeColor="text1"/>
+                <w:spacing w:val="-1"/>
+                <w:sz w:val="18"/>
+                <w:szCs w:val="18"/>
+              </w:rPr>
+              <w:t>Их </w:t>
+            </w:r>
+            <w:r>
+              <w:rPr>
+                <w:rFonts w:ascii="Times New Roman" w:hAnsi="Times New Roman" w:cs="Times New Roman"/>
+                <w:b/>
+                <w:bCs/>
+                <w:color w:val="000000" w:themeColor="text1"/>
+                <w:spacing w:val="-1"/>
+                <w:sz w:val="18"/>
+                <w:szCs w:val="18"/>
+              </w:rPr>
+              <w:t>нельзя</w:t>
+            </w:r>
+            <w:r>
+              <w:rPr>
+                <w:rFonts w:ascii="Times New Roman" w:hAnsi="Times New Roman" w:cs="Times New Roman"/>
+                <w:color w:val="000000" w:themeColor="text1"/>
+                <w:spacing w:val="-1"/>
+                <w:sz w:val="18"/>
+                <w:szCs w:val="18"/>
+              </w:rPr>
+              <w:t> изменить после создания.</w:t>
+            </w:r>
+          </w:p>
+          <w:p>
+            <w:pPr>
+              <w:spacing w:after="160" w:line="259" w:lineRule="auto"/>
+              <w:rPr>
+                <w:rFonts w:ascii="Times New Roman" w:hAnsi="Times New Roman" w:cs="Times New Roman"/>
+                <w:color w:val="000000" w:themeColor="text1"/>
+                <w:spacing w:val="-1"/>
+                <w:sz w:val="18"/>
+                <w:szCs w:val="18"/>
+              </w:rPr>
+            </w:pPr>
+            <w:r>
+              <w:rPr>
+                <w:rFonts w:ascii="Times New Roman" w:hAnsi="Times New Roman" w:cs="Times New Roman"/>
+                <w:color w:val="000000" w:themeColor="text1"/>
+                <w:spacing w:val="-1"/>
+                <w:sz w:val="18"/>
+                <w:szCs w:val="18"/>
+              </w:rPr>
+              <w:t>Можно только создать новый объект и перепривязать на него переменную.</w:t>
+            </w:r>
+          </w:p>
+          <w:p>
+            <w:pPr>
+              <w:spacing w:after="160" w:line="259" w:lineRule="auto"/>
+              <w:rPr>
+                <w:rFonts w:ascii="Times New Roman" w:hAnsi="Times New Roman" w:cs="Times New Roman"/>
+                <w:color w:val="000000" w:themeColor="text1"/>
+                <w:spacing w:val="-1"/>
+                <w:sz w:val="18"/>
+                <w:szCs w:val="18"/>
+              </w:rPr>
+            </w:pPr>
+            <w:r>
+              <w:rPr>
+                <w:noProof/>
+              </w:rPr>
+              <w:drawing>
+                <wp:inline distT="0" distB="0" distL="0" distR="0" wp14:anchorId="434CE1F9" wp14:editId="3CB9C222">
+                  <wp:extent cx="2874686" cy="792178"/>
+                  <wp:effectExtent l="0" t="0" r="1905" b="8255"/>
+                  <wp:docPr id="163414564" name="Рисунок 1"/>
+                  <wp:cNvGraphicFramePr>
+                    <a:graphicFrameLocks xmlns:a="http://schemas.openxmlformats.org/drawingml/2006/main" noChangeAspect="1"/>
+                  </wp:cNvGraphicFramePr>
+                  <a:graphic xmlns:a="http://schemas.openxmlformats.org/drawingml/2006/main">
+                    <a:graphicData uri="http://schemas.openxmlformats.org/drawingml/2006/picture">
+                      <pic:pic xmlns:pic="http://schemas.openxmlformats.org/drawingml/2006/picture">
+                        <pic:nvPicPr>
+                          <pic:cNvPr id="163414564" name=""/>
+                          <pic:cNvPicPr/>
+                        </pic:nvPicPr>
+                        <pic:blipFill>
+                          <a:blip r:embed="rId39"/>
+                          <a:stretch>
+                            <a:fillRect/>
+                          </a:stretch>
+                        </pic:blipFill>
+                        <pic:spPr>
+                          <a:xfrm>
+                            <a:off x="0" y="0"/>
+                            <a:ext cx="2944139" cy="811317"/>
+                          </a:xfrm>
+                          <a:prstGeom prst="rect">
+                            <a:avLst/>
+                          </a:prstGeom>
+                        </pic:spPr>
+                      </pic:pic>
+                    </a:graphicData>
+                  </a:graphic>
+                </wp:inline>
+              </w:drawing>
+            </w:r>
+          </w:p>
+          <w:p>
+            <w:pPr>
+              <w:pStyle w:val="a4"/>
+              <w:rPr>
+                <w:rFonts w:ascii="Times New Roman" w:hAnsi="Times New Roman" w:cs="Times New Roman"/>
+                <w:color w:val="000000" w:themeColor="text1"/>
+                <w:spacing w:val="-1"/>
+                <w:sz w:val="18"/>
+                <w:szCs w:val="18"/>
+              </w:rPr>
+            </w:pPr>
+          </w:p>
         </w:tc>
         <w:tc>
           <w:tcPr>
@@ -22173,6 +22272,112 @@
               <w:t>set</w:t>
             </w:r>
           </w:p>
+          <w:p>
+            <w:pPr>
+              <w:pStyle w:val="a4"/>
+              <w:rPr>
+                <w:rFonts w:ascii="Times New Roman" w:hAnsi="Times New Roman" w:cs="Times New Roman"/>
+                <w:color w:val="000000" w:themeColor="text1"/>
+                <w:spacing w:val="-1"/>
+                <w:sz w:val="18"/>
+                <w:szCs w:val="18"/>
+              </w:rPr>
+            </w:pPr>
+          </w:p>
+          <w:p>
+            <w:pPr>
+              <w:rPr>
+                <w:rFonts w:ascii="Times New Roman" w:hAnsi="Times New Roman" w:cs="Times New Roman"/>
+                <w:color w:val="000000" w:themeColor="text1"/>
+                <w:spacing w:val="-1"/>
+                <w:sz w:val="18"/>
+                <w:szCs w:val="18"/>
+              </w:rPr>
+            </w:pPr>
+            <w:r>
+              <w:rPr>
+                <w:rFonts w:ascii="Times New Roman" w:hAnsi="Times New Roman" w:cs="Times New Roman"/>
+                <w:color w:val="000000" w:themeColor="text1"/>
+                <w:spacing w:val="-1"/>
+                <w:sz w:val="18"/>
+                <w:szCs w:val="18"/>
+              </w:rPr>
+              <w:t>Их </w:t>
+            </w:r>
+            <w:r>
+              <w:rPr>
+                <w:rFonts w:ascii="Times New Roman" w:hAnsi="Times New Roman" w:cs="Times New Roman"/>
+                <w:b/>
+                <w:bCs/>
+                <w:color w:val="000000" w:themeColor="text1"/>
+                <w:spacing w:val="-1"/>
+                <w:sz w:val="18"/>
+                <w:szCs w:val="18"/>
+              </w:rPr>
+              <w:t>можно</w:t>
+            </w:r>
+            <w:r>
+              <w:rPr>
+                <w:rFonts w:ascii="Times New Roman" w:hAnsi="Times New Roman" w:cs="Times New Roman"/>
+                <w:color w:val="000000" w:themeColor="text1"/>
+                <w:spacing w:val="-1"/>
+                <w:sz w:val="18"/>
+                <w:szCs w:val="18"/>
+              </w:rPr>
+              <w:t> изменять «на месте», без создания нового объекта.</w:t>
+            </w:r>
+          </w:p>
+          <w:p>
+            <w:pPr>
+              <w:rPr>
+                <w:rFonts w:ascii="Times New Roman" w:hAnsi="Times New Roman" w:cs="Times New Roman"/>
+                <w:color w:val="000000" w:themeColor="text1"/>
+                <w:spacing w:val="-1"/>
+                <w:sz w:val="18"/>
+                <w:szCs w:val="18"/>
+              </w:rPr>
+            </w:pPr>
+            <w:r>
+              <w:rPr>
+                <w:noProof/>
+              </w:rPr>
+              <w:drawing>
+                <wp:inline distT="0" distB="0" distL="0" distR="0" wp14:anchorId="7E9D4411" wp14:editId="0FCF441E">
+                  <wp:extent cx="1408025" cy="542925"/>
+                  <wp:effectExtent l="0" t="0" r="1905" b="0"/>
+                  <wp:docPr id="562878371" name="Рисунок 1"/>
+                  <wp:cNvGraphicFramePr>
+                    <a:graphicFrameLocks xmlns:a="http://schemas.openxmlformats.org/drawingml/2006/main" noChangeAspect="1"/>
+                  </wp:cNvGraphicFramePr>
+                  <a:graphic xmlns:a="http://schemas.openxmlformats.org/drawingml/2006/main">
+                    <a:graphicData uri="http://schemas.openxmlformats.org/drawingml/2006/picture">
+                      <pic:pic xmlns:pic="http://schemas.openxmlformats.org/drawingml/2006/picture">
+                        <pic:nvPicPr>
+                          <pic:cNvPr id="562878371" name=""/>
+                          <pic:cNvPicPr/>
+                        </pic:nvPicPr>
+                        <pic:blipFill>
+                          <a:blip r:embed="rId40"/>
+                          <a:stretch>
+                            <a:fillRect/>
+                          </a:stretch>
+                        </pic:blipFill>
+                        <pic:spPr>
+                          <a:xfrm>
+                            <a:off x="0" y="0"/>
+                            <a:ext cx="1419154" cy="547216"/>
+                          </a:xfrm>
+                          <a:prstGeom prst="rect">
+                            <a:avLst/>
+                          </a:prstGeom>
+                        </pic:spPr>
+                      </pic:pic>
+                    </a:graphicData>
+                  </a:graphic>
+                </wp:inline>
+              </w:drawing>
+            </w:r>
+          </w:p>
         </w:tc>
       </w:tr>
     </w:tbl>
@@ -22181,8 +22386,6 @@
         <w:spacing w:after="0"/>
         <w:rPr>
           <w:rFonts w:ascii="Times New Roman" w:hAnsi="Times New Roman" w:cs="Times New Roman"/>
-          <w:i/>
-          <w:iCs/>
           <w:color w:val="000000" w:themeColor="text1"/>
           <w:spacing w:val="-1"/>
           <w:sz w:val="18"/>
@@ -22201,9 +22404,7 @@
           <w:szCs w:val="18"/>
         </w:rPr>
       </w:pPr>
-    </w:p>
-    <w:p>
-      <w:pPr>
+      <w:r>
         <w:rPr>
           <w:rFonts w:ascii="Times New Roman" w:hAnsi="Times New Roman" w:cs="Times New Roman"/>
           <w:color w:val="000000" w:themeColor="text1"/>
@@ -22211,72 +22412,74 @@
           <w:sz w:val="18"/>
           <w:szCs w:val="18"/>
         </w:rPr>
-      </w:pPr>
-      <w:r>
-        <w:rPr>
-          <w:rFonts w:ascii="Times New Roman" w:hAnsi="Times New Roman" w:cs="Times New Roman"/>
+        <w:t>В Python </w:t>
+      </w:r>
+      <w:r>
+        <w:rPr>
+          <w:rFonts w:ascii="Times New Roman" w:hAnsi="Times New Roman" w:cs="Times New Roman"/>
+          <w:b/>
+          <w:bCs/>
           <w:color w:val="000000" w:themeColor="text1"/>
           <w:spacing w:val="-1"/>
           <w:sz w:val="18"/>
           <w:szCs w:val="18"/>
         </w:rPr>
-        <w:t xml:space="preserve">Управление потоком выполнения в программировании — это то, </w:t>
-      </w:r>
-      <w:r>
-        <w:rPr>
-          <w:rFonts w:ascii="Times New Roman" w:hAnsi="Times New Roman" w:cs="Times New Roman"/>
-          <w:b/>
-          <w:bCs/>
+        <w:t>переменная — это не ящик</w:t>
+      </w:r>
+      <w:r>
+        <w:rPr>
+          <w:rFonts w:ascii="Times New Roman" w:hAnsi="Times New Roman" w:cs="Times New Roman"/>
           <w:color w:val="000000" w:themeColor="text1"/>
           <w:spacing w:val="-1"/>
           <w:sz w:val="18"/>
           <w:szCs w:val="18"/>
         </w:rPr>
-        <w:t>как</w:t>
-      </w:r>
-      <w:r>
-        <w:rPr>
-          <w:rFonts w:ascii="Times New Roman" w:hAnsi="Times New Roman" w:cs="Times New Roman"/>
+        <w:t>, а </w:t>
+      </w:r>
+      <w:r>
+        <w:rPr>
+          <w:rFonts w:ascii="Times New Roman" w:hAnsi="Times New Roman" w:cs="Times New Roman"/>
+          <w:b/>
+          <w:bCs/>
           <w:color w:val="000000" w:themeColor="text1"/>
           <w:spacing w:val="-1"/>
           <w:sz w:val="18"/>
           <w:szCs w:val="18"/>
         </w:rPr>
-        <w:t xml:space="preserve"> определяется порядок выполнения инструкций программы. Вместо следования линейной последовательности, программы могут принимать решения, повторять блоки кода или изменять порядок выполнения в зависимости от </w:t>
-      </w:r>
-      <w:r>
-        <w:rPr>
-          <w:rFonts w:ascii="Times New Roman" w:hAnsi="Times New Roman" w:cs="Times New Roman"/>
-          <w:b/>
-          <w:bCs/>
+        <w:t>ярлык</w:t>
+      </w:r>
+      <w:r>
+        <w:rPr>
+          <w:rFonts w:ascii="Times New Roman" w:hAnsi="Times New Roman" w:cs="Times New Roman"/>
           <w:color w:val="000000" w:themeColor="text1"/>
           <w:spacing w:val="-1"/>
           <w:sz w:val="18"/>
           <w:szCs w:val="18"/>
         </w:rPr>
-        <w:t>определенных условий</w:t>
-      </w:r>
-      <w:r>
+        <w:t> (имя), который ссылается на объект.</w:t>
+      </w:r>
+    </w:p>
+    <w:p>
+      <w:pPr>
+        <w:spacing w:after="0"/>
         <w:rPr>
           <w:rFonts w:ascii="Times New Roman" w:hAnsi="Times New Roman" w:cs="Times New Roman"/>
           <w:color w:val="000000" w:themeColor="text1"/>
           <w:spacing w:val="-1"/>
           <w:sz w:val="18"/>
           <w:szCs w:val="18"/>
-        </w:rPr>
-        <w:t>. Это достигается с помощью таких структур, как условные операторы (</w:t>
-      </w:r>
-      <w:r>
-        <w:rPr>
-          <w:rFonts w:ascii="Times New Roman" w:hAnsi="Times New Roman" w:cs="Times New Roman"/>
-          <w:b/>
-          <w:bCs/>
+          <w:lang w:val="en-US"/>
+        </w:rPr>
+      </w:pPr>
+      <w:r>
+        <w:rPr>
+          <w:rFonts w:ascii="Times New Roman" w:hAnsi="Times New Roman" w:cs="Times New Roman"/>
           <w:color w:val="000000" w:themeColor="text1"/>
           <w:spacing w:val="-1"/>
           <w:sz w:val="18"/>
           <w:szCs w:val="18"/>
         </w:rPr>
-        <w:t>if, else</w:t>
+        <w:t>Когда</w:t>
       </w:r>
       <w:r>
         <w:rPr>
@@ -22285,20 +22488,19 @@
           <w:spacing w:val="-1"/>
           <w:sz w:val="18"/>
           <w:szCs w:val="18"/>
-        </w:rPr>
-        <w:t>), циклы (</w:t>
-      </w:r>
-      <w:r>
-        <w:rPr>
-          <w:rFonts w:ascii="Times New Roman" w:hAnsi="Times New Roman" w:cs="Times New Roman"/>
-          <w:b/>
-          <w:bCs/>
+          <w:lang w:val="en-US"/>
+        </w:rPr>
+        <w:t xml:space="preserve"> </w:t>
+      </w:r>
+      <w:r>
+        <w:rPr>
+          <w:rFonts w:ascii="Times New Roman" w:hAnsi="Times New Roman" w:cs="Times New Roman"/>
           <w:color w:val="000000" w:themeColor="text1"/>
           <w:spacing w:val="-1"/>
           <w:sz w:val="18"/>
           <w:szCs w:val="18"/>
         </w:rPr>
-        <w:t>for, while</w:t>
+        <w:t>ты</w:t>
       </w:r>
       <w:r>
         <w:rPr>
@@ -22307,20 +22509,19 @@
           <w:spacing w:val="-1"/>
           <w:sz w:val="18"/>
           <w:szCs w:val="18"/>
-        </w:rPr>
-        <w:t xml:space="preserve">) и управляющие операторы, такие как </w:t>
-      </w:r>
-      <w:r>
-        <w:rPr>
-          <w:rFonts w:ascii="Times New Roman" w:hAnsi="Times New Roman" w:cs="Times New Roman"/>
-          <w:b/>
-          <w:bCs/>
+          <w:lang w:val="en-US"/>
+        </w:rPr>
+        <w:t xml:space="preserve"> </w:t>
+      </w:r>
+      <w:r>
+        <w:rPr>
+          <w:rFonts w:ascii="Times New Roman" w:hAnsi="Times New Roman" w:cs="Times New Roman"/>
           <w:color w:val="000000" w:themeColor="text1"/>
           <w:spacing w:val="-1"/>
           <w:sz w:val="18"/>
           <w:szCs w:val="18"/>
         </w:rPr>
-        <w:t>break</w:t>
+        <w:t>пишешь</w:t>
       </w:r>
       <w:r>
         <w:rPr>
@@ -22329,21 +22530,23 @@
           <w:spacing w:val="-1"/>
           <w:sz w:val="18"/>
           <w:szCs w:val="18"/>
-        </w:rPr>
-        <w:t xml:space="preserve"> или </w:t>
-      </w:r>
-      <w:r>
-        <w:rPr>
-          <w:rFonts w:ascii="Times New Roman" w:hAnsi="Times New Roman" w:cs="Times New Roman"/>
-          <w:b/>
-          <w:bCs/>
+          <w:lang w:val="en-US"/>
+        </w:rPr>
+        <w:t>:</w:t>
+      </w:r>
+    </w:p>
+    <w:p>
+      <w:pPr>
+        <w:spacing w:after="0"/>
+        <w:rPr>
+          <w:rFonts w:ascii="Times New Roman" w:hAnsi="Times New Roman" w:cs="Times New Roman"/>
           <w:color w:val="000000" w:themeColor="text1"/>
           <w:spacing w:val="-1"/>
           <w:sz w:val="18"/>
           <w:szCs w:val="18"/>
-        </w:rPr>
-        <w:t>continue</w:t>
-      </w:r>
+          <w:lang w:val="en-US"/>
+        </w:rPr>
+      </w:pPr>
       <w:r>
         <w:rPr>
           <w:rFonts w:ascii="Times New Roman" w:hAnsi="Times New Roman" w:cs="Times New Roman"/>
@@ -22351,12 +22554,25 @@
           <w:spacing w:val="-1"/>
           <w:sz w:val="18"/>
           <w:szCs w:val="18"/>
-        </w:rPr>
-        <w:t>.</w:t>
-      </w:r>
-    </w:p>
-    <w:p>
-      <w:pPr>
+          <w:lang w:val="en-US"/>
+        </w:rPr>
+        <w:t xml:space="preserve">name = </w:t>
+      </w:r>
+      <w:r>
+        <w:rPr>
+          <w:rFonts w:ascii="Times New Roman" w:hAnsi="Times New Roman" w:cs="Times New Roman"/>
+          <w:color w:val="70AD47" w:themeColor="accent6"/>
+          <w:spacing w:val="-1"/>
+          <w:sz w:val="18"/>
+          <w:szCs w:val="18"/>
+          <w:lang w:val="en-US"/>
+        </w:rPr>
+        <w:t>'John'</w:t>
+      </w:r>
+    </w:p>
+    <w:p>
+      <w:pPr>
+        <w:spacing w:after="0"/>
         <w:rPr>
           <w:rFonts w:ascii="Times New Roman" w:hAnsi="Times New Roman" w:cs="Times New Roman"/>
           <w:color w:val="000000" w:themeColor="text1"/>
@@ -22373,10 +22589,25 @@
           <w:spacing w:val="-1"/>
           <w:sz w:val="18"/>
           <w:szCs w:val="18"/>
-        </w:rPr>
-        <w:t>Условный оператор в Python (как и во многих других языках программирования) называется if. При его написании необходимо добавить в конце строки выражение сравнения, заканчивающееся </w:t>
-      </w:r>
-      <w:r>
+          <w:lang w:val="en-US"/>
+        </w:rPr>
+        <w:t xml:space="preserve">name = </w:t>
+      </w:r>
+      <w:r>
+        <w:rPr>
+          <w:rFonts w:ascii="Times New Roman" w:hAnsi="Times New Roman" w:cs="Times New Roman"/>
+          <w:color w:val="70AD47" w:themeColor="accent6"/>
+          <w:spacing w:val="-1"/>
+          <w:sz w:val="18"/>
+          <w:szCs w:val="18"/>
+          <w:lang w:val="en-US"/>
+        </w:rPr>
+        <w:t>"A"</w:t>
+      </w:r>
+    </w:p>
+    <w:p>
+      <w:pPr>
+        <w:spacing w:after="0"/>
         <w:rPr>
           <w:rFonts w:ascii="Times New Roman" w:hAnsi="Times New Roman" w:cs="Times New Roman"/>
           <w:color w:val="000000" w:themeColor="text1"/>
@@ -22384,7 +22615,313 @@
           <w:sz w:val="18"/>
           <w:szCs w:val="18"/>
         </w:rPr>
-        <w:t>двоеточием.</w:t>
+      </w:pPr>
+      <w:r>
+        <w:rPr>
+          <w:rFonts w:ascii="Times New Roman" w:hAnsi="Times New Roman" w:cs="Times New Roman"/>
+          <w:color w:val="000000" w:themeColor="text1"/>
+          <w:spacing w:val="-1"/>
+          <w:sz w:val="18"/>
+          <w:szCs w:val="18"/>
+        </w:rPr>
+        <w:t xml:space="preserve">name = </w:t>
+      </w:r>
+      <w:r>
+        <w:rPr>
+          <w:rFonts w:ascii="Times New Roman" w:hAnsi="Times New Roman" w:cs="Times New Roman"/>
+          <w:color w:val="ED7D31" w:themeColor="accent2"/>
+          <w:spacing w:val="-1"/>
+          <w:sz w:val="18"/>
+          <w:szCs w:val="18"/>
+        </w:rPr>
+        <w:t>False</w:t>
+      </w:r>
+    </w:p>
+    <w:p>
+      <w:pPr>
+        <w:spacing w:after="0"/>
+        <w:rPr>
+          <w:rFonts w:ascii="Times New Roman" w:hAnsi="Times New Roman" w:cs="Times New Roman"/>
+          <w:color w:val="000000" w:themeColor="text1"/>
+          <w:spacing w:val="-1"/>
+          <w:sz w:val="18"/>
+          <w:szCs w:val="18"/>
+        </w:rPr>
+      </w:pPr>
+    </w:p>
+    <w:p>
+      <w:pPr>
+        <w:spacing w:after="0"/>
+        <w:rPr>
+          <w:rFonts w:ascii="Times New Roman" w:hAnsi="Times New Roman" w:cs="Times New Roman"/>
+          <w:color w:val="000000" w:themeColor="text1"/>
+          <w:spacing w:val="-1"/>
+          <w:sz w:val="18"/>
+          <w:szCs w:val="18"/>
+        </w:rPr>
+      </w:pPr>
+      <w:r>
+        <w:rPr>
+          <w:rFonts w:ascii="Times New Roman" w:hAnsi="Times New Roman" w:cs="Times New Roman"/>
+          <w:color w:val="000000" w:themeColor="text1"/>
+          <w:spacing w:val="-1"/>
+          <w:sz w:val="18"/>
+          <w:szCs w:val="18"/>
+        </w:rPr>
+        <w:t>Ты </w:t>
+      </w:r>
+      <w:r>
+        <w:rPr>
+          <w:rFonts w:ascii="Times New Roman" w:hAnsi="Times New Roman" w:cs="Times New Roman"/>
+          <w:b/>
+          <w:bCs/>
+          <w:color w:val="000000" w:themeColor="text1"/>
+          <w:spacing w:val="-1"/>
+          <w:sz w:val="18"/>
+          <w:szCs w:val="18"/>
+        </w:rPr>
+        <w:t>не изменяешь</w:t>
+      </w:r>
+      <w:r>
+        <w:rPr>
+          <w:rFonts w:ascii="Times New Roman" w:hAnsi="Times New Roman" w:cs="Times New Roman"/>
+          <w:color w:val="000000" w:themeColor="text1"/>
+          <w:spacing w:val="-1"/>
+          <w:sz w:val="18"/>
+          <w:szCs w:val="18"/>
+        </w:rPr>
+        <w:t> объекты 'John', "A" или False.</w:t>
+      </w:r>
+      <w:r>
+        <w:rPr>
+          <w:rFonts w:ascii="Times New Roman" w:hAnsi="Times New Roman" w:cs="Times New Roman"/>
+          <w:color w:val="000000" w:themeColor="text1"/>
+          <w:spacing w:val="-1"/>
+          <w:sz w:val="18"/>
+          <w:szCs w:val="18"/>
+        </w:rPr>
+        <w:br/>
+        <w:t>Ты </w:t>
+      </w:r>
+      <w:r>
+        <w:rPr>
+          <w:rFonts w:ascii="Times New Roman" w:hAnsi="Times New Roman" w:cs="Times New Roman"/>
+          <w:b/>
+          <w:bCs/>
+          <w:color w:val="000000" w:themeColor="text1"/>
+          <w:spacing w:val="-1"/>
+          <w:sz w:val="18"/>
+          <w:szCs w:val="18"/>
+        </w:rPr>
+        <w:t>меняешь ссылку</w:t>
+      </w:r>
+      <w:r>
+        <w:rPr>
+          <w:rFonts w:ascii="Times New Roman" w:hAnsi="Times New Roman" w:cs="Times New Roman"/>
+          <w:color w:val="000000" w:themeColor="text1"/>
+          <w:spacing w:val="-1"/>
+          <w:sz w:val="18"/>
+          <w:szCs w:val="18"/>
+        </w:rPr>
+        <w:t> — куда указывает имя name.</w:t>
+      </w:r>
+    </w:p>
+    <w:p>
+      <w:pPr>
+        <w:spacing w:after="0"/>
+        <w:rPr>
+          <w:rFonts w:ascii="Times New Roman" w:hAnsi="Times New Roman" w:cs="Times New Roman"/>
+          <w:color w:val="000000" w:themeColor="text1"/>
+          <w:spacing w:val="-1"/>
+          <w:sz w:val="18"/>
+          <w:szCs w:val="18"/>
+        </w:rPr>
+      </w:pPr>
+    </w:p>
+    <w:p>
+      <w:pPr>
+        <w:spacing w:after="0"/>
+        <w:rPr>
+          <w:rFonts w:ascii="Times New Roman" w:hAnsi="Times New Roman" w:cs="Times New Roman"/>
+          <w:color w:val="000000" w:themeColor="text1"/>
+          <w:spacing w:val="-1"/>
+          <w:sz w:val="18"/>
+          <w:szCs w:val="18"/>
+        </w:rPr>
+      </w:pPr>
+    </w:p>
+    <w:p>
+      <w:pPr>
+        <w:rPr>
+          <w:rFonts w:ascii="Times New Roman" w:hAnsi="Times New Roman" w:cs="Times New Roman"/>
+          <w:color w:val="000000" w:themeColor="text1"/>
+          <w:spacing w:val="-1"/>
+          <w:sz w:val="18"/>
+          <w:szCs w:val="18"/>
+        </w:rPr>
+      </w:pPr>
+      <w:r>
+        <w:rPr>
+          <w:rFonts w:ascii="Times New Roman" w:hAnsi="Times New Roman" w:cs="Times New Roman"/>
+          <w:color w:val="000000" w:themeColor="text1"/>
+          <w:spacing w:val="-1"/>
+          <w:sz w:val="18"/>
+          <w:szCs w:val="18"/>
+        </w:rPr>
+        <w:t xml:space="preserve">Управление потоком выполнения в программировании — это то, </w:t>
+      </w:r>
+      <w:r>
+        <w:rPr>
+          <w:rFonts w:ascii="Times New Roman" w:hAnsi="Times New Roman" w:cs="Times New Roman"/>
+          <w:b/>
+          <w:bCs/>
+          <w:color w:val="000000" w:themeColor="text1"/>
+          <w:spacing w:val="-1"/>
+          <w:sz w:val="18"/>
+          <w:szCs w:val="18"/>
+        </w:rPr>
+        <w:t>как</w:t>
+      </w:r>
+      <w:r>
+        <w:rPr>
+          <w:rFonts w:ascii="Times New Roman" w:hAnsi="Times New Roman" w:cs="Times New Roman"/>
+          <w:color w:val="000000" w:themeColor="text1"/>
+          <w:spacing w:val="-1"/>
+          <w:sz w:val="18"/>
+          <w:szCs w:val="18"/>
+        </w:rPr>
+        <w:t xml:space="preserve"> определяется порядок выполнения инструкций программы. Вместо следования линейной последовательности, программы могут принимать решения, повторять блоки кода или изменять порядок выполнения в зависимости от </w:t>
+      </w:r>
+      <w:r>
+        <w:rPr>
+          <w:rFonts w:ascii="Times New Roman" w:hAnsi="Times New Roman" w:cs="Times New Roman"/>
+          <w:b/>
+          <w:bCs/>
+          <w:color w:val="000000" w:themeColor="text1"/>
+          <w:spacing w:val="-1"/>
+          <w:sz w:val="18"/>
+          <w:szCs w:val="18"/>
+        </w:rPr>
+        <w:t>определенных условий</w:t>
+      </w:r>
+      <w:r>
+        <w:rPr>
+          <w:rFonts w:ascii="Times New Roman" w:hAnsi="Times New Roman" w:cs="Times New Roman"/>
+          <w:color w:val="000000" w:themeColor="text1"/>
+          <w:spacing w:val="-1"/>
+          <w:sz w:val="18"/>
+          <w:szCs w:val="18"/>
+        </w:rPr>
+        <w:t>. Это достигается с помощью таких структур, как условные операторы (</w:t>
+      </w:r>
+      <w:r>
+        <w:rPr>
+          <w:rFonts w:ascii="Times New Roman" w:hAnsi="Times New Roman" w:cs="Times New Roman"/>
+          <w:b/>
+          <w:bCs/>
+          <w:color w:val="000000" w:themeColor="text1"/>
+          <w:spacing w:val="-1"/>
+          <w:sz w:val="18"/>
+          <w:szCs w:val="18"/>
+        </w:rPr>
+        <w:t>if, else</w:t>
+      </w:r>
+      <w:r>
+        <w:rPr>
+          <w:rFonts w:ascii="Times New Roman" w:hAnsi="Times New Roman" w:cs="Times New Roman"/>
+          <w:color w:val="000000" w:themeColor="text1"/>
+          <w:spacing w:val="-1"/>
+          <w:sz w:val="18"/>
+          <w:szCs w:val="18"/>
+        </w:rPr>
+        <w:t>), циклы (</w:t>
+      </w:r>
+      <w:r>
+        <w:rPr>
+          <w:rFonts w:ascii="Times New Roman" w:hAnsi="Times New Roman" w:cs="Times New Roman"/>
+          <w:b/>
+          <w:bCs/>
+          <w:color w:val="000000" w:themeColor="text1"/>
+          <w:spacing w:val="-1"/>
+          <w:sz w:val="18"/>
+          <w:szCs w:val="18"/>
+        </w:rPr>
+        <w:t>for, while</w:t>
+      </w:r>
+      <w:r>
+        <w:rPr>
+          <w:rFonts w:ascii="Times New Roman" w:hAnsi="Times New Roman" w:cs="Times New Roman"/>
+          <w:color w:val="000000" w:themeColor="text1"/>
+          <w:spacing w:val="-1"/>
+          <w:sz w:val="18"/>
+          <w:szCs w:val="18"/>
+        </w:rPr>
+        <w:t xml:space="preserve">) и управляющие операторы, такие как </w:t>
+      </w:r>
+      <w:r>
+        <w:rPr>
+          <w:rFonts w:ascii="Times New Roman" w:hAnsi="Times New Roman" w:cs="Times New Roman"/>
+          <w:b/>
+          <w:bCs/>
+          <w:color w:val="000000" w:themeColor="text1"/>
+          <w:spacing w:val="-1"/>
+          <w:sz w:val="18"/>
+          <w:szCs w:val="18"/>
+        </w:rPr>
+        <w:t>break</w:t>
+      </w:r>
+      <w:r>
+        <w:rPr>
+          <w:rFonts w:ascii="Times New Roman" w:hAnsi="Times New Roman" w:cs="Times New Roman"/>
+          <w:color w:val="000000" w:themeColor="text1"/>
+          <w:spacing w:val="-1"/>
+          <w:sz w:val="18"/>
+          <w:szCs w:val="18"/>
+        </w:rPr>
+        <w:t xml:space="preserve"> или </w:t>
+      </w:r>
+      <w:r>
+        <w:rPr>
+          <w:rFonts w:ascii="Times New Roman" w:hAnsi="Times New Roman" w:cs="Times New Roman"/>
+          <w:b/>
+          <w:bCs/>
+          <w:color w:val="000000" w:themeColor="text1"/>
+          <w:spacing w:val="-1"/>
+          <w:sz w:val="18"/>
+          <w:szCs w:val="18"/>
+        </w:rPr>
+        <w:t>continue</w:t>
+      </w:r>
+      <w:r>
+        <w:rPr>
+          <w:rFonts w:ascii="Times New Roman" w:hAnsi="Times New Roman" w:cs="Times New Roman"/>
+          <w:color w:val="000000" w:themeColor="text1"/>
+          <w:spacing w:val="-1"/>
+          <w:sz w:val="18"/>
+          <w:szCs w:val="18"/>
+        </w:rPr>
+        <w:t>.</w:t>
+      </w:r>
+    </w:p>
+    <w:p>
+      <w:pPr>
+        <w:rPr>
+          <w:rFonts w:ascii="Times New Roman" w:hAnsi="Times New Roman" w:cs="Times New Roman"/>
+          <w:color w:val="000000" w:themeColor="text1"/>
+          <w:spacing w:val="-1"/>
+          <w:sz w:val="18"/>
+          <w:szCs w:val="18"/>
+        </w:rPr>
+      </w:pPr>
+      <w:r>
+        <w:rPr>
+          <w:rFonts w:ascii="Times New Roman" w:hAnsi="Times New Roman" w:cs="Times New Roman"/>
+          <w:color w:val="000000" w:themeColor="text1"/>
+          <w:spacing w:val="-1"/>
+          <w:sz w:val="18"/>
+          <w:szCs w:val="18"/>
+        </w:rPr>
+        <w:t>Условный оператор в Python (как и во многих других языках программирования) называется if. При его написании необходимо добавить в конце строки выражение сравнения, заканчивающееся двоеточием.</w:t>
       </w:r>
     </w:p>
     <w:p>
@@ -22420,7 +22957,7 @@
                     <pic:cNvPicPr/>
                   </pic:nvPicPr>
                   <pic:blipFill>
-                    <a:blip r:embed="rId39"/>
+                    <a:blip r:embed="rId41"/>
                     <a:stretch>
                       <a:fillRect/>
                     </a:stretch>
@@ -22449,7 +22986,6 @@
           <w:spacing w:val="-1"/>
           <w:sz w:val="18"/>
           <w:szCs w:val="18"/>
-          <w:lang w:val="en-US"/>
         </w:rPr>
       </w:pPr>
       <w:r>
@@ -22494,7 +23030,7 @@
                     <pic:cNvPicPr/>
                   </pic:nvPicPr>
                   <pic:blipFill>
-                    <a:blip r:embed="rId40"/>
+                    <a:blip r:embed="rId42"/>
                     <a:stretch>
                       <a:fillRect/>
                     </a:stretch>
@@ -22525,7 +23061,6 @@
           <w:spacing w:val="-1"/>
           <w:sz w:val="18"/>
           <w:szCs w:val="18"/>
-          <w:lang w:val="en-US"/>
         </w:rPr>
       </w:pPr>
       <w:r>
@@ -22586,6 +23121,7 @@
         <w:rPr>
           <w:noProof/>
         </w:rPr>
+        <w:lastRenderedPageBreak/>
         <w:drawing>
           <wp:inline distT="0" distB="0" distL="0" distR="0" wp14:anchorId="1A58FB8F" wp14:editId="62B768ED">
             <wp:extent cx="3723809" cy="2809524"/>
@@ -22602,7 +23138,7 @@
                     <pic:cNvPicPr/>
                   </pic:nvPicPr>
                   <pic:blipFill>
-                    <a:blip r:embed="rId41"/>
+                    <a:blip r:embed="rId43"/>
                     <a:stretch>
                       <a:fillRect/>
                     </a:stretch>
@@ -22631,7 +23167,6 @@
           <w:spacing w:val="-1"/>
           <w:sz w:val="18"/>
           <w:szCs w:val="18"/>
-          <w:lang w:val="en-US"/>
         </w:rPr>
       </w:pPr>
       <w:r>
@@ -22654,19 +23189,19 @@
           <w:sz w:val="18"/>
           <w:szCs w:val="18"/>
         </w:rPr>
-        <w:t xml:space="preserve"> — это организованные способы хранения и управления наборами информации, позволяющие эффективно использовать их в программе. В Python существует несколько встроенных структур, таких как списки, кортежи, </w:t>
-      </w:r>
-      <w:r>
-        <w:rPr>
-          <w:rFonts w:ascii="Times New Roman" w:hAnsi="Times New Roman" w:cs="Times New Roman"/>
-          <w:color w:val="000000" w:themeColor="text1"/>
+        <w:t xml:space="preserve"> — это организованные способы хранения и управления наборами информации, позволяющие эффективно использовать их в программе. В Python существует несколько встроенных структур, таких как списки, кортежи, множества и словари, каждая из которых обладает специфическими характеристиками, делающими её более подходящей для определённых типов задач. </w:t>
+      </w:r>
+    </w:p>
+    <w:p>
+      <w:pPr>
+        <w:rPr>
+          <w:rFonts w:ascii="Times New Roman" w:hAnsi="Times New Roman" w:cs="Times New Roman"/>
+          <w:color w:val="595959" w:themeColor="text1" w:themeTint="A6"/>
           <w:spacing w:val="-1"/>
           <w:sz w:val="18"/>
           <w:szCs w:val="18"/>
         </w:rPr>
-        <w:lastRenderedPageBreak/>
-        <w:t>множества и словари, каждая из которых обладает специфическими характеристиками, делающими её более подходящей для определённых типов задач. </w:t>
-      </w:r>
+      </w:pPr>
     </w:p>
     <w:p>
       <w:pPr>
@@ -22676,19 +23211,6 @@
           <w:spacing w:val="-1"/>
           <w:sz w:val="18"/>
           <w:szCs w:val="18"/>
-          <w:lang w:val="en-US"/>
-        </w:rPr>
-      </w:pPr>
-    </w:p>
-    <w:p>
-      <w:pPr>
-        <w:rPr>
-          <w:rFonts w:ascii="Times New Roman" w:hAnsi="Times New Roman" w:cs="Times New Roman"/>
-          <w:color w:val="595959" w:themeColor="text1" w:themeTint="A6"/>
-          <w:spacing w:val="-1"/>
-          <w:sz w:val="18"/>
-          <w:szCs w:val="18"/>
-          <w:lang w:val="en-US"/>
         </w:rPr>
       </w:pPr>
     </w:p>
@@ -23976,41 +24498,41 @@
           <w:rFonts w:ascii="Times New Roman" w:hAnsi="Times New Roman" w:cs="Times New Roman"/>
           <w:sz w:val="18"/>
           <w:szCs w:val="18"/>
+        </w:rPr>
+      </w:pPr>
+      <w:r>
+        <w:rPr>
+          <w:rFonts w:ascii="Times New Roman" w:hAnsi="Times New Roman" w:cs="Times New Roman"/>
+          <w:b/>
+          <w:bCs/>
+          <w:sz w:val="18"/>
+          <w:szCs w:val="18"/>
+        </w:rPr>
+        <w:t>Правило:</w:t>
+      </w:r>
+      <w:r>
+        <w:rPr>
+          <w:rFonts w:ascii="Times New Roman" w:hAnsi="Times New Roman" w:cs="Times New Roman"/>
+          <w:sz w:val="18"/>
+          <w:szCs w:val="18"/>
+        </w:rPr>
+        <w:t> not просто инвертирует значение (True → False, False → True).</w:t>
+      </w:r>
+    </w:p>
+    <w:p>
+      <w:pPr>
+        <w:rPr>
+          <w:rFonts w:ascii="Times New Roman" w:hAnsi="Times New Roman" w:cs="Times New Roman"/>
+          <w:sz w:val="18"/>
+          <w:szCs w:val="18"/>
           <w:lang w:val="en-US"/>
         </w:rPr>
       </w:pPr>
       <w:r>
         <w:rPr>
-          <w:rFonts w:ascii="Times New Roman" w:hAnsi="Times New Roman" w:cs="Times New Roman"/>
-          <w:b/>
-          <w:bCs/>
-          <w:sz w:val="18"/>
-          <w:szCs w:val="18"/>
-        </w:rPr>
-        <w:t>Правило:</w:t>
-      </w:r>
-      <w:r>
-        <w:rPr>
-          <w:rFonts w:ascii="Times New Roman" w:hAnsi="Times New Roman" w:cs="Times New Roman"/>
-          <w:sz w:val="18"/>
-          <w:szCs w:val="18"/>
-        </w:rPr>
-        <w:t> not просто инвертирует значение (True → False, False → True).</w:t>
-      </w:r>
-    </w:p>
-    <w:p>
-      <w:pPr>
-        <w:rPr>
-          <w:rFonts w:ascii="Times New Roman" w:hAnsi="Times New Roman" w:cs="Times New Roman"/>
-          <w:sz w:val="18"/>
-          <w:szCs w:val="18"/>
-          <w:lang w:val="en-US"/>
-        </w:rPr>
-      </w:pPr>
-      <w:r>
-        <w:rPr>
           <w:noProof/>
         </w:rPr>
+        <w:lastRenderedPageBreak/>
         <w:drawing>
           <wp:inline distT="0" distB="0" distL="0" distR="0" wp14:anchorId="3F7DFB8F" wp14:editId="5F286B79">
             <wp:extent cx="3409524" cy="1571429"/>
@@ -24027,7 +24549,7 @@
                     <pic:cNvPicPr/>
                   </pic:nvPicPr>
                   <pic:blipFill>
-                    <a:blip r:embed="rId42"/>
+                    <a:blip r:embed="rId44"/>
                     <a:stretch>
                       <a:fillRect/>
                     </a:stretch>
@@ -24092,23 +24614,7 @@
           <w:sz w:val="18"/>
           <w:szCs w:val="18"/>
         </w:rPr>
-        <w:t xml:space="preserve">В Python можно </w:t>
-      </w:r>
-      <w:r>
-        <w:rPr>
-          <w:rFonts w:ascii="Times New Roman" w:hAnsi="Times New Roman" w:cs="Times New Roman"/>
-          <w:sz w:val="18"/>
-          <w:szCs w:val="18"/>
-        </w:rPr>
-        <w:t>использовать! =</w:t>
-      </w:r>
-      <w:r>
-        <w:rPr>
-          <w:rFonts w:ascii="Times New Roman" w:hAnsi="Times New Roman" w:cs="Times New Roman"/>
-          <w:sz w:val="18"/>
-          <w:szCs w:val="18"/>
-        </w:rPr>
-        <w:t> или оператор ^ для булевых значений.</w:t>
+        <w:t>В Python можно использовать! = или оператор ^ для булевых значений.</w:t>
       </w:r>
     </w:p>
     <w:tbl>
@@ -24252,17 +24758,7 @@
                 <w:sz w:val="18"/>
                 <w:szCs w:val="18"/>
               </w:rPr>
-              <w:t>A! =</w:t>
-            </w:r>
-            <w:r>
-              <w:rPr>
-                <w:rFonts w:ascii="Times New Roman" w:hAnsi="Times New Roman" w:cs="Times New Roman"/>
-                <w:b/>
-                <w:bCs/>
-                <w:sz w:val="18"/>
-                <w:szCs w:val="18"/>
-              </w:rPr>
-              <w:t xml:space="preserve"> B</w:t>
+              <w:t>A! = B</w:t>
             </w:r>
           </w:p>
         </w:tc>
@@ -24714,13 +25210,7 @@
         <w:t>.</w:t>
       </w:r>
     </w:p>
-    <w:p>
-      <w:pPr>
-        <w:rPr>
-          <w:lang w:val="en-US"/>
-        </w:rPr>
-      </w:pPr>
-    </w:p>
+    <w:p/>
     <w:p>
       <w:pPr>
         <w:spacing w:after="0"/>
@@ -24733,8 +25223,8 @@
       </w:pPr>
     </w:p>
     <w:sectPr>
-      <w:headerReference w:type="default" r:id="rId43"/>
-      <w:footerReference w:type="default" r:id="rId44"/>
+      <w:headerReference w:type="default" r:id="rId45"/>
+      <w:footerReference w:type="default" r:id="rId46"/>
       <w:pgSz w:w="12240" w:h="20160" w:code="5"/>
       <w:pgMar w:top="1134" w:right="850" w:bottom="1134" w:left="1701" w:header="283" w:footer="397" w:gutter="0"/>
       <w:pgNumType w:start="1"/>
@@ -35102,6 +35592,155 @@
     </w:lvl>
   </w:abstractNum>
   <w:abstractNum w:abstractNumId="78" w15:restartNumberingAfterBreak="0">
+    <w:nsid w:val="780660F7"/>
+    <w:multiLevelType w:val="multilevel"/>
+    <w:tmpl w:val="59EC0DE0"/>
+    <w:lvl w:ilvl="0">
+      <w:start w:val="1"/>
+      <w:numFmt w:val="bullet"/>
+      <w:lvlText w:val=""/>
+      <w:lvlJc w:val="left"/>
+      <w:pPr>
+        <w:tabs>
+          <w:tab w:val="num" w:pos="720"/>
+        </w:tabs>
+        <w:ind w:left="720" w:hanging="360"/>
+      </w:pPr>
+      <w:rPr>
+        <w:rFonts w:ascii="Symbol" w:hAnsi="Symbol" w:hint="default"/>
+        <w:sz w:val="20"/>
+      </w:rPr>
+    </w:lvl>
+    <w:lvl w:ilvl="1" w:tentative="1">
+      <w:start w:val="1"/>
+      <w:numFmt w:val="bullet"/>
+      <w:lvlText w:val=""/>
+      <w:lvlJc w:val="left"/>
+      <w:pPr>
+        <w:tabs>
+          <w:tab w:val="num" w:pos="1440"/>
+        </w:tabs>
+        <w:ind w:left="1440" w:hanging="360"/>
+      </w:pPr>
+      <w:rPr>
+        <w:rFonts w:ascii="Symbol" w:hAnsi="Symbol" w:hint="default"/>
+        <w:sz w:val="20"/>
+      </w:rPr>
+    </w:lvl>
+    <w:lvl w:ilvl="2" w:tentative="1">
+      <w:start w:val="1"/>
+      <w:numFmt w:val="bullet"/>
+      <w:lvlText w:val=""/>
+      <w:lvlJc w:val="left"/>
+      <w:pPr>
+        <w:tabs>
+          <w:tab w:val="num" w:pos="2160"/>
+        </w:tabs>
+        <w:ind w:left="2160" w:hanging="360"/>
+      </w:pPr>
+      <w:rPr>
+        <w:rFonts w:ascii="Symbol" w:hAnsi="Symbol" w:hint="default"/>
+        <w:sz w:val="20"/>
+      </w:rPr>
+    </w:lvl>
+    <w:lvl w:ilvl="3" w:tentative="1">
+      <w:start w:val="1"/>
+      <w:numFmt w:val="bullet"/>
+      <w:lvlText w:val=""/>
+      <w:lvlJc w:val="left"/>
+      <w:pPr>
+        <w:tabs>
+          <w:tab w:val="num" w:pos="2880"/>
+        </w:tabs>
+        <w:ind w:left="2880" w:hanging="360"/>
+      </w:pPr>
+      <w:rPr>
+        <w:rFonts w:ascii="Symbol" w:hAnsi="Symbol" w:hint="default"/>
+        <w:sz w:val="20"/>
+      </w:rPr>
+    </w:lvl>
+    <w:lvl w:ilvl="4" w:tentative="1">
+      <w:start w:val="1"/>
+      <w:numFmt w:val="bullet"/>
+      <w:lvlText w:val=""/>
+      <w:lvlJc w:val="left"/>
+      <w:pPr>
+        <w:tabs>
+          <w:tab w:val="num" w:pos="3600"/>
+        </w:tabs>
+        <w:ind w:left="3600" w:hanging="360"/>
+      </w:pPr>
+      <w:rPr>
+        <w:rFonts w:ascii="Symbol" w:hAnsi="Symbol" w:hint="default"/>
+        <w:sz w:val="20"/>
+      </w:rPr>
+    </w:lvl>
+    <w:lvl w:ilvl="5" w:tentative="1">
+      <w:start w:val="1"/>
+      <w:numFmt w:val="bullet"/>
+      <w:lvlText w:val=""/>
+      <w:lvlJc w:val="left"/>
+      <w:pPr>
+        <w:tabs>
+          <w:tab w:val="num" w:pos="4320"/>
+        </w:tabs>
+        <w:ind w:left="4320" w:hanging="360"/>
+      </w:pPr>
+      <w:rPr>
+        <w:rFonts w:ascii="Symbol" w:hAnsi="Symbol" w:hint="default"/>
+        <w:sz w:val="20"/>
+      </w:rPr>
+    </w:lvl>
+    <w:lvl w:ilvl="6" w:tentative="1">
+      <w:start w:val="1"/>
+      <w:numFmt w:val="bullet"/>
+      <w:lvlText w:val=""/>
+      <w:lvlJc w:val="left"/>
+      <w:pPr>
+        <w:tabs>
+          <w:tab w:val="num" w:pos="5040"/>
+        </w:tabs>
+        <w:ind w:left="5040" w:hanging="360"/>
+      </w:pPr>
+      <w:rPr>
+        <w:rFonts w:ascii="Symbol" w:hAnsi="Symbol" w:hint="default"/>
+        <w:sz w:val="20"/>
+      </w:rPr>
+    </w:lvl>
+    <w:lvl w:ilvl="7" w:tentative="1">
+      <w:start w:val="1"/>
+      <w:numFmt w:val="bullet"/>
+      <w:lvlText w:val=""/>
+      <w:lvlJc w:val="left"/>
+      <w:pPr>
+        <w:tabs>
+          <w:tab w:val="num" w:pos="5760"/>
+        </w:tabs>
+        <w:ind w:left="5760" w:hanging="360"/>
+      </w:pPr>
+      <w:rPr>
+        <w:rFonts w:ascii="Symbol" w:hAnsi="Symbol" w:hint="default"/>
+        <w:sz w:val="20"/>
+      </w:rPr>
+    </w:lvl>
+    <w:lvl w:ilvl="8" w:tentative="1">
+      <w:start w:val="1"/>
+      <w:numFmt w:val="bullet"/>
+      <w:lvlText w:val=""/>
+      <w:lvlJc w:val="left"/>
+      <w:pPr>
+        <w:tabs>
+          <w:tab w:val="num" w:pos="6480"/>
+        </w:tabs>
+        <w:ind w:left="6480" w:hanging="360"/>
+      </w:pPr>
+      <w:rPr>
+        <w:rFonts w:ascii="Symbol" w:hAnsi="Symbol" w:hint="default"/>
+        <w:sz w:val="20"/>
+      </w:rPr>
+    </w:lvl>
+  </w:abstractNum>
+  <w:abstractNum w:abstractNumId="79" w15:restartNumberingAfterBreak="0">
     <w:nsid w:val="79306BAB"/>
     <w:multiLevelType w:val="multilevel"/>
     <w:tmpl w:val="778EECBA"/>
@@ -35214,7 +35853,156 @@
       </w:pPr>
     </w:lvl>
   </w:abstractNum>
-  <w:abstractNum w:abstractNumId="79" w15:restartNumberingAfterBreak="0">
+  <w:abstractNum w:abstractNumId="80" w15:restartNumberingAfterBreak="0">
+    <w:nsid w:val="79451AE8"/>
+    <w:multiLevelType w:val="multilevel"/>
+    <w:tmpl w:val="B36A7532"/>
+    <w:lvl w:ilvl="0">
+      <w:start w:val="1"/>
+      <w:numFmt w:val="bullet"/>
+      <w:lvlText w:val=""/>
+      <w:lvlJc w:val="left"/>
+      <w:pPr>
+        <w:tabs>
+          <w:tab w:val="num" w:pos="720"/>
+        </w:tabs>
+        <w:ind w:left="720" w:hanging="360"/>
+      </w:pPr>
+      <w:rPr>
+        <w:rFonts w:ascii="Symbol" w:hAnsi="Symbol" w:hint="default"/>
+        <w:sz w:val="20"/>
+      </w:rPr>
+    </w:lvl>
+    <w:lvl w:ilvl="1">
+      <w:start w:val="1"/>
+      <w:numFmt w:val="bullet"/>
+      <w:lvlText w:val=""/>
+      <w:lvlJc w:val="left"/>
+      <w:pPr>
+        <w:tabs>
+          <w:tab w:val="num" w:pos="1440"/>
+        </w:tabs>
+        <w:ind w:left="1440" w:hanging="360"/>
+      </w:pPr>
+      <w:rPr>
+        <w:rFonts w:ascii="Symbol" w:hAnsi="Symbol" w:hint="default"/>
+        <w:sz w:val="20"/>
+      </w:rPr>
+    </w:lvl>
+    <w:lvl w:ilvl="2" w:tentative="1">
+      <w:start w:val="1"/>
+      <w:numFmt w:val="bullet"/>
+      <w:lvlText w:val=""/>
+      <w:lvlJc w:val="left"/>
+      <w:pPr>
+        <w:tabs>
+          <w:tab w:val="num" w:pos="2160"/>
+        </w:tabs>
+        <w:ind w:left="2160" w:hanging="360"/>
+      </w:pPr>
+      <w:rPr>
+        <w:rFonts w:ascii="Symbol" w:hAnsi="Symbol" w:hint="default"/>
+        <w:sz w:val="20"/>
+      </w:rPr>
+    </w:lvl>
+    <w:lvl w:ilvl="3" w:tentative="1">
+      <w:start w:val="1"/>
+      <w:numFmt w:val="bullet"/>
+      <w:lvlText w:val=""/>
+      <w:lvlJc w:val="left"/>
+      <w:pPr>
+        <w:tabs>
+          <w:tab w:val="num" w:pos="2880"/>
+        </w:tabs>
+        <w:ind w:left="2880" w:hanging="360"/>
+      </w:pPr>
+      <w:rPr>
+        <w:rFonts w:ascii="Symbol" w:hAnsi="Symbol" w:hint="default"/>
+        <w:sz w:val="20"/>
+      </w:rPr>
+    </w:lvl>
+    <w:lvl w:ilvl="4" w:tentative="1">
+      <w:start w:val="1"/>
+      <w:numFmt w:val="bullet"/>
+      <w:lvlText w:val=""/>
+      <w:lvlJc w:val="left"/>
+      <w:pPr>
+        <w:tabs>
+          <w:tab w:val="num" w:pos="3600"/>
+        </w:tabs>
+        <w:ind w:left="3600" w:hanging="360"/>
+      </w:pPr>
+      <w:rPr>
+        <w:rFonts w:ascii="Symbol" w:hAnsi="Symbol" w:hint="default"/>
+        <w:sz w:val="20"/>
+      </w:rPr>
+    </w:lvl>
+    <w:lvl w:ilvl="5" w:tentative="1">
+      <w:start w:val="1"/>
+      <w:numFmt w:val="bullet"/>
+      <w:lvlText w:val=""/>
+      <w:lvlJc w:val="left"/>
+      <w:pPr>
+        <w:tabs>
+          <w:tab w:val="num" w:pos="4320"/>
+        </w:tabs>
+        <w:ind w:left="4320" w:hanging="360"/>
+      </w:pPr>
+      <w:rPr>
+        <w:rFonts w:ascii="Symbol" w:hAnsi="Symbol" w:hint="default"/>
+        <w:sz w:val="20"/>
+      </w:rPr>
+    </w:lvl>
+    <w:lvl w:ilvl="6" w:tentative="1">
+      <w:start w:val="1"/>
+      <w:numFmt w:val="bullet"/>
+      <w:lvlText w:val=""/>
+      <w:lvlJc w:val="left"/>
+      <w:pPr>
+        <w:tabs>
+          <w:tab w:val="num" w:pos="5040"/>
+        </w:tabs>
+        <w:ind w:left="5040" w:hanging="360"/>
+      </w:pPr>
+      <w:rPr>
+        <w:rFonts w:ascii="Symbol" w:hAnsi="Symbol" w:hint="default"/>
+        <w:sz w:val="20"/>
+      </w:rPr>
+    </w:lvl>
+    <w:lvl w:ilvl="7" w:tentative="1">
+      <w:start w:val="1"/>
+      <w:numFmt w:val="bullet"/>
+      <w:lvlText w:val=""/>
+      <w:lvlJc w:val="left"/>
+      <w:pPr>
+        <w:tabs>
+          <w:tab w:val="num" w:pos="5760"/>
+        </w:tabs>
+        <w:ind w:left="5760" w:hanging="360"/>
+      </w:pPr>
+      <w:rPr>
+        <w:rFonts w:ascii="Symbol" w:hAnsi="Symbol" w:hint="default"/>
+        <w:sz w:val="20"/>
+      </w:rPr>
+    </w:lvl>
+    <w:lvl w:ilvl="8" w:tentative="1">
+      <w:start w:val="1"/>
+      <w:numFmt w:val="bullet"/>
+      <w:lvlText w:val=""/>
+      <w:lvlJc w:val="left"/>
+      <w:pPr>
+        <w:tabs>
+          <w:tab w:val="num" w:pos="6480"/>
+        </w:tabs>
+        <w:ind w:left="6480" w:hanging="360"/>
+      </w:pPr>
+      <w:rPr>
+        <w:rFonts w:ascii="Symbol" w:hAnsi="Symbol" w:hint="default"/>
+        <w:sz w:val="20"/>
+      </w:rPr>
+    </w:lvl>
+  </w:abstractNum>
+  <w:abstractNum w:abstractNumId="81" w15:restartNumberingAfterBreak="0">
     <w:nsid w:val="7A52735D"/>
     <w:multiLevelType w:val="multilevel"/>
     <w:tmpl w:val="FD2069AA"/>
@@ -35363,7 +36151,7 @@
       </w:rPr>
     </w:lvl>
   </w:abstractNum>
-  <w:abstractNum w:abstractNumId="80" w15:restartNumberingAfterBreak="0">
+  <w:abstractNum w:abstractNumId="82" w15:restartNumberingAfterBreak="0">
     <w:nsid w:val="7A66745B"/>
     <w:multiLevelType w:val="hybridMultilevel"/>
     <w:tmpl w:val="36049AF4"/>
@@ -35476,7 +36264,7 @@
       </w:rPr>
     </w:lvl>
   </w:abstractNum>
-  <w:abstractNum w:abstractNumId="81" w15:restartNumberingAfterBreak="0">
+  <w:abstractNum w:abstractNumId="83" w15:restartNumberingAfterBreak="0">
     <w:nsid w:val="7D0157C4"/>
     <w:multiLevelType w:val="multilevel"/>
     <w:tmpl w:val="84EEFCB6"/>
@@ -35625,7 +36413,7 @@
       </w:rPr>
     </w:lvl>
   </w:abstractNum>
-  <w:abstractNum w:abstractNumId="82" w15:restartNumberingAfterBreak="0">
+  <w:abstractNum w:abstractNumId="84" w15:restartNumberingAfterBreak="0">
     <w:nsid w:val="7F1B7409"/>
     <w:multiLevelType w:val="multilevel"/>
     <w:tmpl w:val="812289E2"/>
@@ -35774,7 +36562,7 @@
       </w:rPr>
     </w:lvl>
   </w:abstractNum>
-  <w:abstractNum w:abstractNumId="83" w15:restartNumberingAfterBreak="0">
+  <w:abstractNum w:abstractNumId="85" w15:restartNumberingAfterBreak="0">
     <w:nsid w:val="7F604749"/>
     <w:multiLevelType w:val="multilevel"/>
     <w:tmpl w:val="F6C69AC2"/>
@@ -35923,7 +36711,7 @@
       </w:rPr>
     </w:lvl>
   </w:abstractNum>
-  <w:abstractNum w:abstractNumId="84" w15:restartNumberingAfterBreak="0">
+  <w:abstractNum w:abstractNumId="86" w15:restartNumberingAfterBreak="0">
     <w:nsid w:val="7FC8764C"/>
     <w:multiLevelType w:val="hybridMultilevel"/>
     <w:tmpl w:val="15723472"/>
@@ -36040,13 +36828,13 @@
     <w:abstractNumId w:val="49"/>
   </w:num>
   <w:num w:numId="2" w16cid:durableId="950435201">
-    <w:abstractNumId w:val="84"/>
+    <w:abstractNumId w:val="86"/>
   </w:num>
   <w:num w:numId="3" w16cid:durableId="263539178">
     <w:abstractNumId w:val="61"/>
   </w:num>
   <w:num w:numId="4" w16cid:durableId="90973326">
-    <w:abstractNumId w:val="80"/>
+    <w:abstractNumId w:val="82"/>
   </w:num>
   <w:num w:numId="5" w16cid:durableId="1117528000">
     <w:abstractNumId w:val="39"/>
@@ -36088,10 +36876,10 @@
     <w:abstractNumId w:val="70"/>
   </w:num>
   <w:num w:numId="18" w16cid:durableId="1177386414">
-    <w:abstractNumId w:val="83"/>
+    <w:abstractNumId w:val="85"/>
   </w:num>
   <w:num w:numId="19" w16cid:durableId="898983118">
-    <w:abstractNumId w:val="81"/>
+    <w:abstractNumId w:val="83"/>
   </w:num>
   <w:num w:numId="20" w16cid:durableId="1925187318">
     <w:abstractNumId w:val="46"/>
@@ -36151,13 +36939,13 @@
     <w:abstractNumId w:val="66"/>
   </w:num>
   <w:num w:numId="39" w16cid:durableId="31465451">
-    <w:abstractNumId w:val="79"/>
+    <w:abstractNumId w:val="81"/>
   </w:num>
   <w:num w:numId="40" w16cid:durableId="494348183">
     <w:abstractNumId w:val="36"/>
   </w:num>
   <w:num w:numId="41" w16cid:durableId="356124465">
-    <w:abstractNumId w:val="82"/>
+    <w:abstractNumId w:val="84"/>
   </w:num>
   <w:num w:numId="42" w16cid:durableId="438139090">
     <w:abstractNumId w:val="21"/>
@@ -36175,7 +36963,7 @@
     <w:abstractNumId w:val="54"/>
   </w:num>
   <w:num w:numId="47" w16cid:durableId="708385342">
-    <w:abstractNumId w:val="78"/>
+    <w:abstractNumId w:val="79"/>
   </w:num>
   <w:num w:numId="48" w16cid:durableId="470095744">
     <w:abstractNumId w:val="62"/>
@@ -36290,6 +37078,12 @@
   </w:num>
   <w:num w:numId="85" w16cid:durableId="1644001138">
     <w:abstractNumId w:val="16"/>
+  </w:num>
+  <w:num w:numId="86" w16cid:durableId="1118259504">
+    <w:abstractNumId w:val="78"/>
+  </w:num>
+  <w:num w:numId="87" w16cid:durableId="1189176815">
+    <w:abstractNumId w:val="80"/>
   </w:num>
 </w:numbering>
 </file>

</xml_diff>

<commit_message>
28.04.26 list changes: aqa
</commit_message>
<xml_diff>
--- a/AQA/Roadmap/aqa подготовка.docx
+++ b/AQA/Roadmap/aqa подготовка.docx
@@ -1275,7 +1275,7 @@
             <w:sz w:val="20"/>
             <w:szCs w:val="20"/>
           </w:rPr>
-          <w:t>Структуры</w:t>
+          <w:t xml:space="preserve">Структуры </w:t>
         </w:r>
         <w:r>
           <w:rPr>
@@ -1285,7 +1285,7 @@
             <w:sz w:val="20"/>
             <w:szCs w:val="20"/>
           </w:rPr>
-          <w:t xml:space="preserve"> </w:t>
+          <w:t>д</w:t>
         </w:r>
         <w:r>
           <w:rPr>
@@ -1295,7 +1295,7 @@
             <w:sz w:val="20"/>
             <w:szCs w:val="20"/>
           </w:rPr>
-          <w:t>данных</w:t>
+          <w:t>анных</w:t>
         </w:r>
       </w:hyperlink>
     </w:p>
@@ -16199,46 +16199,51 @@
           <w:rFonts w:ascii="Times New Roman" w:hAnsi="Times New Roman" w:cs="Times New Roman"/>
           <w:b/>
           <w:bCs/>
-          <w:color w:val="767171" w:themeColor="background2" w:themeShade="80"/>
+          <w:color w:val="7F7F7F" w:themeColor="text1" w:themeTint="80"/>
           <w:sz w:val="20"/>
           <w:szCs w:val="20"/>
         </w:rPr>
       </w:pPr>
-      <w:r>
-        <w:rPr>
-          <w:rFonts w:ascii="Times New Roman" w:hAnsi="Times New Roman" w:cs="Times New Roman"/>
-          <w:b/>
-          <w:bCs/>
-          <w:color w:val="767171" w:themeColor="background2" w:themeShade="80"/>
-          <w:sz w:val="20"/>
-          <w:szCs w:val="20"/>
-          <w:lang w:val="en-US"/>
-        </w:rPr>
-        <w:t>Garbage</w:t>
-      </w:r>
-      <w:r>
-        <w:rPr>
-          <w:rFonts w:ascii="Times New Roman" w:hAnsi="Times New Roman" w:cs="Times New Roman"/>
-          <w:b/>
-          <w:bCs/>
-          <w:color w:val="767171" w:themeColor="background2" w:themeShade="80"/>
-          <w:sz w:val="20"/>
-          <w:szCs w:val="20"/>
-        </w:rPr>
-        <w:t xml:space="preserve"> </w:t>
-      </w:r>
-      <w:r>
-        <w:rPr>
-          <w:rFonts w:ascii="Times New Roman" w:hAnsi="Times New Roman" w:cs="Times New Roman"/>
-          <w:b/>
-          <w:bCs/>
-          <w:color w:val="767171" w:themeColor="background2" w:themeShade="80"/>
-          <w:sz w:val="20"/>
-          <w:szCs w:val="20"/>
-          <w:lang w:val="en-US"/>
-        </w:rPr>
-        <w:t>Collector</w:t>
-      </w:r>
+      <w:hyperlink r:id="rId30" w:history="1">
+        <w:r>
+          <w:rPr>
+            <w:rStyle w:val="a3"/>
+            <w:rFonts w:ascii="Times New Roman" w:hAnsi="Times New Roman" w:cs="Times New Roman"/>
+            <w:b/>
+            <w:bCs/>
+            <w:color w:val="7F7F7F" w:themeColor="text1" w:themeTint="80"/>
+            <w:sz w:val="20"/>
+            <w:szCs w:val="20"/>
+            <w:lang w:val="en-US"/>
+          </w:rPr>
+          <w:t>Garbage</w:t>
+        </w:r>
+        <w:r>
+          <w:rPr>
+            <w:rStyle w:val="a3"/>
+            <w:rFonts w:ascii="Times New Roman" w:hAnsi="Times New Roman" w:cs="Times New Roman"/>
+            <w:b/>
+            <w:bCs/>
+            <w:color w:val="7F7F7F" w:themeColor="text1" w:themeTint="80"/>
+            <w:sz w:val="20"/>
+            <w:szCs w:val="20"/>
+          </w:rPr>
+          <w:t xml:space="preserve"> </w:t>
+        </w:r>
+        <w:r>
+          <w:rPr>
+            <w:rStyle w:val="a3"/>
+            <w:rFonts w:ascii="Times New Roman" w:hAnsi="Times New Roman" w:cs="Times New Roman"/>
+            <w:b/>
+            <w:bCs/>
+            <w:color w:val="7F7F7F" w:themeColor="text1" w:themeTint="80"/>
+            <w:sz w:val="20"/>
+            <w:szCs w:val="20"/>
+            <w:lang w:val="en-US"/>
+          </w:rPr>
+          <w:t>Collector</w:t>
+        </w:r>
+      </w:hyperlink>
     </w:p>
     <w:p>
       <w:pPr>
@@ -16480,7 +16485,7 @@
                     <pic:cNvPicPr/>
                   </pic:nvPicPr>
                   <pic:blipFill>
-                    <a:blip r:embed="rId30"/>
+                    <a:blip r:embed="rId31"/>
                     <a:stretch>
                       <a:fillRect/>
                     </a:stretch>
@@ -17115,7 +17120,7 @@
                     <pic:cNvPicPr/>
                   </pic:nvPicPr>
                   <pic:blipFill>
-                    <a:blip r:embed="rId31"/>
+                    <a:blip r:embed="rId32"/>
                     <a:stretch>
                       <a:fillRect/>
                     </a:stretch>
@@ -17355,7 +17360,7 @@
                     <pic:cNvPicPr/>
                   </pic:nvPicPr>
                   <pic:blipFill>
-                    <a:blip r:embed="rId32"/>
+                    <a:blip r:embed="rId33"/>
                     <a:stretch>
                       <a:fillRect/>
                     </a:stretch>
@@ -17523,7 +17528,7 @@
                     <pic:cNvPicPr/>
                   </pic:nvPicPr>
                   <pic:blipFill>
-                    <a:blip r:embed="rId33"/>
+                    <a:blip r:embed="rId34"/>
                     <a:stretch>
                       <a:fillRect/>
                     </a:stretch>
@@ -17724,7 +17729,7 @@
                     <pic:cNvPicPr/>
                   </pic:nvPicPr>
                   <pic:blipFill>
-                    <a:blip r:embed="rId34"/>
+                    <a:blip r:embed="rId35"/>
                     <a:stretch>
                       <a:fillRect/>
                     </a:stretch>
@@ -17920,7 +17925,7 @@
                     <pic:cNvPicPr/>
                   </pic:nvPicPr>
                   <pic:blipFill>
-                    <a:blip r:embed="rId35"/>
+                    <a:blip r:embed="rId36"/>
                     <a:stretch>
                       <a:fillRect/>
                     </a:stretch>
@@ -21120,7 +21125,7 @@
         </w:rPr>
         <w:t>Интерпретация этих битов зависит от языка программирования, который хранит в памяти не только сами данные, но и различные </w:t>
       </w:r>
-      <w:hyperlink r:id="rId36" w:anchor="fn:2" w:history="1">
+      <w:hyperlink r:id="rId37" w:anchor="fn:2" w:history="1">
         <w:r>
           <w:rPr>
             <w:rStyle w:val="a3"/>
@@ -21480,7 +21485,7 @@
                     <pic:cNvPicPr/>
                   </pic:nvPicPr>
                   <pic:blipFill>
-                    <a:blip r:embed="rId37"/>
+                    <a:blip r:embed="rId38"/>
                     <a:stretch>
                       <a:fillRect/>
                     </a:stretch>
@@ -21584,7 +21589,7 @@
                     <pic:cNvPicPr/>
                   </pic:nvPicPr>
                   <pic:blipFill>
-                    <a:blip r:embed="rId38"/>
+                    <a:blip r:embed="rId39"/>
                     <a:stretch>
                       <a:fillRect/>
                     </a:stretch>
@@ -22225,7 +22230,7 @@
                           <pic:cNvPicPr/>
                         </pic:nvPicPr>
                         <pic:blipFill>
-                          <a:blip r:embed="rId39"/>
+                          <a:blip r:embed="rId40"/>
                           <a:stretch>
                             <a:fillRect/>
                           </a:stretch>
@@ -22439,7 +22444,7 @@
                           <pic:cNvPicPr/>
                         </pic:nvPicPr>
                         <pic:blipFill>
-                          <a:blip r:embed="rId40"/>
+                          <a:blip r:embed="rId41"/>
                           <a:stretch>
                             <a:fillRect/>
                           </a:stretch>
@@ -23088,7 +23093,7 @@
                     <pic:cNvPicPr/>
                   </pic:nvPicPr>
                   <pic:blipFill>
-                    <a:blip r:embed="rId41"/>
+                    <a:blip r:embed="rId42"/>
                     <a:stretch>
                       <a:fillRect/>
                     </a:stretch>
@@ -23169,7 +23174,7 @@
                     <pic:cNvPicPr/>
                   </pic:nvPicPr>
                   <pic:blipFill>
-                    <a:blip r:embed="rId42"/>
+                    <a:blip r:embed="rId43"/>
                     <a:stretch>
                       <a:fillRect/>
                     </a:stretch>
@@ -23283,7 +23288,7 @@
                     <pic:cNvPicPr/>
                   </pic:nvPicPr>
                   <pic:blipFill>
-                    <a:blip r:embed="rId43"/>
+                    <a:blip r:embed="rId44"/>
                     <a:stretch>
                       <a:fillRect/>
                     </a:stretch>
@@ -24680,7 +24685,7 @@
                     <pic:cNvPicPr/>
                   </pic:nvPicPr>
                   <pic:blipFill>
-                    <a:blip r:embed="rId44"/>
+                    <a:blip r:embed="rId45"/>
                     <a:stretch>
                       <a:fillRect/>
                     </a:stretch>
@@ -24746,7 +24751,7 @@
                     <pic:cNvPicPr/>
                   </pic:nvPicPr>
                   <pic:blipFill>
-                    <a:blip r:embed="rId45"/>
+                    <a:blip r:embed="rId46"/>
                     <a:stretch>
                       <a:fillRect/>
                     </a:stretch>
@@ -25481,7 +25486,7 @@
                     <pic:cNvPicPr/>
                   </pic:nvPicPr>
                   <pic:blipFill>
-                    <a:blip r:embed="rId46"/>
+                    <a:blip r:embed="rId47"/>
                     <a:stretch>
                       <a:fillRect/>
                     </a:stretch>
@@ -25668,7 +25673,7 @@
                     <pic:cNvPicPr/>
                   </pic:nvPicPr>
                   <pic:blipFill>
-                    <a:blip r:embed="rId47"/>
+                    <a:blip r:embed="rId48"/>
                     <a:stretch>
                       <a:fillRect/>
                     </a:stretch>
@@ -25909,7 +25914,7 @@
                     <pic:cNvPicPr/>
                   </pic:nvPicPr>
                   <pic:blipFill>
-                    <a:blip r:embed="rId48"/>
+                    <a:blip r:embed="rId49"/>
                     <a:stretch>
                       <a:fillRect/>
                     </a:stretch>
@@ -26044,7 +26049,7 @@
                     <pic:cNvPicPr/>
                   </pic:nvPicPr>
                   <pic:blipFill>
-                    <a:blip r:embed="rId49"/>
+                    <a:blip r:embed="rId50"/>
                     <a:stretch>
                       <a:fillRect/>
                     </a:stretch>
@@ -26141,7 +26146,6 @@
           <w:spacing w:val="-1"/>
           <w:sz w:val="18"/>
           <w:szCs w:val="18"/>
-          <w:lang w:val="en-US"/>
         </w:rPr>
       </w:pPr>
       <w:r>
@@ -26483,7 +26487,7 @@
                     <pic:cNvPicPr/>
                   </pic:nvPicPr>
                   <pic:blipFill>
-                    <a:blip r:embed="rId50"/>
+                    <a:blip r:embed="rId51"/>
                     <a:stretch>
                       <a:fillRect/>
                     </a:stretch>
@@ -26533,7 +26537,6 @@
           <w:spacing w:val="-1"/>
           <w:sz w:val="18"/>
           <w:szCs w:val="18"/>
-          <w:lang w:val="en-US"/>
         </w:rPr>
       </w:pPr>
       <w:r>
@@ -26557,7 +26560,6 @@
           <w:spacing w:val="-1"/>
           <w:sz w:val="18"/>
           <w:szCs w:val="18"/>
-          <w:lang w:val="en-US"/>
         </w:rPr>
         <w:t xml:space="preserve"> </w:t>
       </w:r>
@@ -26582,7 +26584,6 @@
           <w:spacing w:val="-1"/>
           <w:sz w:val="18"/>
           <w:szCs w:val="18"/>
-          <w:lang w:val="en-US"/>
         </w:rPr>
       </w:pPr>
       <w:r>
@@ -26826,7 +26827,6 @@
           <w:spacing w:val="-1"/>
           <w:sz w:val="18"/>
           <w:szCs w:val="18"/>
-          <w:lang w:val="en-US"/>
         </w:rPr>
       </w:pPr>
       <w:r>
@@ -27563,27 +27563,7 @@
           <w:sz w:val="18"/>
           <w:szCs w:val="18"/>
         </w:rPr>
-        <w:t>к</w:t>
-      </w:r>
-      <w:r>
-        <w:rPr>
-          <w:rFonts w:ascii="Times New Roman" w:hAnsi="Times New Roman" w:cs="Times New Roman"/>
-          <w:color w:val="595959" w:themeColor="text1" w:themeTint="A6"/>
-          <w:spacing w:val="-1"/>
-          <w:sz w:val="18"/>
-          <w:szCs w:val="18"/>
-        </w:rPr>
-        <w:t>оличество раз, которое значение встречается в списке</w:t>
-      </w:r>
-      <w:r>
-        <w:rPr>
-          <w:rFonts w:ascii="Times New Roman" w:hAnsi="Times New Roman" w:cs="Times New Roman"/>
-          <w:color w:val="595959" w:themeColor="text1" w:themeTint="A6"/>
-          <w:spacing w:val="-1"/>
-          <w:sz w:val="18"/>
-          <w:szCs w:val="18"/>
-        </w:rPr>
-        <w:t xml:space="preserve"> </w:t>
+        <w:t xml:space="preserve">количество раз, которое значение встречается в списке </w:t>
       </w:r>
       <w:proofErr w:type="gramStart"/>
       <w:r>
@@ -27842,18 +27822,7 @@
           <w:szCs w:val="18"/>
           <w:lang w:val="en-US"/>
         </w:rPr>
-        <w:t xml:space="preserve"> (</w:t>
-      </w:r>
-      <w:r>
-        <w:rPr>
-          <w:rFonts w:ascii="Times New Roman" w:hAnsi="Times New Roman" w:cs="Times New Roman"/>
-          <w:color w:val="595959" w:themeColor="text1" w:themeTint="A6"/>
-          <w:spacing w:val="-1"/>
-          <w:sz w:val="18"/>
-          <w:szCs w:val="18"/>
-          <w:lang w:val="en-US"/>
-        </w:rPr>
-        <w:t>list of lists)</w:t>
+        <w:t xml:space="preserve"> (list of lists)</w:t>
       </w:r>
     </w:p>
     <w:p>
@@ -27886,7 +27855,7 @@
                     <pic:cNvPicPr/>
                   </pic:nvPicPr>
                   <pic:blipFill>
-                    <a:blip r:embed="rId51"/>
+                    <a:blip r:embed="rId52"/>
                     <a:stretch>
                       <a:fillRect/>
                     </a:stretch>
@@ -27996,7 +27965,68 @@
           <w:sz w:val="18"/>
           <w:szCs w:val="18"/>
         </w:rPr>
-        <w:t>'Cata</w:t>
+        <w:t>'Cata’</w:t>
+      </w:r>
+      <w:r>
+        <w:rPr>
+          <w:rFonts w:ascii="Times New Roman" w:hAnsi="Times New Roman" w:cs="Times New Roman"/>
+          <w:color w:val="000000" w:themeColor="text1"/>
+          <w:spacing w:val="-1"/>
+          <w:sz w:val="18"/>
+          <w:szCs w:val="18"/>
+        </w:rPr>
+        <w:t xml:space="preserve">,                                  </w:t>
+      </w:r>
+      <w:r>
+        <w:rPr>
+          <w:rFonts w:ascii="Times New Roman" w:hAnsi="Times New Roman" w:cs="Times New Roman"/>
+          <w:color w:val="000000" w:themeColor="text1"/>
+          <w:spacing w:val="-1"/>
+          <w:sz w:val="18"/>
+          <w:szCs w:val="18"/>
+        </w:rPr>
+        <w:tab/>
+      </w:r>
+      <w:r>
+        <w:rPr>
+          <w:rFonts w:ascii="Times New Roman" w:hAnsi="Times New Roman" w:cs="Times New Roman"/>
+          <w:color w:val="000000" w:themeColor="text1"/>
+          <w:spacing w:val="-1"/>
+          <w:sz w:val="18"/>
+          <w:szCs w:val="18"/>
+        </w:rPr>
+        <w:t xml:space="preserve"># </w:t>
+      </w:r>
+      <w:r>
+        <w:rPr>
+          <w:rFonts w:ascii="Times New Roman" w:hAnsi="Times New Roman" w:cs="Times New Roman"/>
+          <w:color w:val="595959" w:themeColor="text1" w:themeTint="A6"/>
+          <w:spacing w:val="-1"/>
+          <w:sz w:val="18"/>
+          <w:szCs w:val="18"/>
+        </w:rPr>
+        <w:t>индекс 0</w:t>
+      </w:r>
+    </w:p>
+    <w:p>
+      <w:pPr>
+        <w:rPr>
+          <w:rFonts w:ascii="Times New Roman" w:hAnsi="Times New Roman" w:cs="Times New Roman"/>
+          <w:color w:val="000000" w:themeColor="text1"/>
+          <w:spacing w:val="-1"/>
+          <w:sz w:val="18"/>
+          <w:szCs w:val="18"/>
+        </w:rPr>
+      </w:pPr>
+      <w:r>
+        <w:rPr>
+          <w:rFonts w:ascii="Times New Roman" w:hAnsi="Times New Roman" w:cs="Times New Roman"/>
+          <w:color w:val="000000" w:themeColor="text1"/>
+          <w:spacing w:val="-1"/>
+          <w:sz w:val="18"/>
+          <w:szCs w:val="18"/>
+        </w:rPr>
+        <w:t xml:space="preserve">    [</w:t>
       </w:r>
       <w:r>
         <w:rPr>
@@ -28006,7 +28036,7 @@
           <w:sz w:val="18"/>
           <w:szCs w:val="18"/>
         </w:rPr>
-        <w:t>’</w:t>
+        <w:t>'Olga'</w:t>
       </w:r>
       <w:r>
         <w:rPr>
@@ -28016,7 +28046,17 @@
           <w:sz w:val="18"/>
           <w:szCs w:val="18"/>
         </w:rPr>
-        <w:t xml:space="preserve">,  </w:t>
+        <w:t xml:space="preserve">, </w:t>
+      </w:r>
+      <w:r>
+        <w:rPr>
+          <w:rFonts w:ascii="Times New Roman" w:hAnsi="Times New Roman" w:cs="Times New Roman"/>
+          <w:color w:val="4472C4" w:themeColor="accent1"/>
+          <w:spacing w:val="-1"/>
+          <w:sz w:val="18"/>
+          <w:szCs w:val="18"/>
+        </w:rPr>
+        <w:t>'Laia'</w:t>
       </w:r>
       <w:r>
         <w:rPr>
@@ -28026,7 +28066,17 @@
           <w:sz w:val="18"/>
           <w:szCs w:val="18"/>
         </w:rPr>
-        <w:t xml:space="preserve">                                </w:t>
+        <w:t xml:space="preserve">, </w:t>
+      </w:r>
+      <w:r>
+        <w:rPr>
+          <w:rFonts w:ascii="Times New Roman" w:hAnsi="Times New Roman" w:cs="Times New Roman"/>
+          <w:color w:val="4472C4" w:themeColor="accent1"/>
+          <w:spacing w:val="-1"/>
+          <w:sz w:val="18"/>
+          <w:szCs w:val="18"/>
+        </w:rPr>
+        <w:t>'Irene'</w:t>
       </w:r>
       <w:r>
         <w:rPr>
@@ -28036,7 +28086,17 @@
           <w:sz w:val="18"/>
           <w:szCs w:val="18"/>
         </w:rPr>
-        <w:tab/>
+        <w:t xml:space="preserve">, </w:t>
+      </w:r>
+      <w:r>
+        <w:rPr>
+          <w:rFonts w:ascii="Times New Roman" w:hAnsi="Times New Roman" w:cs="Times New Roman"/>
+          <w:color w:val="4472C4" w:themeColor="accent1"/>
+          <w:spacing w:val="-1"/>
+          <w:sz w:val="18"/>
+          <w:szCs w:val="18"/>
+        </w:rPr>
+        <w:t>'Ona'</w:t>
       </w:r>
       <w:r>
         <w:rPr>
@@ -28046,21 +28106,9 @@
           <w:sz w:val="18"/>
           <w:szCs w:val="18"/>
         </w:rPr>
-        <w:t xml:space="preserve"># </w:t>
-      </w:r>
-      <w:r>
-        <w:rPr>
-          <w:rFonts w:ascii="Times New Roman" w:hAnsi="Times New Roman" w:cs="Times New Roman"/>
-          <w:color w:val="595959" w:themeColor="text1" w:themeTint="A6"/>
-          <w:spacing w:val="-1"/>
-          <w:sz w:val="18"/>
-          <w:szCs w:val="18"/>
-        </w:rPr>
-        <w:t>индекс 0</w:t>
-      </w:r>
-    </w:p>
-    <w:p>
-      <w:pPr>
+        <w:t xml:space="preserve">],        </w:t>
+      </w:r>
+      <w:r>
         <w:rPr>
           <w:rFonts w:ascii="Times New Roman" w:hAnsi="Times New Roman" w:cs="Times New Roman"/>
           <w:color w:val="000000" w:themeColor="text1"/>
@@ -28068,7 +28116,8 @@
           <w:sz w:val="18"/>
           <w:szCs w:val="18"/>
         </w:rPr>
-      </w:pPr>
+        <w:tab/>
+      </w:r>
       <w:r>
         <w:rPr>
           <w:rFonts w:ascii="Times New Roman" w:hAnsi="Times New Roman" w:cs="Times New Roman"/>
@@ -28077,6 +28126,37 @@
           <w:sz w:val="18"/>
           <w:szCs w:val="18"/>
         </w:rPr>
+        <w:t xml:space="preserve"># </w:t>
+      </w:r>
+      <w:r>
+        <w:rPr>
+          <w:rFonts w:ascii="Times New Roman" w:hAnsi="Times New Roman" w:cs="Times New Roman"/>
+          <w:color w:val="595959" w:themeColor="text1" w:themeTint="A6"/>
+          <w:spacing w:val="-1"/>
+          <w:sz w:val="18"/>
+          <w:szCs w:val="18"/>
+        </w:rPr>
+        <w:t>индекс 1</w:t>
+      </w:r>
+    </w:p>
+    <w:p>
+      <w:pPr>
+        <w:rPr>
+          <w:rFonts w:ascii="Times New Roman" w:hAnsi="Times New Roman" w:cs="Times New Roman"/>
+          <w:color w:val="000000" w:themeColor="text1"/>
+          <w:spacing w:val="-1"/>
+          <w:sz w:val="18"/>
+          <w:szCs w:val="18"/>
+        </w:rPr>
+      </w:pPr>
+      <w:r>
+        <w:rPr>
+          <w:rFonts w:ascii="Times New Roman" w:hAnsi="Times New Roman" w:cs="Times New Roman"/>
+          <w:color w:val="000000" w:themeColor="text1"/>
+          <w:spacing w:val="-1"/>
+          <w:sz w:val="18"/>
+          <w:szCs w:val="18"/>
+        </w:rPr>
         <w:t xml:space="preserve">    [</w:t>
       </w:r>
       <w:r>
@@ -28087,7 +28167,7 @@
           <w:sz w:val="18"/>
           <w:szCs w:val="18"/>
         </w:rPr>
-        <w:t>'Olga'</w:t>
+        <w:t>'Jenni'</w:t>
       </w:r>
       <w:r>
         <w:rPr>
@@ -28107,7 +28187,7 @@
           <w:sz w:val="18"/>
           <w:szCs w:val="18"/>
         </w:rPr>
-        <w:t>'Laia'</w:t>
+        <w:t>'Teresa'</w:t>
       </w:r>
       <w:r>
         <w:rPr>
@@ -28127,7 +28207,7 @@
           <w:sz w:val="18"/>
           <w:szCs w:val="18"/>
         </w:rPr>
-        <w:t>'Irene'</w:t>
+        <w:t>'Aitana'</w:t>
       </w:r>
       <w:r>
         <w:rPr>
@@ -28137,7 +28217,58 @@
           <w:sz w:val="18"/>
           <w:szCs w:val="18"/>
         </w:rPr>
-        <w:t xml:space="preserve">, </w:t>
+        <w:t xml:space="preserve">],          </w:t>
+      </w:r>
+      <w:r>
+        <w:rPr>
+          <w:rFonts w:ascii="Times New Roman" w:hAnsi="Times New Roman" w:cs="Times New Roman"/>
+          <w:color w:val="000000" w:themeColor="text1"/>
+          <w:spacing w:val="-1"/>
+          <w:sz w:val="18"/>
+          <w:szCs w:val="18"/>
+        </w:rPr>
+        <w:tab/>
+      </w:r>
+      <w:r>
+        <w:rPr>
+          <w:rFonts w:ascii="Times New Roman" w:hAnsi="Times New Roman" w:cs="Times New Roman"/>
+          <w:color w:val="000000" w:themeColor="text1"/>
+          <w:spacing w:val="-1"/>
+          <w:sz w:val="18"/>
+          <w:szCs w:val="18"/>
+        </w:rPr>
+        <w:t xml:space="preserve"># </w:t>
+      </w:r>
+      <w:r>
+        <w:rPr>
+          <w:rFonts w:ascii="Times New Roman" w:hAnsi="Times New Roman" w:cs="Times New Roman"/>
+          <w:color w:val="595959" w:themeColor="text1" w:themeTint="A6"/>
+          <w:spacing w:val="-1"/>
+          <w:sz w:val="18"/>
+          <w:szCs w:val="18"/>
+        </w:rPr>
+        <w:t>индекс 2</w:t>
+      </w:r>
+    </w:p>
+    <w:p>
+      <w:pPr>
+        <w:rPr>
+          <w:rFonts w:ascii="Times New Roman" w:hAnsi="Times New Roman" w:cs="Times New Roman"/>
+          <w:color w:val="000000" w:themeColor="text1"/>
+          <w:spacing w:val="-1"/>
+          <w:sz w:val="18"/>
+          <w:szCs w:val="18"/>
+        </w:rPr>
+      </w:pPr>
+      <w:r>
+        <w:rPr>
+          <w:rFonts w:ascii="Times New Roman" w:hAnsi="Times New Roman" w:cs="Times New Roman"/>
+          <w:color w:val="000000" w:themeColor="text1"/>
+          <w:spacing w:val="-1"/>
+          <w:sz w:val="18"/>
+          <w:szCs w:val="18"/>
+        </w:rPr>
+        <w:t xml:space="preserve">    [</w:t>
       </w:r>
       <w:r>
         <w:rPr>
@@ -28147,7 +28278,7 @@
           <w:sz w:val="18"/>
           <w:szCs w:val="18"/>
         </w:rPr>
-        <w:t>'Ona'</w:t>
+        <w:t>'Mariona'</w:t>
       </w:r>
       <w:r>
         <w:rPr>
@@ -28157,7 +28288,17 @@
           <w:sz w:val="18"/>
           <w:szCs w:val="18"/>
         </w:rPr>
-        <w:t xml:space="preserve">],        </w:t>
+        <w:t xml:space="preserve">, </w:t>
+      </w:r>
+      <w:r>
+        <w:rPr>
+          <w:rFonts w:ascii="Times New Roman" w:hAnsi="Times New Roman" w:cs="Times New Roman"/>
+          <w:color w:val="4472C4" w:themeColor="accent1"/>
+          <w:spacing w:val="-1"/>
+          <w:sz w:val="18"/>
+          <w:szCs w:val="18"/>
+        </w:rPr>
+        <w:t>'Salma'</w:t>
       </w:r>
       <w:r>
         <w:rPr>
@@ -28167,7 +28308,17 @@
           <w:sz w:val="18"/>
           <w:szCs w:val="18"/>
         </w:rPr>
-        <w:tab/>
+        <w:t xml:space="preserve">, </w:t>
+      </w:r>
+      <w:r>
+        <w:rPr>
+          <w:rFonts w:ascii="Times New Roman" w:hAnsi="Times New Roman" w:cs="Times New Roman"/>
+          <w:color w:val="4472C4" w:themeColor="accent1"/>
+          <w:spacing w:val="-1"/>
+          <w:sz w:val="18"/>
+          <w:szCs w:val="18"/>
+        </w:rPr>
+        <w:t>'Alba’</w:t>
       </w:r>
       <w:r>
         <w:rPr>
@@ -28177,21 +28328,9 @@
           <w:sz w:val="18"/>
           <w:szCs w:val="18"/>
         </w:rPr>
-        <w:t xml:space="preserve"># </w:t>
-      </w:r>
-      <w:r>
-        <w:rPr>
-          <w:rFonts w:ascii="Times New Roman" w:hAnsi="Times New Roman" w:cs="Times New Roman"/>
-          <w:color w:val="595959" w:themeColor="text1" w:themeTint="A6"/>
-          <w:spacing w:val="-1"/>
-          <w:sz w:val="18"/>
-          <w:szCs w:val="18"/>
-        </w:rPr>
-        <w:t>индекс 1</w:t>
-      </w:r>
-    </w:p>
-    <w:p>
-      <w:pPr>
+        <w:t xml:space="preserve">]            </w:t>
+      </w:r>
+      <w:r>
         <w:rPr>
           <w:rFonts w:ascii="Times New Roman" w:hAnsi="Times New Roman" w:cs="Times New Roman"/>
           <w:color w:val="000000" w:themeColor="text1"/>
@@ -28199,7 +28338,8 @@
           <w:sz w:val="18"/>
           <w:szCs w:val="18"/>
         </w:rPr>
-      </w:pPr>
+        <w:tab/>
+      </w:r>
       <w:r>
         <w:rPr>
           <w:rFonts w:ascii="Times New Roman" w:hAnsi="Times New Roman" w:cs="Times New Roman"/>
@@ -28208,19 +28348,21 @@
           <w:sz w:val="18"/>
           <w:szCs w:val="18"/>
         </w:rPr>
-        <w:t xml:space="preserve">    [</w:t>
-      </w:r>
-      <w:r>
-        <w:rPr>
-          <w:rFonts w:ascii="Times New Roman" w:hAnsi="Times New Roman" w:cs="Times New Roman"/>
-          <w:color w:val="4472C4" w:themeColor="accent1"/>
+        <w:t xml:space="preserve"># </w:t>
+      </w:r>
+      <w:r>
+        <w:rPr>
+          <w:rFonts w:ascii="Times New Roman" w:hAnsi="Times New Roman" w:cs="Times New Roman"/>
+          <w:color w:val="595959" w:themeColor="text1" w:themeTint="A6"/>
           <w:spacing w:val="-1"/>
           <w:sz w:val="18"/>
           <w:szCs w:val="18"/>
         </w:rPr>
-        <w:t>'Jenni'</w:t>
-      </w:r>
-      <w:r>
+        <w:t>индекс 3</w:t>
+      </w:r>
+    </w:p>
+    <w:p>
+      <w:pPr>
         <w:rPr>
           <w:rFonts w:ascii="Times New Roman" w:hAnsi="Times New Roman" w:cs="Times New Roman"/>
           <w:color w:val="000000" w:themeColor="text1"/>
@@ -28228,18 +28370,7 @@
           <w:sz w:val="18"/>
           <w:szCs w:val="18"/>
         </w:rPr>
-        <w:t xml:space="preserve">, </w:t>
-      </w:r>
-      <w:r>
-        <w:rPr>
-          <w:rFonts w:ascii="Times New Roman" w:hAnsi="Times New Roman" w:cs="Times New Roman"/>
-          <w:color w:val="4472C4" w:themeColor="accent1"/>
-          <w:spacing w:val="-1"/>
-          <w:sz w:val="18"/>
-          <w:szCs w:val="18"/>
-        </w:rPr>
-        <w:t>'Teresa'</w:t>
-      </w:r>
+      </w:pPr>
       <w:r>
         <w:rPr>
           <w:rFonts w:ascii="Times New Roman" w:hAnsi="Times New Roman" w:cs="Times New Roman"/>
@@ -28248,19 +28379,11 @@
           <w:sz w:val="18"/>
           <w:szCs w:val="18"/>
         </w:rPr>
-        <w:t xml:space="preserve">, </w:t>
-      </w:r>
-      <w:r>
-        <w:rPr>
-          <w:rFonts w:ascii="Times New Roman" w:hAnsi="Times New Roman" w:cs="Times New Roman"/>
-          <w:color w:val="4472C4" w:themeColor="accent1"/>
-          <w:spacing w:val="-1"/>
-          <w:sz w:val="18"/>
-          <w:szCs w:val="18"/>
-        </w:rPr>
-        <w:t>'Aitana'</w:t>
-      </w:r>
-      <w:r>
+        <w:t>]</w:t>
+      </w:r>
+    </w:p>
+    <w:p>
+      <w:pPr>
         <w:rPr>
           <w:rFonts w:ascii="Times New Roman" w:hAnsi="Times New Roman" w:cs="Times New Roman"/>
           <w:color w:val="000000" w:themeColor="text1"/>
@@ -28268,8 +28391,7 @@
           <w:sz w:val="18"/>
           <w:szCs w:val="18"/>
         </w:rPr>
-        <w:t xml:space="preserve">],  </w:t>
-      </w:r>
+      </w:pPr>
       <w:r>
         <w:rPr>
           <w:rFonts w:ascii="Times New Roman" w:hAnsi="Times New Roman" w:cs="Times New Roman"/>
@@ -28278,17 +28400,19 @@
           <w:sz w:val="18"/>
           <w:szCs w:val="18"/>
         </w:rPr>
-        <w:t xml:space="preserve">        </w:t>
-      </w:r>
-      <w:r>
-        <w:rPr>
-          <w:rFonts w:ascii="Times New Roman" w:hAnsi="Times New Roman" w:cs="Times New Roman"/>
+        <w:t>Это </w:t>
+      </w:r>
+      <w:r>
+        <w:rPr>
+          <w:rFonts w:ascii="Times New Roman" w:hAnsi="Times New Roman" w:cs="Times New Roman"/>
+          <w:b/>
+          <w:bCs/>
           <w:color w:val="000000" w:themeColor="text1"/>
           <w:spacing w:val="-1"/>
           <w:sz w:val="18"/>
           <w:szCs w:val="18"/>
         </w:rPr>
-        <w:tab/>
+        <w:t>список из 4 элементов</w:t>
       </w:r>
       <w:r>
         <w:rPr>
@@ -28298,211 +28422,6 @@
           <w:sz w:val="18"/>
           <w:szCs w:val="18"/>
         </w:rPr>
-        <w:t xml:space="preserve"># </w:t>
-      </w:r>
-      <w:r>
-        <w:rPr>
-          <w:rFonts w:ascii="Times New Roman" w:hAnsi="Times New Roman" w:cs="Times New Roman"/>
-          <w:color w:val="595959" w:themeColor="text1" w:themeTint="A6"/>
-          <w:spacing w:val="-1"/>
-          <w:sz w:val="18"/>
-          <w:szCs w:val="18"/>
-        </w:rPr>
-        <w:t>индекс 2</w:t>
-      </w:r>
-    </w:p>
-    <w:p>
-      <w:pPr>
-        <w:rPr>
-          <w:rFonts w:ascii="Times New Roman" w:hAnsi="Times New Roman" w:cs="Times New Roman"/>
-          <w:color w:val="000000" w:themeColor="text1"/>
-          <w:spacing w:val="-1"/>
-          <w:sz w:val="18"/>
-          <w:szCs w:val="18"/>
-        </w:rPr>
-      </w:pPr>
-      <w:r>
-        <w:rPr>
-          <w:rFonts w:ascii="Times New Roman" w:hAnsi="Times New Roman" w:cs="Times New Roman"/>
-          <w:color w:val="000000" w:themeColor="text1"/>
-          <w:spacing w:val="-1"/>
-          <w:sz w:val="18"/>
-          <w:szCs w:val="18"/>
-        </w:rPr>
-        <w:t xml:space="preserve">    [</w:t>
-      </w:r>
-      <w:r>
-        <w:rPr>
-          <w:rFonts w:ascii="Times New Roman" w:hAnsi="Times New Roman" w:cs="Times New Roman"/>
-          <w:color w:val="4472C4" w:themeColor="accent1"/>
-          <w:spacing w:val="-1"/>
-          <w:sz w:val="18"/>
-          <w:szCs w:val="18"/>
-        </w:rPr>
-        <w:t>'Mariona'</w:t>
-      </w:r>
-      <w:r>
-        <w:rPr>
-          <w:rFonts w:ascii="Times New Roman" w:hAnsi="Times New Roman" w:cs="Times New Roman"/>
-          <w:color w:val="000000" w:themeColor="text1"/>
-          <w:spacing w:val="-1"/>
-          <w:sz w:val="18"/>
-          <w:szCs w:val="18"/>
-        </w:rPr>
-        <w:t xml:space="preserve">, </w:t>
-      </w:r>
-      <w:r>
-        <w:rPr>
-          <w:rFonts w:ascii="Times New Roman" w:hAnsi="Times New Roman" w:cs="Times New Roman"/>
-          <w:color w:val="4472C4" w:themeColor="accent1"/>
-          <w:spacing w:val="-1"/>
-          <w:sz w:val="18"/>
-          <w:szCs w:val="18"/>
-        </w:rPr>
-        <w:t>'Salma'</w:t>
-      </w:r>
-      <w:r>
-        <w:rPr>
-          <w:rFonts w:ascii="Times New Roman" w:hAnsi="Times New Roman" w:cs="Times New Roman"/>
-          <w:color w:val="000000" w:themeColor="text1"/>
-          <w:spacing w:val="-1"/>
-          <w:sz w:val="18"/>
-          <w:szCs w:val="18"/>
-        </w:rPr>
-        <w:t xml:space="preserve">, </w:t>
-      </w:r>
-      <w:r>
-        <w:rPr>
-          <w:rFonts w:ascii="Times New Roman" w:hAnsi="Times New Roman" w:cs="Times New Roman"/>
-          <w:color w:val="4472C4" w:themeColor="accent1"/>
-          <w:spacing w:val="-1"/>
-          <w:sz w:val="18"/>
-          <w:szCs w:val="18"/>
-        </w:rPr>
-        <w:t>'Alba</w:t>
-      </w:r>
-      <w:r>
-        <w:rPr>
-          <w:rFonts w:ascii="Times New Roman" w:hAnsi="Times New Roman" w:cs="Times New Roman"/>
-          <w:color w:val="4472C4" w:themeColor="accent1"/>
-          <w:spacing w:val="-1"/>
-          <w:sz w:val="18"/>
-          <w:szCs w:val="18"/>
-        </w:rPr>
-        <w:t>’</w:t>
-      </w:r>
-      <w:r>
-        <w:rPr>
-          <w:rFonts w:ascii="Times New Roman" w:hAnsi="Times New Roman" w:cs="Times New Roman"/>
-          <w:color w:val="000000" w:themeColor="text1"/>
-          <w:spacing w:val="-1"/>
-          <w:sz w:val="18"/>
-          <w:szCs w:val="18"/>
-        </w:rPr>
-        <w:t xml:space="preserve">]  </w:t>
-      </w:r>
-      <w:r>
-        <w:rPr>
-          <w:rFonts w:ascii="Times New Roman" w:hAnsi="Times New Roman" w:cs="Times New Roman"/>
-          <w:color w:val="000000" w:themeColor="text1"/>
-          <w:spacing w:val="-1"/>
-          <w:sz w:val="18"/>
-          <w:szCs w:val="18"/>
-        </w:rPr>
-        <w:t xml:space="preserve">          </w:t>
-      </w:r>
-      <w:r>
-        <w:rPr>
-          <w:rFonts w:ascii="Times New Roman" w:hAnsi="Times New Roman" w:cs="Times New Roman"/>
-          <w:color w:val="000000" w:themeColor="text1"/>
-          <w:spacing w:val="-1"/>
-          <w:sz w:val="18"/>
-          <w:szCs w:val="18"/>
-        </w:rPr>
-        <w:tab/>
-      </w:r>
-      <w:r>
-        <w:rPr>
-          <w:rFonts w:ascii="Times New Roman" w:hAnsi="Times New Roman" w:cs="Times New Roman"/>
-          <w:color w:val="000000" w:themeColor="text1"/>
-          <w:spacing w:val="-1"/>
-          <w:sz w:val="18"/>
-          <w:szCs w:val="18"/>
-        </w:rPr>
-        <w:t xml:space="preserve"># </w:t>
-      </w:r>
-      <w:r>
-        <w:rPr>
-          <w:rFonts w:ascii="Times New Roman" w:hAnsi="Times New Roman" w:cs="Times New Roman"/>
-          <w:color w:val="595959" w:themeColor="text1" w:themeTint="A6"/>
-          <w:spacing w:val="-1"/>
-          <w:sz w:val="18"/>
-          <w:szCs w:val="18"/>
-        </w:rPr>
-        <w:t>индекс 3</w:t>
-      </w:r>
-    </w:p>
-    <w:p>
-      <w:pPr>
-        <w:rPr>
-          <w:rFonts w:ascii="Times New Roman" w:hAnsi="Times New Roman" w:cs="Times New Roman"/>
-          <w:color w:val="000000" w:themeColor="text1"/>
-          <w:spacing w:val="-1"/>
-          <w:sz w:val="18"/>
-          <w:szCs w:val="18"/>
-        </w:rPr>
-      </w:pPr>
-      <w:r>
-        <w:rPr>
-          <w:rFonts w:ascii="Times New Roman" w:hAnsi="Times New Roman" w:cs="Times New Roman"/>
-          <w:color w:val="000000" w:themeColor="text1"/>
-          <w:spacing w:val="-1"/>
-          <w:sz w:val="18"/>
-          <w:szCs w:val="18"/>
-        </w:rPr>
-        <w:t>]</w:t>
-      </w:r>
-    </w:p>
-    <w:p>
-      <w:pPr>
-        <w:rPr>
-          <w:rFonts w:ascii="Times New Roman" w:hAnsi="Times New Roman" w:cs="Times New Roman"/>
-          <w:color w:val="000000" w:themeColor="text1"/>
-          <w:spacing w:val="-1"/>
-          <w:sz w:val="18"/>
-          <w:szCs w:val="18"/>
-        </w:rPr>
-      </w:pPr>
-      <w:r>
-        <w:rPr>
-          <w:rFonts w:ascii="Times New Roman" w:hAnsi="Times New Roman" w:cs="Times New Roman"/>
-          <w:color w:val="000000" w:themeColor="text1"/>
-          <w:spacing w:val="-1"/>
-          <w:sz w:val="18"/>
-          <w:szCs w:val="18"/>
-        </w:rPr>
-        <w:t>Это </w:t>
-      </w:r>
-      <w:r>
-        <w:rPr>
-          <w:rFonts w:ascii="Times New Roman" w:hAnsi="Times New Roman" w:cs="Times New Roman"/>
-          <w:b/>
-          <w:bCs/>
-          <w:color w:val="000000" w:themeColor="text1"/>
-          <w:spacing w:val="-1"/>
-          <w:sz w:val="18"/>
-          <w:szCs w:val="18"/>
-        </w:rPr>
-        <w:t>список из 4 элементов</w:t>
-      </w:r>
-      <w:r>
-        <w:rPr>
-          <w:rFonts w:ascii="Times New Roman" w:hAnsi="Times New Roman" w:cs="Times New Roman"/>
-          <w:color w:val="000000" w:themeColor="text1"/>
-          <w:spacing w:val="-1"/>
-          <w:sz w:val="18"/>
-          <w:szCs w:val="18"/>
-        </w:rPr>
         <w:t xml:space="preserve">, три элемента сами являются списками. </w:t>
       </w:r>
     </w:p>
@@ -28510,11 +28429,7 @@
       <w:pPr>
         <w:jc w:val="center"/>
         <w:rPr>
-          <w:rFonts w:ascii="Times New Roman" w:hAnsi="Times New Roman" w:cs="Times New Roman"/>
-          <w:color w:val="000000" w:themeColor="text1"/>
-          <w:spacing w:val="-1"/>
-          <w:sz w:val="18"/>
-          <w:szCs w:val="18"/>
+          <w:noProof/>
         </w:rPr>
       </w:pPr>
       <w:r>
@@ -28537,7 +28452,7 @@
                     <pic:cNvPicPr/>
                   </pic:nvPicPr>
                   <pic:blipFill>
-                    <a:blip r:embed="rId52"/>
+                    <a:blip r:embed="rId53"/>
                     <a:stretch>
                       <a:fillRect/>
                     </a:stretch>
@@ -28566,9 +28481,665 @@
         </w:drawing>
       </w:r>
     </w:p>
+    <w:p>
+      <w:pPr>
+        <w:rPr>
+          <w:noProof/>
+        </w:rPr>
+      </w:pPr>
+    </w:p>
+    <w:p>
+      <w:pPr>
+        <w:tabs>
+          <w:tab w:val="left" w:pos="3579"/>
+        </w:tabs>
+        <w:rPr>
+          <w:rFonts w:ascii="Times New Roman" w:hAnsi="Times New Roman" w:cs="Times New Roman"/>
+          <w:b/>
+          <w:bCs/>
+          <w:sz w:val="18"/>
+          <w:szCs w:val="18"/>
+        </w:rPr>
+      </w:pPr>
+      <w:r>
+        <w:rPr>
+          <w:rFonts w:ascii="Times New Roman" w:hAnsi="Times New Roman" w:cs="Times New Roman"/>
+          <w:sz w:val="18"/>
+          <w:szCs w:val="18"/>
+        </w:rPr>
+        <w:tab/>
+      </w:r>
+      <w:r>
+        <w:rPr>
+          <w:rFonts w:ascii="Times New Roman" w:hAnsi="Times New Roman" w:cs="Times New Roman"/>
+          <w:b/>
+          <w:bCs/>
+          <w:color w:val="000000" w:themeColor="text1"/>
+          <w:sz w:val="18"/>
+          <w:szCs w:val="18"/>
+        </w:rPr>
+        <w:t>Кортежи</w:t>
+      </w:r>
+    </w:p>
+    <w:p>
+      <w:pPr>
+        <w:tabs>
+          <w:tab w:val="left" w:pos="3579"/>
+        </w:tabs>
+        <w:rPr>
+          <w:rFonts w:ascii="Times New Roman" w:hAnsi="Times New Roman" w:cs="Times New Roman"/>
+          <w:sz w:val="18"/>
+          <w:szCs w:val="18"/>
+          <w:lang w:val="en-US"/>
+        </w:rPr>
+      </w:pPr>
+      <w:r>
+        <w:rPr>
+          <w:rFonts w:ascii="Times New Roman" w:hAnsi="Times New Roman" w:cs="Times New Roman"/>
+          <w:sz w:val="18"/>
+          <w:szCs w:val="18"/>
+        </w:rPr>
+        <w:t>Понятие кортежа очень похоже на понятие списка</w:t>
+      </w:r>
+      <w:hyperlink r:id="rId54" w:history="1">
+        <w:r>
+          <w:rPr>
+            <w:rStyle w:val="a3"/>
+            <w:rFonts w:ascii="Times New Roman" w:hAnsi="Times New Roman" w:cs="Times New Roman"/>
+            <w:sz w:val="18"/>
+            <w:szCs w:val="18"/>
+          </w:rPr>
+          <w:t>.</w:t>
+        </w:r>
+      </w:hyperlink>
+      <w:r>
+        <w:rPr>
+          <w:rFonts w:ascii="Times New Roman" w:hAnsi="Times New Roman" w:cs="Times New Roman"/>
+          <w:sz w:val="18"/>
+          <w:szCs w:val="18"/>
+        </w:rPr>
+        <w:t> Хотя есть некоторые незначительные различия, принципиальное отличие заключается в том, что, в то время как </w:t>
+      </w:r>
+      <w:r>
+        <w:rPr>
+          <w:rFonts w:ascii="Times New Roman" w:hAnsi="Times New Roman" w:cs="Times New Roman"/>
+          <w:i/>
+          <w:iCs/>
+          <w:sz w:val="18"/>
+          <w:szCs w:val="18"/>
+        </w:rPr>
+        <w:t>список</w:t>
+      </w:r>
+      <w:r>
+        <w:rPr>
+          <w:rFonts w:ascii="Times New Roman" w:hAnsi="Times New Roman" w:cs="Times New Roman"/>
+          <w:sz w:val="18"/>
+          <w:szCs w:val="18"/>
+        </w:rPr>
+        <w:t> является изменяемым и может быть модифицирован, </w:t>
+      </w:r>
+      <w:r>
+        <w:rPr>
+          <w:rFonts w:ascii="Times New Roman" w:hAnsi="Times New Roman" w:cs="Times New Roman"/>
+          <w:i/>
+          <w:iCs/>
+          <w:sz w:val="18"/>
+          <w:szCs w:val="18"/>
+        </w:rPr>
+        <w:t>кортеж</w:t>
+      </w:r>
+      <w:r>
+        <w:rPr>
+          <w:rFonts w:ascii="Times New Roman" w:hAnsi="Times New Roman" w:cs="Times New Roman"/>
+          <w:sz w:val="18"/>
+          <w:szCs w:val="18"/>
+        </w:rPr>
+        <w:t> не допускает изменений и, следовательно, является </w:t>
+      </w:r>
+      <w:r>
+        <w:rPr>
+          <w:rFonts w:ascii="Times New Roman" w:hAnsi="Times New Roman" w:cs="Times New Roman"/>
+          <w:color w:val="7F7F7F" w:themeColor="text1" w:themeTint="80"/>
+          <w:sz w:val="18"/>
+          <w:szCs w:val="18"/>
+        </w:rPr>
+        <w:t>неизменяемым</w:t>
+      </w:r>
+      <w:r>
+        <w:rPr>
+          <w:rFonts w:ascii="Times New Roman" w:hAnsi="Times New Roman" w:cs="Times New Roman"/>
+          <w:sz w:val="18"/>
+          <w:szCs w:val="18"/>
+        </w:rPr>
+        <w:t>.</w:t>
+      </w:r>
+    </w:p>
+    <w:p>
+      <w:pPr>
+        <w:tabs>
+          <w:tab w:val="left" w:pos="3579"/>
+        </w:tabs>
+        <w:rPr>
+          <w:rFonts w:ascii="Times New Roman" w:hAnsi="Times New Roman" w:cs="Times New Roman"/>
+          <w:b/>
+          <w:bCs/>
+          <w:sz w:val="18"/>
+          <w:szCs w:val="18"/>
+        </w:rPr>
+      </w:pPr>
+      <w:r>
+        <w:rPr>
+          <w:rFonts w:ascii="Times New Roman" w:hAnsi="Times New Roman" w:cs="Times New Roman"/>
+          <w:b/>
+          <w:bCs/>
+          <w:sz w:val="18"/>
+          <w:szCs w:val="18"/>
+        </w:rPr>
+        <w:lastRenderedPageBreak/>
+        <w:t>Операции с кортежами</w:t>
+      </w:r>
+    </w:p>
+    <w:p>
+      <w:pPr>
+        <w:tabs>
+          <w:tab w:val="left" w:pos="3579"/>
+        </w:tabs>
+        <w:rPr>
+          <w:rFonts w:ascii="Times New Roman" w:hAnsi="Times New Roman" w:cs="Times New Roman"/>
+          <w:sz w:val="18"/>
+          <w:szCs w:val="18"/>
+        </w:rPr>
+      </w:pPr>
+      <w:r>
+        <w:rPr>
+          <w:rFonts w:ascii="Times New Roman" w:hAnsi="Times New Roman" w:cs="Times New Roman"/>
+          <w:sz w:val="18"/>
+          <w:szCs w:val="18"/>
+        </w:rPr>
+        <w:t>С помощью кортежей мы можем выполнять </w:t>
+      </w:r>
+      <w:hyperlink r:id="rId55" w:anchor="operations" w:history="1">
+        <w:r>
+          <w:rPr>
+            <w:rStyle w:val="a3"/>
+            <w:rFonts w:ascii="Times New Roman" w:hAnsi="Times New Roman" w:cs="Times New Roman"/>
+            <w:color w:val="7F7F7F" w:themeColor="text1" w:themeTint="80"/>
+            <w:sz w:val="18"/>
+            <w:szCs w:val="18"/>
+          </w:rPr>
+          <w:t>все операции, которые мы видели со списками,</w:t>
+        </w:r>
+      </w:hyperlink>
+      <w:r>
+        <w:rPr>
+          <w:rFonts w:ascii="Times New Roman" w:hAnsi="Times New Roman" w:cs="Times New Roman"/>
+          <w:color w:val="7F7F7F" w:themeColor="text1" w:themeTint="80"/>
+          <w:sz w:val="18"/>
+          <w:szCs w:val="18"/>
+        </w:rPr>
+        <w:t> </w:t>
+      </w:r>
+      <w:r>
+        <w:rPr>
+          <w:rFonts w:ascii="Times New Roman" w:hAnsi="Times New Roman" w:cs="Times New Roman"/>
+          <w:sz w:val="18"/>
+          <w:szCs w:val="18"/>
+        </w:rPr>
+        <w:t>за исключением тех, которые включают в себя изменение списка </w:t>
+      </w:r>
+      <w:r>
+        <w:rPr>
+          <w:rFonts w:ascii="Times New Roman" w:hAnsi="Times New Roman" w:cs="Times New Roman"/>
+          <w:b/>
+          <w:bCs/>
+          <w:sz w:val="18"/>
+          <w:szCs w:val="18"/>
+        </w:rPr>
+        <w:t>«на месте</w:t>
+      </w:r>
+      <w:r>
+        <w:rPr>
+          <w:rFonts w:ascii="Times New Roman" w:hAnsi="Times New Roman" w:cs="Times New Roman"/>
+          <w:b/>
+          <w:bCs/>
+          <w:sz w:val="18"/>
+          <w:szCs w:val="18"/>
+        </w:rPr>
+        <w:t>»:</w:t>
+      </w:r>
+    </w:p>
+    <w:p>
+      <w:pPr>
+        <w:numPr>
+          <w:ilvl w:val="0"/>
+          <w:numId w:val="93"/>
+        </w:numPr>
+        <w:tabs>
+          <w:tab w:val="left" w:pos="3579"/>
+        </w:tabs>
+        <w:spacing w:after="0"/>
+        <w:rPr>
+          <w:rFonts w:ascii="Times New Roman" w:hAnsi="Times New Roman" w:cs="Times New Roman"/>
+          <w:sz w:val="18"/>
+          <w:szCs w:val="18"/>
+        </w:rPr>
+      </w:pPr>
+      <w:r>
+        <w:rPr>
+          <w:rFonts w:ascii="Times New Roman" w:hAnsi="Times New Roman" w:cs="Times New Roman"/>
+          <w:sz w:val="18"/>
+          <w:szCs w:val="18"/>
+        </w:rPr>
+        <w:t>reverse()</w:t>
+      </w:r>
+    </w:p>
+    <w:p>
+      <w:pPr>
+        <w:numPr>
+          <w:ilvl w:val="0"/>
+          <w:numId w:val="93"/>
+        </w:numPr>
+        <w:tabs>
+          <w:tab w:val="left" w:pos="3579"/>
+        </w:tabs>
+        <w:spacing w:after="0"/>
+        <w:rPr>
+          <w:rFonts w:ascii="Times New Roman" w:hAnsi="Times New Roman" w:cs="Times New Roman"/>
+          <w:sz w:val="18"/>
+          <w:szCs w:val="18"/>
+        </w:rPr>
+      </w:pPr>
+      <w:r>
+        <w:rPr>
+          <w:rFonts w:ascii="Times New Roman" w:hAnsi="Times New Roman" w:cs="Times New Roman"/>
+          <w:sz w:val="18"/>
+          <w:szCs w:val="18"/>
+        </w:rPr>
+        <w:t>append()</w:t>
+      </w:r>
+    </w:p>
+    <w:p>
+      <w:pPr>
+        <w:numPr>
+          <w:ilvl w:val="0"/>
+          <w:numId w:val="93"/>
+        </w:numPr>
+        <w:tabs>
+          <w:tab w:val="left" w:pos="3579"/>
+        </w:tabs>
+        <w:spacing w:after="0"/>
+        <w:rPr>
+          <w:rFonts w:ascii="Times New Roman" w:hAnsi="Times New Roman" w:cs="Times New Roman"/>
+          <w:sz w:val="18"/>
+          <w:szCs w:val="18"/>
+        </w:rPr>
+      </w:pPr>
+      <w:r>
+        <w:rPr>
+          <w:rFonts w:ascii="Times New Roman" w:hAnsi="Times New Roman" w:cs="Times New Roman"/>
+          <w:sz w:val="18"/>
+          <w:szCs w:val="18"/>
+        </w:rPr>
+        <w:t>extend()</w:t>
+      </w:r>
+    </w:p>
+    <w:p>
+      <w:pPr>
+        <w:numPr>
+          <w:ilvl w:val="0"/>
+          <w:numId w:val="93"/>
+        </w:numPr>
+        <w:tabs>
+          <w:tab w:val="left" w:pos="3579"/>
+        </w:tabs>
+        <w:spacing w:after="0"/>
+        <w:rPr>
+          <w:rFonts w:ascii="Times New Roman" w:hAnsi="Times New Roman" w:cs="Times New Roman"/>
+          <w:sz w:val="18"/>
+          <w:szCs w:val="18"/>
+        </w:rPr>
+      </w:pPr>
+      <w:r>
+        <w:rPr>
+          <w:rFonts w:ascii="Times New Roman" w:hAnsi="Times New Roman" w:cs="Times New Roman"/>
+          <w:sz w:val="18"/>
+          <w:szCs w:val="18"/>
+        </w:rPr>
+        <w:t>remove()</w:t>
+      </w:r>
+    </w:p>
+    <w:p>
+      <w:pPr>
+        <w:numPr>
+          <w:ilvl w:val="0"/>
+          <w:numId w:val="93"/>
+        </w:numPr>
+        <w:tabs>
+          <w:tab w:val="left" w:pos="3579"/>
+        </w:tabs>
+        <w:spacing w:after="0"/>
+        <w:rPr>
+          <w:rFonts w:ascii="Times New Roman" w:hAnsi="Times New Roman" w:cs="Times New Roman"/>
+          <w:sz w:val="18"/>
+          <w:szCs w:val="18"/>
+        </w:rPr>
+      </w:pPr>
+      <w:r>
+        <w:rPr>
+          <w:rFonts w:ascii="Times New Roman" w:hAnsi="Times New Roman" w:cs="Times New Roman"/>
+          <w:sz w:val="18"/>
+          <w:szCs w:val="18"/>
+        </w:rPr>
+        <w:t>clear()</w:t>
+      </w:r>
+    </w:p>
+    <w:p>
+      <w:pPr>
+        <w:numPr>
+          <w:ilvl w:val="0"/>
+          <w:numId w:val="93"/>
+        </w:numPr>
+        <w:tabs>
+          <w:tab w:val="left" w:pos="3579"/>
+        </w:tabs>
+        <w:spacing w:after="0"/>
+        <w:rPr>
+          <w:rFonts w:ascii="Times New Roman" w:hAnsi="Times New Roman" w:cs="Times New Roman"/>
+          <w:sz w:val="18"/>
+          <w:szCs w:val="18"/>
+        </w:rPr>
+      </w:pPr>
+      <w:r>
+        <w:rPr>
+          <w:rFonts w:ascii="Times New Roman" w:hAnsi="Times New Roman" w:cs="Times New Roman"/>
+          <w:sz w:val="18"/>
+          <w:szCs w:val="18"/>
+        </w:rPr>
+        <w:t>sort()</w:t>
+      </w:r>
+    </w:p>
+    <w:p>
+      <w:pPr>
+        <w:tabs>
+          <w:tab w:val="left" w:pos="3579"/>
+        </w:tabs>
+        <w:rPr>
+          <w:rFonts w:ascii="Times New Roman" w:hAnsi="Times New Roman" w:cs="Times New Roman"/>
+          <w:sz w:val="18"/>
+          <w:szCs w:val="18"/>
+          <w:lang w:val="en-US"/>
+        </w:rPr>
+      </w:pPr>
+    </w:p>
+    <w:p>
+      <w:pPr>
+        <w:tabs>
+          <w:tab w:val="left" w:pos="3579"/>
+        </w:tabs>
+        <w:rPr>
+          <w:rFonts w:ascii="Times New Roman" w:hAnsi="Times New Roman" w:cs="Times New Roman"/>
+          <w:b/>
+          <w:bCs/>
+          <w:sz w:val="18"/>
+          <w:szCs w:val="18"/>
+        </w:rPr>
+      </w:pPr>
+      <w:r>
+        <w:rPr>
+          <w:rFonts w:ascii="Times New Roman" w:hAnsi="Times New Roman" w:cs="Times New Roman"/>
+          <w:b/>
+          <w:bCs/>
+          <w:sz w:val="18"/>
+          <w:szCs w:val="18"/>
+        </w:rPr>
+        <w:t>Несколько деталей:</w:t>
+      </w:r>
+    </w:p>
+    <w:p>
+      <w:pPr>
+        <w:numPr>
+          <w:ilvl w:val="0"/>
+          <w:numId w:val="94"/>
+        </w:numPr>
+        <w:tabs>
+          <w:tab w:val="left" w:pos="3579"/>
+        </w:tabs>
+        <w:rPr>
+          <w:rFonts w:ascii="Times New Roman" w:hAnsi="Times New Roman" w:cs="Times New Roman"/>
+          <w:sz w:val="18"/>
+          <w:szCs w:val="18"/>
+        </w:rPr>
+      </w:pPr>
+      <w:r>
+        <w:rPr>
+          <w:rFonts w:ascii="Times New Roman" w:hAnsi="Times New Roman" w:cs="Times New Roman"/>
+          <w:sz w:val="18"/>
+          <w:szCs w:val="18"/>
+        </w:rPr>
+        <w:t>Да, можно применить оператор sorted()ИЛИ reversed()к кортежу, поскольку мы не изменяем его значение, а создаём новый объект.</w:t>
+      </w:r>
+    </w:p>
+    <w:p>
+      <w:pPr>
+        <w:numPr>
+          <w:ilvl w:val="0"/>
+          <w:numId w:val="94"/>
+        </w:numPr>
+        <w:tabs>
+          <w:tab w:val="left" w:pos="3579"/>
+        </w:tabs>
+        <w:rPr>
+          <w:rFonts w:ascii="Times New Roman" w:hAnsi="Times New Roman" w:cs="Times New Roman"/>
+          <w:b/>
+          <w:bCs/>
+          <w:color w:val="C00000"/>
+          <w:sz w:val="18"/>
+          <w:szCs w:val="18"/>
+          <w14:textFill>
+            <w14:gradFill>
+              <w14:gsLst>
+                <w14:gs w14:pos="0">
+                  <w14:srgbClr w14:val="C00000">
+                    <w14:shade w14:val="30000"/>
+                    <w14:satMod w14:val="115000"/>
+                  </w14:srgbClr>
+                </w14:gs>
+                <w14:gs w14:pos="50000">
+                  <w14:srgbClr w14:val="C00000">
+                    <w14:shade w14:val="67500"/>
+                    <w14:satMod w14:val="115000"/>
+                  </w14:srgbClr>
+                </w14:gs>
+                <w14:gs w14:pos="100000">
+                  <w14:srgbClr w14:val="C00000">
+                    <w14:shade w14:val="100000"/>
+                    <w14:satMod w14:val="115000"/>
+                  </w14:srgbClr>
+                </w14:gs>
+              </w14:gsLst>
+              <w14:lin w14:ang="13500000" w14:scaled="0"/>
+            </w14:gradFill>
+          </w14:textFill>
+        </w:rPr>
+      </w:pPr>
+      <w:r>
+        <w:rPr>
+          <w:rFonts w:ascii="Times New Roman" w:hAnsi="Times New Roman" w:cs="Times New Roman"/>
+          <w:sz w:val="18"/>
+          <w:szCs w:val="18"/>
+        </w:rPr>
+        <w:t>Сравнение кортежей работает точно так же, как и </w:t>
+      </w:r>
+      <w:hyperlink r:id="rId56" w:anchor="compare" w:history="1">
+        <w:r>
+          <w:rPr>
+            <w:rStyle w:val="a3"/>
+            <w:rFonts w:ascii="Times New Roman" w:hAnsi="Times New Roman" w:cs="Times New Roman"/>
+            <w:sz w:val="18"/>
+            <w:szCs w:val="18"/>
+          </w:rPr>
+          <w:t>сравнение списков</w:t>
+        </w:r>
+      </w:hyperlink>
+      <w:r>
+        <w:rPr>
+          <w:rFonts w:ascii="Times New Roman" w:hAnsi="Times New Roman" w:cs="Times New Roman"/>
+          <w:sz w:val="18"/>
+          <w:szCs w:val="18"/>
+        </w:rPr>
+        <w:t>.</w:t>
+      </w:r>
+    </w:p>
+    <w:p>
+      <w:pPr>
+        <w:tabs>
+          <w:tab w:val="left" w:pos="3579"/>
+        </w:tabs>
+        <w:rPr>
+          <w:rFonts w:ascii="Times New Roman" w:hAnsi="Times New Roman" w:cs="Times New Roman"/>
+          <w:sz w:val="18"/>
+          <w:szCs w:val="18"/>
+        </w:rPr>
+      </w:pPr>
+      <w:r>
+        <w:rPr>
+          <w:rFonts w:ascii="Times New Roman" w:hAnsi="Times New Roman" w:cs="Times New Roman"/>
+          <w:b/>
+          <w:bCs/>
+          <w:color w:val="C00000"/>
+          <w:sz w:val="18"/>
+          <w:szCs w:val="18"/>
+          <w14:textFill>
+            <w14:gradFill>
+              <w14:gsLst>
+                <w14:gs w14:pos="0">
+                  <w14:srgbClr w14:val="C00000">
+                    <w14:shade w14:val="30000"/>
+                    <w14:satMod w14:val="115000"/>
+                  </w14:srgbClr>
+                </w14:gs>
+                <w14:gs w14:pos="50000">
+                  <w14:srgbClr w14:val="C00000">
+                    <w14:shade w14:val="67500"/>
+                    <w14:satMod w14:val="115000"/>
+                  </w14:srgbClr>
+                </w14:gs>
+                <w14:gs w14:pos="100000">
+                  <w14:srgbClr w14:val="C00000">
+                    <w14:shade w14:val="100000"/>
+                    <w14:satMod w14:val="115000"/>
+                  </w14:srgbClr>
+                </w14:gs>
+              </w14:gsLst>
+              <w14:lin w14:ang="13500000" w14:scaled="0"/>
+            </w14:gradFill>
+          </w14:textFill>
+        </w:rPr>
+        <w:t xml:space="preserve">ВАЖНО! </w:t>
+      </w:r>
+      <w:r>
+        <w:rPr>
+          <w:rFonts w:ascii="Times New Roman" w:hAnsi="Times New Roman" w:cs="Times New Roman"/>
+          <w:sz w:val="18"/>
+          <w:szCs w:val="18"/>
+        </w:rPr>
+        <w:t>Кортеж хэшируем только тогда, когда </w:t>
+      </w:r>
+      <w:r>
+        <w:rPr>
+          <w:rFonts w:ascii="Times New Roman" w:hAnsi="Times New Roman" w:cs="Times New Roman"/>
+          <w:b/>
+          <w:bCs/>
+          <w:sz w:val="18"/>
+          <w:szCs w:val="18"/>
+        </w:rPr>
+        <w:t>все</w:t>
+      </w:r>
+      <w:r>
+        <w:rPr>
+          <w:rFonts w:ascii="Times New Roman" w:hAnsi="Times New Roman" w:cs="Times New Roman"/>
+          <w:sz w:val="18"/>
+          <w:szCs w:val="18"/>
+        </w:rPr>
+        <w:t> объекты внутри него — тоже хэшируемые</w:t>
+      </w:r>
+    </w:p>
+    <w:p>
+      <w:pPr>
+        <w:tabs>
+          <w:tab w:val="left" w:pos="3579"/>
+        </w:tabs>
+        <w:rPr>
+          <w:rFonts w:ascii="Times New Roman" w:hAnsi="Times New Roman" w:cs="Times New Roman"/>
+          <w:sz w:val="18"/>
+          <w:szCs w:val="18"/>
+        </w:rPr>
+      </w:pPr>
+      <w:r>
+        <w:rPr>
+          <w:noProof/>
+        </w:rPr>
+        <w:drawing>
+          <wp:inline distT="0" distB="0" distL="0" distR="0" wp14:anchorId="0BCDC44C" wp14:editId="75DF4E2C">
+            <wp:extent cx="4894895" cy="1672216"/>
+            <wp:effectExtent l="95250" t="114300" r="96520" b="118745"/>
+            <wp:docPr id="1001602309" name="Рисунок 1"/>
+            <wp:cNvGraphicFramePr>
+              <a:graphicFrameLocks xmlns:a="http://schemas.openxmlformats.org/drawingml/2006/main" noChangeAspect="1"/>
+            </wp:cNvGraphicFramePr>
+            <a:graphic xmlns:a="http://schemas.openxmlformats.org/drawingml/2006/main">
+              <a:graphicData uri="http://schemas.openxmlformats.org/drawingml/2006/picture">
+                <pic:pic xmlns:pic="http://schemas.openxmlformats.org/drawingml/2006/picture">
+                  <pic:nvPicPr>
+                    <pic:cNvPr id="1001602309" name=""/>
+                    <pic:cNvPicPr/>
+                  </pic:nvPicPr>
+                  <pic:blipFill>
+                    <a:blip r:embed="rId57"/>
+                    <a:stretch>
+                      <a:fillRect/>
+                    </a:stretch>
+                  </pic:blipFill>
+                  <pic:spPr>
+                    <a:xfrm>
+                      <a:off x="0" y="0"/>
+                      <a:ext cx="4931110" cy="1684588"/>
+                    </a:xfrm>
+                    <a:prstGeom prst="rect">
+                      <a:avLst/>
+                    </a:prstGeom>
+                    <a:effectLst>
+                      <a:glow rad="101600">
+                        <a:schemeClr val="tx1">
+                          <a:alpha val="60000"/>
+                        </a:schemeClr>
+                      </a:glow>
+                    </a:effectLst>
+                  </pic:spPr>
+                </pic:pic>
+              </a:graphicData>
+            </a:graphic>
+          </wp:inline>
+        </w:drawing>
+      </w:r>
+    </w:p>
+    <w:p>
+      <w:pPr>
+        <w:tabs>
+          <w:tab w:val="left" w:pos="3579"/>
+        </w:tabs>
+        <w:rPr>
+          <w:rFonts w:ascii="Times New Roman" w:hAnsi="Times New Roman" w:cs="Times New Roman"/>
+          <w:b/>
+          <w:bCs/>
+          <w:sz w:val="18"/>
+          <w:szCs w:val="18"/>
+        </w:rPr>
+      </w:pPr>
+    </w:p>
     <w:sectPr>
-      <w:headerReference w:type="default" r:id="rId53"/>
-      <w:footerReference w:type="default" r:id="rId54"/>
+      <w:headerReference w:type="default" r:id="rId58"/>
+      <w:footerReference w:type="default" r:id="rId59"/>
       <w:pgSz w:w="12240" w:h="20160" w:code="5"/>
       <w:pgMar w:top="1134" w:right="850" w:bottom="1134" w:left="1701" w:header="283" w:footer="397" w:gutter="0"/>
       <w:pgNumType w:start="1"/>
@@ -34172,6 +34743,155 @@
     </w:lvl>
   </w:abstractNum>
   <w:abstractNum w:abstractNumId="42" w15:restartNumberingAfterBreak="0">
+    <w:nsid w:val="327908BF"/>
+    <w:multiLevelType w:val="multilevel"/>
+    <w:tmpl w:val="C60C2FFA"/>
+    <w:lvl w:ilvl="0">
+      <w:start w:val="1"/>
+      <w:numFmt w:val="bullet"/>
+      <w:lvlText w:val=""/>
+      <w:lvlJc w:val="left"/>
+      <w:pPr>
+        <w:tabs>
+          <w:tab w:val="num" w:pos="720"/>
+        </w:tabs>
+        <w:ind w:left="720" w:hanging="360"/>
+      </w:pPr>
+      <w:rPr>
+        <w:rFonts w:ascii="Symbol" w:hAnsi="Symbol" w:hint="default"/>
+        <w:sz w:val="20"/>
+      </w:rPr>
+    </w:lvl>
+    <w:lvl w:ilvl="1" w:tentative="1">
+      <w:start w:val="1"/>
+      <w:numFmt w:val="bullet"/>
+      <w:lvlText w:val=""/>
+      <w:lvlJc w:val="left"/>
+      <w:pPr>
+        <w:tabs>
+          <w:tab w:val="num" w:pos="1440"/>
+        </w:tabs>
+        <w:ind w:left="1440" w:hanging="360"/>
+      </w:pPr>
+      <w:rPr>
+        <w:rFonts w:ascii="Symbol" w:hAnsi="Symbol" w:hint="default"/>
+        <w:sz w:val="20"/>
+      </w:rPr>
+    </w:lvl>
+    <w:lvl w:ilvl="2" w:tentative="1">
+      <w:start w:val="1"/>
+      <w:numFmt w:val="bullet"/>
+      <w:lvlText w:val=""/>
+      <w:lvlJc w:val="left"/>
+      <w:pPr>
+        <w:tabs>
+          <w:tab w:val="num" w:pos="2160"/>
+        </w:tabs>
+        <w:ind w:left="2160" w:hanging="360"/>
+      </w:pPr>
+      <w:rPr>
+        <w:rFonts w:ascii="Symbol" w:hAnsi="Symbol" w:hint="default"/>
+        <w:sz w:val="20"/>
+      </w:rPr>
+    </w:lvl>
+    <w:lvl w:ilvl="3" w:tentative="1">
+      <w:start w:val="1"/>
+      <w:numFmt w:val="bullet"/>
+      <w:lvlText w:val=""/>
+      <w:lvlJc w:val="left"/>
+      <w:pPr>
+        <w:tabs>
+          <w:tab w:val="num" w:pos="2880"/>
+        </w:tabs>
+        <w:ind w:left="2880" w:hanging="360"/>
+      </w:pPr>
+      <w:rPr>
+        <w:rFonts w:ascii="Symbol" w:hAnsi="Symbol" w:hint="default"/>
+        <w:sz w:val="20"/>
+      </w:rPr>
+    </w:lvl>
+    <w:lvl w:ilvl="4" w:tentative="1">
+      <w:start w:val="1"/>
+      <w:numFmt w:val="bullet"/>
+      <w:lvlText w:val=""/>
+      <w:lvlJc w:val="left"/>
+      <w:pPr>
+        <w:tabs>
+          <w:tab w:val="num" w:pos="3600"/>
+        </w:tabs>
+        <w:ind w:left="3600" w:hanging="360"/>
+      </w:pPr>
+      <w:rPr>
+        <w:rFonts w:ascii="Symbol" w:hAnsi="Symbol" w:hint="default"/>
+        <w:sz w:val="20"/>
+      </w:rPr>
+    </w:lvl>
+    <w:lvl w:ilvl="5" w:tentative="1">
+      <w:start w:val="1"/>
+      <w:numFmt w:val="bullet"/>
+      <w:lvlText w:val=""/>
+      <w:lvlJc w:val="left"/>
+      <w:pPr>
+        <w:tabs>
+          <w:tab w:val="num" w:pos="4320"/>
+        </w:tabs>
+        <w:ind w:left="4320" w:hanging="360"/>
+      </w:pPr>
+      <w:rPr>
+        <w:rFonts w:ascii="Symbol" w:hAnsi="Symbol" w:hint="default"/>
+        <w:sz w:val="20"/>
+      </w:rPr>
+    </w:lvl>
+    <w:lvl w:ilvl="6" w:tentative="1">
+      <w:start w:val="1"/>
+      <w:numFmt w:val="bullet"/>
+      <w:lvlText w:val=""/>
+      <w:lvlJc w:val="left"/>
+      <w:pPr>
+        <w:tabs>
+          <w:tab w:val="num" w:pos="5040"/>
+        </w:tabs>
+        <w:ind w:left="5040" w:hanging="360"/>
+      </w:pPr>
+      <w:rPr>
+        <w:rFonts w:ascii="Symbol" w:hAnsi="Symbol" w:hint="default"/>
+        <w:sz w:val="20"/>
+      </w:rPr>
+    </w:lvl>
+    <w:lvl w:ilvl="7" w:tentative="1">
+      <w:start w:val="1"/>
+      <w:numFmt w:val="bullet"/>
+      <w:lvlText w:val=""/>
+      <w:lvlJc w:val="left"/>
+      <w:pPr>
+        <w:tabs>
+          <w:tab w:val="num" w:pos="5760"/>
+        </w:tabs>
+        <w:ind w:left="5760" w:hanging="360"/>
+      </w:pPr>
+      <w:rPr>
+        <w:rFonts w:ascii="Symbol" w:hAnsi="Symbol" w:hint="default"/>
+        <w:sz w:val="20"/>
+      </w:rPr>
+    </w:lvl>
+    <w:lvl w:ilvl="8" w:tentative="1">
+      <w:start w:val="1"/>
+      <w:numFmt w:val="bullet"/>
+      <w:lvlText w:val=""/>
+      <w:lvlJc w:val="left"/>
+      <w:pPr>
+        <w:tabs>
+          <w:tab w:val="num" w:pos="6480"/>
+        </w:tabs>
+        <w:ind w:left="6480" w:hanging="360"/>
+      </w:pPr>
+      <w:rPr>
+        <w:rFonts w:ascii="Symbol" w:hAnsi="Symbol" w:hint="default"/>
+        <w:sz w:val="20"/>
+      </w:rPr>
+    </w:lvl>
+  </w:abstractNum>
+  <w:abstractNum w:abstractNumId="43" w15:restartNumberingAfterBreak="0">
     <w:nsid w:val="35204225"/>
     <w:multiLevelType w:val="multilevel"/>
     <w:tmpl w:val="7ED6777E"/>
@@ -34320,7 +35040,7 @@
       </w:rPr>
     </w:lvl>
   </w:abstractNum>
-  <w:abstractNum w:abstractNumId="43" w15:restartNumberingAfterBreak="0">
+  <w:abstractNum w:abstractNumId="44" w15:restartNumberingAfterBreak="0">
     <w:nsid w:val="35524ECA"/>
     <w:multiLevelType w:val="hybridMultilevel"/>
     <w:tmpl w:val="BFF4877A"/>
@@ -34433,7 +35153,7 @@
       </w:rPr>
     </w:lvl>
   </w:abstractNum>
-  <w:abstractNum w:abstractNumId="44" w15:restartNumberingAfterBreak="0">
+  <w:abstractNum w:abstractNumId="45" w15:restartNumberingAfterBreak="0">
     <w:nsid w:val="372A0EB1"/>
     <w:multiLevelType w:val="hybridMultilevel"/>
     <w:tmpl w:val="9BA8E39A"/>
@@ -34522,7 +35242,7 @@
       </w:pPr>
     </w:lvl>
   </w:abstractNum>
-  <w:abstractNum w:abstractNumId="45" w15:restartNumberingAfterBreak="0">
+  <w:abstractNum w:abstractNumId="46" w15:restartNumberingAfterBreak="0">
     <w:nsid w:val="393C6861"/>
     <w:multiLevelType w:val="multilevel"/>
     <w:tmpl w:val="47A02D72"/>
@@ -34671,7 +35391,7 @@
       </w:rPr>
     </w:lvl>
   </w:abstractNum>
-  <w:abstractNum w:abstractNumId="46" w15:restartNumberingAfterBreak="0">
+  <w:abstractNum w:abstractNumId="47" w15:restartNumberingAfterBreak="0">
     <w:nsid w:val="395F3215"/>
     <w:multiLevelType w:val="multilevel"/>
     <w:tmpl w:val="F716A9F4"/>
@@ -34788,7 +35508,7 @@
       </w:pPr>
     </w:lvl>
   </w:abstractNum>
-  <w:abstractNum w:abstractNumId="47" w15:restartNumberingAfterBreak="0">
+  <w:abstractNum w:abstractNumId="48" w15:restartNumberingAfterBreak="0">
     <w:nsid w:val="3A7E3E0C"/>
     <w:multiLevelType w:val="multilevel"/>
     <w:tmpl w:val="3DDA4034"/>
@@ -34937,7 +35657,7 @@
       </w:rPr>
     </w:lvl>
   </w:abstractNum>
-  <w:abstractNum w:abstractNumId="48" w15:restartNumberingAfterBreak="0">
+  <w:abstractNum w:abstractNumId="49" w15:restartNumberingAfterBreak="0">
     <w:nsid w:val="3A9C2647"/>
     <w:multiLevelType w:val="multilevel"/>
     <w:tmpl w:val="4208B74A"/>
@@ -35086,7 +35806,7 @@
       </w:rPr>
     </w:lvl>
   </w:abstractNum>
-  <w:abstractNum w:abstractNumId="49" w15:restartNumberingAfterBreak="0">
+  <w:abstractNum w:abstractNumId="50" w15:restartNumberingAfterBreak="0">
     <w:nsid w:val="3B5A319B"/>
     <w:multiLevelType w:val="hybridMultilevel"/>
     <w:tmpl w:val="973C4946"/>
@@ -35199,7 +35919,7 @@
       </w:rPr>
     </w:lvl>
   </w:abstractNum>
-  <w:abstractNum w:abstractNumId="50" w15:restartNumberingAfterBreak="0">
+  <w:abstractNum w:abstractNumId="51" w15:restartNumberingAfterBreak="0">
     <w:nsid w:val="3D0D5A10"/>
     <w:multiLevelType w:val="multilevel"/>
     <w:tmpl w:val="B3AC3AA6"/>
@@ -35348,7 +36068,7 @@
       </w:rPr>
     </w:lvl>
   </w:abstractNum>
-  <w:abstractNum w:abstractNumId="51" w15:restartNumberingAfterBreak="0">
+  <w:abstractNum w:abstractNumId="52" w15:restartNumberingAfterBreak="0">
     <w:nsid w:val="3E93516C"/>
     <w:multiLevelType w:val="multilevel"/>
     <w:tmpl w:val="C5284638"/>
@@ -35497,7 +36217,7 @@
       </w:rPr>
     </w:lvl>
   </w:abstractNum>
-  <w:abstractNum w:abstractNumId="52" w15:restartNumberingAfterBreak="0">
+  <w:abstractNum w:abstractNumId="53" w15:restartNumberingAfterBreak="0">
     <w:nsid w:val="3F195869"/>
     <w:multiLevelType w:val="hybridMultilevel"/>
     <w:tmpl w:val="0AEEB606"/>
@@ -35583,7 +36303,7 @@
       </w:pPr>
     </w:lvl>
   </w:abstractNum>
-  <w:abstractNum w:abstractNumId="53" w15:restartNumberingAfterBreak="0">
+  <w:abstractNum w:abstractNumId="54" w15:restartNumberingAfterBreak="0">
     <w:nsid w:val="4083216E"/>
     <w:multiLevelType w:val="multilevel"/>
     <w:tmpl w:val="546884DA"/>
@@ -35732,7 +36452,7 @@
       </w:rPr>
     </w:lvl>
   </w:abstractNum>
-  <w:abstractNum w:abstractNumId="54" w15:restartNumberingAfterBreak="0">
+  <w:abstractNum w:abstractNumId="55" w15:restartNumberingAfterBreak="0">
     <w:nsid w:val="41215DF0"/>
     <w:multiLevelType w:val="multilevel"/>
     <w:tmpl w:val="F5C8A20E"/>
@@ -35881,7 +36601,156 @@
       </w:rPr>
     </w:lvl>
   </w:abstractNum>
-  <w:abstractNum w:abstractNumId="55" w15:restartNumberingAfterBreak="0">
+  <w:abstractNum w:abstractNumId="56" w15:restartNumberingAfterBreak="0">
+    <w:nsid w:val="447D2D1B"/>
+    <w:multiLevelType w:val="multilevel"/>
+    <w:tmpl w:val="C60C2FFA"/>
+    <w:lvl w:ilvl="0">
+      <w:start w:val="1"/>
+      <w:numFmt w:val="bullet"/>
+      <w:lvlText w:val=""/>
+      <w:lvlJc w:val="left"/>
+      <w:pPr>
+        <w:tabs>
+          <w:tab w:val="num" w:pos="720"/>
+        </w:tabs>
+        <w:ind w:left="720" w:hanging="360"/>
+      </w:pPr>
+      <w:rPr>
+        <w:rFonts w:ascii="Symbol" w:hAnsi="Symbol" w:hint="default"/>
+        <w:sz w:val="20"/>
+      </w:rPr>
+    </w:lvl>
+    <w:lvl w:ilvl="1">
+      <w:start w:val="1"/>
+      <w:numFmt w:val="bullet"/>
+      <w:lvlText w:val=""/>
+      <w:lvlJc w:val="left"/>
+      <w:pPr>
+        <w:tabs>
+          <w:tab w:val="num" w:pos="1440"/>
+        </w:tabs>
+        <w:ind w:left="1440" w:hanging="360"/>
+      </w:pPr>
+      <w:rPr>
+        <w:rFonts w:ascii="Symbol" w:hAnsi="Symbol" w:hint="default"/>
+        <w:sz w:val="20"/>
+      </w:rPr>
+    </w:lvl>
+    <w:lvl w:ilvl="2">
+      <w:start w:val="1"/>
+      <w:numFmt w:val="bullet"/>
+      <w:lvlText w:val=""/>
+      <w:lvlJc w:val="left"/>
+      <w:pPr>
+        <w:tabs>
+          <w:tab w:val="num" w:pos="2160"/>
+        </w:tabs>
+        <w:ind w:left="2160" w:hanging="360"/>
+      </w:pPr>
+      <w:rPr>
+        <w:rFonts w:ascii="Symbol" w:hAnsi="Symbol" w:hint="default"/>
+        <w:sz w:val="20"/>
+      </w:rPr>
+    </w:lvl>
+    <w:lvl w:ilvl="3">
+      <w:start w:val="1"/>
+      <w:numFmt w:val="bullet"/>
+      <w:lvlText w:val=""/>
+      <w:lvlJc w:val="left"/>
+      <w:pPr>
+        <w:tabs>
+          <w:tab w:val="num" w:pos="2880"/>
+        </w:tabs>
+        <w:ind w:left="2880" w:hanging="360"/>
+      </w:pPr>
+      <w:rPr>
+        <w:rFonts w:ascii="Symbol" w:hAnsi="Symbol" w:hint="default"/>
+        <w:sz w:val="20"/>
+      </w:rPr>
+    </w:lvl>
+    <w:lvl w:ilvl="4">
+      <w:start w:val="1"/>
+      <w:numFmt w:val="bullet"/>
+      <w:lvlText w:val=""/>
+      <w:lvlJc w:val="left"/>
+      <w:pPr>
+        <w:tabs>
+          <w:tab w:val="num" w:pos="3600"/>
+        </w:tabs>
+        <w:ind w:left="3600" w:hanging="360"/>
+      </w:pPr>
+      <w:rPr>
+        <w:rFonts w:ascii="Symbol" w:hAnsi="Symbol" w:hint="default"/>
+        <w:sz w:val="20"/>
+      </w:rPr>
+    </w:lvl>
+    <w:lvl w:ilvl="5">
+      <w:start w:val="1"/>
+      <w:numFmt w:val="bullet"/>
+      <w:lvlText w:val=""/>
+      <w:lvlJc w:val="left"/>
+      <w:pPr>
+        <w:tabs>
+          <w:tab w:val="num" w:pos="4320"/>
+        </w:tabs>
+        <w:ind w:left="4320" w:hanging="360"/>
+      </w:pPr>
+      <w:rPr>
+        <w:rFonts w:ascii="Symbol" w:hAnsi="Symbol" w:hint="default"/>
+        <w:sz w:val="20"/>
+      </w:rPr>
+    </w:lvl>
+    <w:lvl w:ilvl="6">
+      <w:start w:val="1"/>
+      <w:numFmt w:val="bullet"/>
+      <w:lvlText w:val=""/>
+      <w:lvlJc w:val="left"/>
+      <w:pPr>
+        <w:tabs>
+          <w:tab w:val="num" w:pos="5040"/>
+        </w:tabs>
+        <w:ind w:left="5040" w:hanging="360"/>
+      </w:pPr>
+      <w:rPr>
+        <w:rFonts w:ascii="Symbol" w:hAnsi="Symbol" w:hint="default"/>
+        <w:sz w:val="20"/>
+      </w:rPr>
+    </w:lvl>
+    <w:lvl w:ilvl="7">
+      <w:start w:val="1"/>
+      <w:numFmt w:val="bullet"/>
+      <w:lvlText w:val=""/>
+      <w:lvlJc w:val="left"/>
+      <w:pPr>
+        <w:tabs>
+          <w:tab w:val="num" w:pos="5760"/>
+        </w:tabs>
+        <w:ind w:left="5760" w:hanging="360"/>
+      </w:pPr>
+      <w:rPr>
+        <w:rFonts w:ascii="Symbol" w:hAnsi="Symbol" w:hint="default"/>
+        <w:sz w:val="20"/>
+      </w:rPr>
+    </w:lvl>
+    <w:lvl w:ilvl="8">
+      <w:start w:val="1"/>
+      <w:numFmt w:val="bullet"/>
+      <w:lvlText w:val=""/>
+      <w:lvlJc w:val="left"/>
+      <w:pPr>
+        <w:tabs>
+          <w:tab w:val="num" w:pos="6480"/>
+        </w:tabs>
+        <w:ind w:left="6480" w:hanging="360"/>
+      </w:pPr>
+      <w:rPr>
+        <w:rFonts w:ascii="Symbol" w:hAnsi="Symbol" w:hint="default"/>
+        <w:sz w:val="20"/>
+      </w:rPr>
+    </w:lvl>
+  </w:abstractNum>
+  <w:abstractNum w:abstractNumId="57" w15:restartNumberingAfterBreak="0">
     <w:nsid w:val="454E1682"/>
     <w:multiLevelType w:val="multilevel"/>
     <w:tmpl w:val="42A63246"/>
@@ -36030,7 +36899,7 @@
       </w:rPr>
     </w:lvl>
   </w:abstractNum>
-  <w:abstractNum w:abstractNumId="56" w15:restartNumberingAfterBreak="0">
+  <w:abstractNum w:abstractNumId="58" w15:restartNumberingAfterBreak="0">
     <w:nsid w:val="45603545"/>
     <w:multiLevelType w:val="multilevel"/>
     <w:tmpl w:val="C4847E88"/>
@@ -36143,7 +37012,7 @@
       </w:pPr>
     </w:lvl>
   </w:abstractNum>
-  <w:abstractNum w:abstractNumId="57" w15:restartNumberingAfterBreak="0">
+  <w:abstractNum w:abstractNumId="59" w15:restartNumberingAfterBreak="0">
     <w:nsid w:val="46336776"/>
     <w:multiLevelType w:val="multilevel"/>
     <w:tmpl w:val="DF624274"/>
@@ -36292,7 +37161,7 @@
       </w:rPr>
     </w:lvl>
   </w:abstractNum>
-  <w:abstractNum w:abstractNumId="58" w15:restartNumberingAfterBreak="0">
+  <w:abstractNum w:abstractNumId="60" w15:restartNumberingAfterBreak="0">
     <w:nsid w:val="485E6EE6"/>
     <w:multiLevelType w:val="multilevel"/>
     <w:tmpl w:val="6860AD8A"/>
@@ -36441,7 +37310,7 @@
       </w:rPr>
     </w:lvl>
   </w:abstractNum>
-  <w:abstractNum w:abstractNumId="59" w15:restartNumberingAfterBreak="0">
+  <w:abstractNum w:abstractNumId="61" w15:restartNumberingAfterBreak="0">
     <w:nsid w:val="488A1DBB"/>
     <w:multiLevelType w:val="multilevel"/>
     <w:tmpl w:val="87DEC4A2"/>
@@ -36590,7 +37459,7 @@
       </w:rPr>
     </w:lvl>
   </w:abstractNum>
-  <w:abstractNum w:abstractNumId="60" w15:restartNumberingAfterBreak="0">
+  <w:abstractNum w:abstractNumId="62" w15:restartNumberingAfterBreak="0">
     <w:nsid w:val="522B7E37"/>
     <w:multiLevelType w:val="multilevel"/>
     <w:tmpl w:val="D52C9F50"/>
@@ -36739,7 +37608,7 @@
       </w:rPr>
     </w:lvl>
   </w:abstractNum>
-  <w:abstractNum w:abstractNumId="61" w15:restartNumberingAfterBreak="0">
+  <w:abstractNum w:abstractNumId="63" w15:restartNumberingAfterBreak="0">
     <w:nsid w:val="5491163E"/>
     <w:multiLevelType w:val="multilevel"/>
     <w:tmpl w:val="1F008D98"/>
@@ -36852,7 +37721,7 @@
       </w:pPr>
     </w:lvl>
   </w:abstractNum>
-  <w:abstractNum w:abstractNumId="62" w15:restartNumberingAfterBreak="0">
+  <w:abstractNum w:abstractNumId="64" w15:restartNumberingAfterBreak="0">
     <w:nsid w:val="55C07B86"/>
     <w:multiLevelType w:val="multilevel"/>
     <w:tmpl w:val="21B0D25A"/>
@@ -37001,7 +37870,7 @@
       </w:rPr>
     </w:lvl>
   </w:abstractNum>
-  <w:abstractNum w:abstractNumId="63" w15:restartNumberingAfterBreak="0">
+  <w:abstractNum w:abstractNumId="65" w15:restartNumberingAfterBreak="0">
     <w:nsid w:val="563874AD"/>
     <w:multiLevelType w:val="hybridMultilevel"/>
     <w:tmpl w:val="1A9067B4"/>
@@ -37114,7 +37983,7 @@
       </w:rPr>
     </w:lvl>
   </w:abstractNum>
-  <w:abstractNum w:abstractNumId="64" w15:restartNumberingAfterBreak="0">
+  <w:abstractNum w:abstractNumId="66" w15:restartNumberingAfterBreak="0">
     <w:nsid w:val="59927BC1"/>
     <w:multiLevelType w:val="hybridMultilevel"/>
     <w:tmpl w:val="05A02718"/>
@@ -37205,7 +38074,7 @@
       </w:pPr>
     </w:lvl>
   </w:abstractNum>
-  <w:abstractNum w:abstractNumId="65" w15:restartNumberingAfterBreak="0">
+  <w:abstractNum w:abstractNumId="67" w15:restartNumberingAfterBreak="0">
     <w:nsid w:val="5B1F6F2E"/>
     <w:multiLevelType w:val="multilevel"/>
     <w:tmpl w:val="0906AA84"/>
@@ -37318,7 +38187,7 @@
       </w:pPr>
     </w:lvl>
   </w:abstractNum>
-  <w:abstractNum w:abstractNumId="66" w15:restartNumberingAfterBreak="0">
+  <w:abstractNum w:abstractNumId="68" w15:restartNumberingAfterBreak="0">
     <w:nsid w:val="5CBB445D"/>
     <w:multiLevelType w:val="multilevel"/>
     <w:tmpl w:val="D5B40914"/>
@@ -37467,7 +38336,7 @@
       </w:rPr>
     </w:lvl>
   </w:abstractNum>
-  <w:abstractNum w:abstractNumId="67" w15:restartNumberingAfterBreak="0">
+  <w:abstractNum w:abstractNumId="69" w15:restartNumberingAfterBreak="0">
     <w:nsid w:val="5DC80174"/>
     <w:multiLevelType w:val="hybridMultilevel"/>
     <w:tmpl w:val="C61831EC"/>
@@ -37580,7 +38449,7 @@
       </w:rPr>
     </w:lvl>
   </w:abstractNum>
-  <w:abstractNum w:abstractNumId="68" w15:restartNumberingAfterBreak="0">
+  <w:abstractNum w:abstractNumId="70" w15:restartNumberingAfterBreak="0">
     <w:nsid w:val="5EB21B9C"/>
     <w:multiLevelType w:val="multilevel"/>
     <w:tmpl w:val="DA1C1E8C"/>
@@ -37693,7 +38562,7 @@
       </w:pPr>
     </w:lvl>
   </w:abstractNum>
-  <w:abstractNum w:abstractNumId="69" w15:restartNumberingAfterBreak="0">
+  <w:abstractNum w:abstractNumId="71" w15:restartNumberingAfterBreak="0">
     <w:nsid w:val="60346E60"/>
     <w:multiLevelType w:val="multilevel"/>
     <w:tmpl w:val="615EE75A"/>
@@ -37842,7 +38711,7 @@
       </w:rPr>
     </w:lvl>
   </w:abstractNum>
-  <w:abstractNum w:abstractNumId="70" w15:restartNumberingAfterBreak="0">
+  <w:abstractNum w:abstractNumId="72" w15:restartNumberingAfterBreak="0">
     <w:nsid w:val="60526FE8"/>
     <w:multiLevelType w:val="multilevel"/>
     <w:tmpl w:val="B8482F36"/>
@@ -37955,7 +38824,7 @@
       </w:pPr>
     </w:lvl>
   </w:abstractNum>
-  <w:abstractNum w:abstractNumId="71" w15:restartNumberingAfterBreak="0">
+  <w:abstractNum w:abstractNumId="73" w15:restartNumberingAfterBreak="0">
     <w:nsid w:val="611C3BA3"/>
     <w:multiLevelType w:val="multilevel"/>
     <w:tmpl w:val="3362B75C"/>
@@ -38104,7 +38973,7 @@
       </w:rPr>
     </w:lvl>
   </w:abstractNum>
-  <w:abstractNum w:abstractNumId="72" w15:restartNumberingAfterBreak="0">
+  <w:abstractNum w:abstractNumId="74" w15:restartNumberingAfterBreak="0">
     <w:nsid w:val="61221F3B"/>
     <w:multiLevelType w:val="multilevel"/>
     <w:tmpl w:val="9372F35E"/>
@@ -38217,7 +39086,7 @@
       </w:pPr>
     </w:lvl>
   </w:abstractNum>
-  <w:abstractNum w:abstractNumId="73" w15:restartNumberingAfterBreak="0">
+  <w:abstractNum w:abstractNumId="75" w15:restartNumberingAfterBreak="0">
     <w:nsid w:val="61635166"/>
     <w:multiLevelType w:val="multilevel"/>
     <w:tmpl w:val="194A916E"/>
@@ -38330,7 +39199,7 @@
       </w:pPr>
     </w:lvl>
   </w:abstractNum>
-  <w:abstractNum w:abstractNumId="74" w15:restartNumberingAfterBreak="0">
+  <w:abstractNum w:abstractNumId="76" w15:restartNumberingAfterBreak="0">
     <w:nsid w:val="61C6356F"/>
     <w:multiLevelType w:val="multilevel"/>
     <w:tmpl w:val="2690EA9C"/>
@@ -38479,7 +39348,7 @@
       </w:rPr>
     </w:lvl>
   </w:abstractNum>
-  <w:abstractNum w:abstractNumId="75" w15:restartNumberingAfterBreak="0">
+  <w:abstractNum w:abstractNumId="77" w15:restartNumberingAfterBreak="0">
     <w:nsid w:val="63767216"/>
     <w:multiLevelType w:val="hybridMultilevel"/>
     <w:tmpl w:val="1B1A308C"/>
@@ -38565,7 +39434,7 @@
       </w:pPr>
     </w:lvl>
   </w:abstractNum>
-  <w:abstractNum w:abstractNumId="76" w15:restartNumberingAfterBreak="0">
+  <w:abstractNum w:abstractNumId="78" w15:restartNumberingAfterBreak="0">
     <w:nsid w:val="68E86A8C"/>
     <w:multiLevelType w:val="hybridMultilevel"/>
     <w:tmpl w:val="76287898"/>
@@ -38651,7 +39520,7 @@
       </w:pPr>
     </w:lvl>
   </w:abstractNum>
-  <w:abstractNum w:abstractNumId="77" w15:restartNumberingAfterBreak="0">
+  <w:abstractNum w:abstractNumId="79" w15:restartNumberingAfterBreak="0">
     <w:nsid w:val="6AC020B7"/>
     <w:multiLevelType w:val="multilevel"/>
     <w:tmpl w:val="6D9441F4"/>
@@ -38800,7 +39669,7 @@
       </w:rPr>
     </w:lvl>
   </w:abstractNum>
-  <w:abstractNum w:abstractNumId="78" w15:restartNumberingAfterBreak="0">
+  <w:abstractNum w:abstractNumId="80" w15:restartNumberingAfterBreak="0">
     <w:nsid w:val="71011011"/>
     <w:multiLevelType w:val="multilevel"/>
     <w:tmpl w:val="289A1548"/>
@@ -38949,7 +39818,7 @@
       </w:rPr>
     </w:lvl>
   </w:abstractNum>
-  <w:abstractNum w:abstractNumId="79" w15:restartNumberingAfterBreak="0">
+  <w:abstractNum w:abstractNumId="81" w15:restartNumberingAfterBreak="0">
     <w:nsid w:val="721C6561"/>
     <w:multiLevelType w:val="hybridMultilevel"/>
     <w:tmpl w:val="ECD677D4"/>
@@ -39062,7 +39931,7 @@
       </w:rPr>
     </w:lvl>
   </w:abstractNum>
-  <w:abstractNum w:abstractNumId="80" w15:restartNumberingAfterBreak="0">
+  <w:abstractNum w:abstractNumId="82" w15:restartNumberingAfterBreak="0">
     <w:nsid w:val="73F9785C"/>
     <w:multiLevelType w:val="multilevel"/>
     <w:tmpl w:val="67522E8C"/>
@@ -39211,7 +40080,7 @@
       </w:rPr>
     </w:lvl>
   </w:abstractNum>
-  <w:abstractNum w:abstractNumId="81" w15:restartNumberingAfterBreak="0">
+  <w:abstractNum w:abstractNumId="83" w15:restartNumberingAfterBreak="0">
     <w:nsid w:val="746A4C4A"/>
     <w:multiLevelType w:val="multilevel"/>
     <w:tmpl w:val="10E0C05E"/>
@@ -39360,7 +40229,7 @@
       </w:rPr>
     </w:lvl>
   </w:abstractNum>
-  <w:abstractNum w:abstractNumId="82" w15:restartNumberingAfterBreak="0">
+  <w:abstractNum w:abstractNumId="84" w15:restartNumberingAfterBreak="0">
     <w:nsid w:val="74D607F9"/>
     <w:multiLevelType w:val="multilevel"/>
     <w:tmpl w:val="F4CCFE30"/>
@@ -39473,7 +40342,7 @@
       </w:pPr>
     </w:lvl>
   </w:abstractNum>
-  <w:abstractNum w:abstractNumId="83" w15:restartNumberingAfterBreak="0">
+  <w:abstractNum w:abstractNumId="85" w15:restartNumberingAfterBreak="0">
     <w:nsid w:val="780660F7"/>
     <w:multiLevelType w:val="multilevel"/>
     <w:tmpl w:val="59EC0DE0"/>
@@ -39622,7 +40491,7 @@
       </w:rPr>
     </w:lvl>
   </w:abstractNum>
-  <w:abstractNum w:abstractNumId="84" w15:restartNumberingAfterBreak="0">
+  <w:abstractNum w:abstractNumId="86" w15:restartNumberingAfterBreak="0">
     <w:nsid w:val="79306BAB"/>
     <w:multiLevelType w:val="multilevel"/>
     <w:tmpl w:val="778EECBA"/>
@@ -39735,7 +40604,7 @@
       </w:pPr>
     </w:lvl>
   </w:abstractNum>
-  <w:abstractNum w:abstractNumId="85" w15:restartNumberingAfterBreak="0">
+  <w:abstractNum w:abstractNumId="87" w15:restartNumberingAfterBreak="0">
     <w:nsid w:val="79451AE8"/>
     <w:multiLevelType w:val="multilevel"/>
     <w:tmpl w:val="B36A7532"/>
@@ -39884,7 +40753,7 @@
       </w:rPr>
     </w:lvl>
   </w:abstractNum>
-  <w:abstractNum w:abstractNumId="86" w15:restartNumberingAfterBreak="0">
+  <w:abstractNum w:abstractNumId="88" w15:restartNumberingAfterBreak="0">
     <w:nsid w:val="7A52735D"/>
     <w:multiLevelType w:val="multilevel"/>
     <w:tmpl w:val="FD2069AA"/>
@@ -40033,7 +40902,7 @@
       </w:rPr>
     </w:lvl>
   </w:abstractNum>
-  <w:abstractNum w:abstractNumId="87" w15:restartNumberingAfterBreak="0">
+  <w:abstractNum w:abstractNumId="89" w15:restartNumberingAfterBreak="0">
     <w:nsid w:val="7A66745B"/>
     <w:multiLevelType w:val="hybridMultilevel"/>
     <w:tmpl w:val="36049AF4"/>
@@ -40146,7 +41015,7 @@
       </w:rPr>
     </w:lvl>
   </w:abstractNum>
-  <w:abstractNum w:abstractNumId="88" w15:restartNumberingAfterBreak="0">
+  <w:abstractNum w:abstractNumId="90" w15:restartNumberingAfterBreak="0">
     <w:nsid w:val="7D0157C4"/>
     <w:multiLevelType w:val="multilevel"/>
     <w:tmpl w:val="84EEFCB6"/>
@@ -40295,7 +41164,7 @@
       </w:rPr>
     </w:lvl>
   </w:abstractNum>
-  <w:abstractNum w:abstractNumId="89" w15:restartNumberingAfterBreak="0">
+  <w:abstractNum w:abstractNumId="91" w15:restartNumberingAfterBreak="0">
     <w:nsid w:val="7F1B7409"/>
     <w:multiLevelType w:val="multilevel"/>
     <w:tmpl w:val="812289E2"/>
@@ -40444,7 +41313,7 @@
       </w:rPr>
     </w:lvl>
   </w:abstractNum>
-  <w:abstractNum w:abstractNumId="90" w15:restartNumberingAfterBreak="0">
+  <w:abstractNum w:abstractNumId="92" w15:restartNumberingAfterBreak="0">
     <w:nsid w:val="7F604749"/>
     <w:multiLevelType w:val="multilevel"/>
     <w:tmpl w:val="F6C69AC2"/>
@@ -40593,7 +41462,7 @@
       </w:rPr>
     </w:lvl>
   </w:abstractNum>
-  <w:abstractNum w:abstractNumId="91" w15:restartNumberingAfterBreak="0">
+  <w:abstractNum w:abstractNumId="93" w15:restartNumberingAfterBreak="0">
     <w:nsid w:val="7FC8764C"/>
     <w:multiLevelType w:val="hybridMultilevel"/>
     <w:tmpl w:val="15723472"/>
@@ -40707,19 +41576,19 @@
     </w:lvl>
   </w:abstractNum>
   <w:num w:numId="1" w16cid:durableId="405300518">
-    <w:abstractNumId w:val="52"/>
+    <w:abstractNumId w:val="53"/>
   </w:num>
   <w:num w:numId="2" w16cid:durableId="950435201">
-    <w:abstractNumId w:val="91"/>
+    <w:abstractNumId w:val="93"/>
   </w:num>
   <w:num w:numId="3" w16cid:durableId="263539178">
-    <w:abstractNumId w:val="64"/>
+    <w:abstractNumId w:val="66"/>
   </w:num>
   <w:num w:numId="4" w16cid:durableId="90973326">
-    <w:abstractNumId w:val="87"/>
+    <w:abstractNumId w:val="89"/>
   </w:num>
   <w:num w:numId="5" w16cid:durableId="1117528000">
-    <w:abstractNumId w:val="42"/>
+    <w:abstractNumId w:val="43"/>
   </w:num>
   <w:num w:numId="6" w16cid:durableId="1654093535">
     <w:abstractNumId w:val="35"/>
@@ -40731,19 +41600,19 @@
     <w:abstractNumId w:val="31"/>
   </w:num>
   <w:num w:numId="9" w16cid:durableId="462119961">
-    <w:abstractNumId w:val="63"/>
+    <w:abstractNumId w:val="65"/>
   </w:num>
   <w:num w:numId="10" w16cid:durableId="1954094783">
-    <w:abstractNumId w:val="43"/>
+    <w:abstractNumId w:val="44"/>
   </w:num>
   <w:num w:numId="11" w16cid:durableId="882136229">
-    <w:abstractNumId w:val="81"/>
+    <w:abstractNumId w:val="83"/>
   </w:num>
   <w:num w:numId="12" w16cid:durableId="1025794466">
     <w:abstractNumId w:val="1"/>
   </w:num>
   <w:num w:numId="13" w16cid:durableId="651449495">
-    <w:abstractNumId w:val="76"/>
+    <w:abstractNumId w:val="78"/>
   </w:num>
   <w:num w:numId="14" w16cid:durableId="1139345737">
     <w:abstractNumId w:val="13"/>
@@ -40755,52 +41624,52 @@
     <w:abstractNumId w:val="34"/>
   </w:num>
   <w:num w:numId="17" w16cid:durableId="10494282">
-    <w:abstractNumId w:val="74"/>
+    <w:abstractNumId w:val="76"/>
   </w:num>
   <w:num w:numId="18" w16cid:durableId="1177386414">
+    <w:abstractNumId w:val="92"/>
+  </w:num>
+  <w:num w:numId="19" w16cid:durableId="898983118">
     <w:abstractNumId w:val="90"/>
   </w:num>
-  <w:num w:numId="19" w16cid:durableId="898983118">
-    <w:abstractNumId w:val="88"/>
-  </w:num>
   <w:num w:numId="20" w16cid:durableId="1925187318">
-    <w:abstractNumId w:val="49"/>
+    <w:abstractNumId w:val="50"/>
   </w:num>
   <w:num w:numId="21" w16cid:durableId="749426622">
-    <w:abstractNumId w:val="75"/>
+    <w:abstractNumId w:val="77"/>
   </w:num>
   <w:num w:numId="22" w16cid:durableId="321278449">
-    <w:abstractNumId w:val="51"/>
+    <w:abstractNumId w:val="52"/>
   </w:num>
   <w:num w:numId="23" w16cid:durableId="451944075">
-    <w:abstractNumId w:val="55"/>
+    <w:abstractNumId w:val="57"/>
   </w:num>
   <w:num w:numId="24" w16cid:durableId="2126071768">
     <w:abstractNumId w:val="4"/>
   </w:num>
   <w:num w:numId="25" w16cid:durableId="1633973990">
-    <w:abstractNumId w:val="73"/>
+    <w:abstractNumId w:val="75"/>
   </w:num>
   <w:num w:numId="26" w16cid:durableId="223836851">
     <w:abstractNumId w:val="3"/>
   </w:num>
   <w:num w:numId="27" w16cid:durableId="1183125882">
-    <w:abstractNumId w:val="54"/>
+    <w:abstractNumId w:val="55"/>
   </w:num>
   <w:num w:numId="28" w16cid:durableId="104740181">
-    <w:abstractNumId w:val="82"/>
+    <w:abstractNumId w:val="84"/>
   </w:num>
   <w:num w:numId="29" w16cid:durableId="1620184776">
     <w:abstractNumId w:val="41"/>
   </w:num>
   <w:num w:numId="30" w16cid:durableId="392700641">
-    <w:abstractNumId w:val="53"/>
+    <w:abstractNumId w:val="54"/>
   </w:num>
   <w:num w:numId="31" w16cid:durableId="1158233497">
-    <w:abstractNumId w:val="56"/>
+    <w:abstractNumId w:val="58"/>
   </w:num>
   <w:num w:numId="32" w16cid:durableId="495921676">
-    <w:abstractNumId w:val="50"/>
+    <w:abstractNumId w:val="51"/>
   </w:num>
   <w:num w:numId="33" w16cid:durableId="1463116253">
     <w:abstractNumId w:val="22"/>
@@ -40818,16 +41687,16 @@
     <w:abstractNumId w:val="30"/>
   </w:num>
   <w:num w:numId="38" w16cid:durableId="1103771391">
-    <w:abstractNumId w:val="70"/>
+    <w:abstractNumId w:val="72"/>
   </w:num>
   <w:num w:numId="39" w16cid:durableId="31465451">
-    <w:abstractNumId w:val="86"/>
+    <w:abstractNumId w:val="88"/>
   </w:num>
   <w:num w:numId="40" w16cid:durableId="494348183">
     <w:abstractNumId w:val="38"/>
   </w:num>
   <w:num w:numId="41" w16cid:durableId="356124465">
-    <w:abstractNumId w:val="89"/>
+    <w:abstractNumId w:val="91"/>
   </w:num>
   <w:num w:numId="42" w16cid:durableId="438139090">
     <w:abstractNumId w:val="23"/>
@@ -40839,22 +41708,22 @@
     <w:abstractNumId w:val="6"/>
   </w:num>
   <w:num w:numId="45" w16cid:durableId="1579947908">
-    <w:abstractNumId w:val="45"/>
+    <w:abstractNumId w:val="46"/>
   </w:num>
   <w:num w:numId="46" w16cid:durableId="1801610890">
-    <w:abstractNumId w:val="57"/>
+    <w:abstractNumId w:val="59"/>
   </w:num>
   <w:num w:numId="47" w16cid:durableId="708385342">
-    <w:abstractNumId w:val="84"/>
+    <w:abstractNumId w:val="86"/>
   </w:num>
   <w:num w:numId="48" w16cid:durableId="470095744">
-    <w:abstractNumId w:val="65"/>
+    <w:abstractNumId w:val="67"/>
   </w:num>
   <w:num w:numId="49" w16cid:durableId="2053915843">
-    <w:abstractNumId w:val="72"/>
+    <w:abstractNumId w:val="74"/>
   </w:num>
   <w:num w:numId="50" w16cid:durableId="2125225438">
-    <w:abstractNumId w:val="58"/>
+    <w:abstractNumId w:val="60"/>
   </w:num>
   <w:num w:numId="51" w16cid:durableId="498736031">
     <w:abstractNumId w:val="27"/>
@@ -40866,28 +41735,28 @@
     <w:abstractNumId w:val="19"/>
   </w:num>
   <w:num w:numId="54" w16cid:durableId="84304739">
-    <w:abstractNumId w:val="59"/>
+    <w:abstractNumId w:val="61"/>
   </w:num>
   <w:num w:numId="55" w16cid:durableId="516886580">
     <w:abstractNumId w:val="28"/>
   </w:num>
   <w:num w:numId="56" w16cid:durableId="1743141462">
-    <w:abstractNumId w:val="71"/>
+    <w:abstractNumId w:val="73"/>
   </w:num>
   <w:num w:numId="57" w16cid:durableId="1445491838">
-    <w:abstractNumId w:val="77"/>
+    <w:abstractNumId w:val="79"/>
   </w:num>
   <w:num w:numId="58" w16cid:durableId="1236431717">
     <w:abstractNumId w:val="36"/>
   </w:num>
   <w:num w:numId="59" w16cid:durableId="912274187">
-    <w:abstractNumId w:val="61"/>
+    <w:abstractNumId w:val="63"/>
   </w:num>
   <w:num w:numId="60" w16cid:durableId="1278945118">
-    <w:abstractNumId w:val="46"/>
+    <w:abstractNumId w:val="47"/>
   </w:num>
   <w:num w:numId="61" w16cid:durableId="2007316713">
-    <w:abstractNumId w:val="78"/>
+    <w:abstractNumId w:val="80"/>
   </w:num>
   <w:num w:numId="62" w16cid:durableId="1414624504">
     <w:abstractNumId w:val="29"/>
@@ -40896,7 +41765,7 @@
     <w:abstractNumId w:val="24"/>
   </w:num>
   <w:num w:numId="64" w16cid:durableId="427190722">
-    <w:abstractNumId w:val="68"/>
+    <w:abstractNumId w:val="70"/>
   </w:num>
   <w:num w:numId="65" w16cid:durableId="581568260">
     <w:abstractNumId w:val="20"/>
@@ -40911,13 +41780,13 @@
     <w:abstractNumId w:val="7"/>
   </w:num>
   <w:num w:numId="69" w16cid:durableId="259334031">
-    <w:abstractNumId w:val="80"/>
+    <w:abstractNumId w:val="82"/>
   </w:num>
   <w:num w:numId="70" w16cid:durableId="951471421">
-    <w:abstractNumId w:val="62"/>
+    <w:abstractNumId w:val="64"/>
   </w:num>
   <w:num w:numId="71" w16cid:durableId="569003322">
-    <w:abstractNumId w:val="60"/>
+    <w:abstractNumId w:val="62"/>
   </w:num>
   <w:num w:numId="72" w16cid:durableId="1206675072">
     <w:abstractNumId w:val="16"/>
@@ -40929,13 +41798,13 @@
     <w:abstractNumId w:val="10"/>
   </w:num>
   <w:num w:numId="75" w16cid:durableId="215556297">
-    <w:abstractNumId w:val="69"/>
+    <w:abstractNumId w:val="71"/>
   </w:num>
   <w:num w:numId="76" w16cid:durableId="985084932">
-    <w:abstractNumId w:val="47"/>
+    <w:abstractNumId w:val="48"/>
   </w:num>
   <w:num w:numId="77" w16cid:durableId="367998525">
-    <w:abstractNumId w:val="48"/>
+    <w:abstractNumId w:val="49"/>
   </w:num>
   <w:num w:numId="78" w16cid:durableId="1007638230">
     <w:abstractNumId w:val="14"/>
@@ -40950,10 +41819,10 @@
     <w:abstractNumId w:val="37"/>
   </w:num>
   <w:num w:numId="82" w16cid:durableId="1071734932">
-    <w:abstractNumId w:val="44"/>
+    <w:abstractNumId w:val="45"/>
   </w:num>
   <w:num w:numId="83" w16cid:durableId="1595941427">
-    <w:abstractNumId w:val="66"/>
+    <w:abstractNumId w:val="68"/>
   </w:num>
   <w:num w:numId="84" w16cid:durableId="435101562">
     <w:abstractNumId w:val="15"/>
@@ -40962,10 +41831,10 @@
     <w:abstractNumId w:val="18"/>
   </w:num>
   <w:num w:numId="86" w16cid:durableId="1118259504">
-    <w:abstractNumId w:val="83"/>
+    <w:abstractNumId w:val="85"/>
   </w:num>
   <w:num w:numId="87" w16cid:durableId="1189176815">
-    <w:abstractNumId w:val="85"/>
+    <w:abstractNumId w:val="87"/>
   </w:num>
   <w:num w:numId="88" w16cid:durableId="441650416">
     <w:abstractNumId w:val="9"/>
@@ -40974,13 +41843,19 @@
     <w:abstractNumId w:val="39"/>
   </w:num>
   <w:num w:numId="90" w16cid:durableId="854348524">
-    <w:abstractNumId w:val="67"/>
+    <w:abstractNumId w:val="69"/>
   </w:num>
   <w:num w:numId="91" w16cid:durableId="545222999">
-    <w:abstractNumId w:val="79"/>
+    <w:abstractNumId w:val="81"/>
   </w:num>
   <w:num w:numId="92" w16cid:durableId="25834519">
     <w:abstractNumId w:val="5"/>
+  </w:num>
+  <w:num w:numId="93" w16cid:durableId="1519273905">
+    <w:abstractNumId w:val="56"/>
+  </w:num>
+  <w:num w:numId="94" w16cid:durableId="747507213">
+    <w:abstractNumId w:val="42"/>
   </w:num>
 </w:numbering>
 </file>

</xml_diff>